<commit_message>
docs(baic): fit the camera-ready manuscript in four pages
Keep the HE01 numbers, the level-0 device audit, and the port boundary.
Drop the two tables that repeated the prose.
</commit_message>
<xml_diff>
--- a/paper/baic/BAIC2026_Jamei.docx
+++ b/paper/baic/BAIC2026_Jamei.docx
@@ -33,7 +33,7 @@
           <w:rtl w:val="1"/>
           <w:lang w:val="en-US" w:bidi="fa-IR" w:eastAsia="fa-IR"/>
         </w:rPr>
-        <w:t xml:space="preserve">Auditing Evidence for In-Silico Models in Biomedical Engineering with the CodonTrace Genesis Credibility Ladder</w:t>
+        <w:t>Auditing In-Silico Evidence with the CodonTrace Genesis Ladder</w:t>
       </w:r>
     </w:p>
     <w:p>
@@ -73,13 +73,31 @@
       <w:r>
         <w:rPr>
           <w:rFonts w:ascii="Times New Roman" w:hAnsi="Times New Roman" w:cs="B Nazanin" w:eastAsia="B Nazanin"/>
-          <w:sz w:val="18"/>
+          <w:sz w:val="20"/>
           <w:rtl w:val="1"/>
           <w:lang w:val="en-US" w:bidi="fa-IR" w:eastAsia="fa-IR"/>
           <w:vertAlign w:val="superscript"/>
+          <w:szCs w:val="20"/>
         </w:rPr>
         <w:t xml:space="preserve">۱</w:t>
       </w:r>
+      <w:r>
+        <w:rPr>
+          <w:rFonts w:ascii="Times New Roman" w:hAnsi="Times New Roman" w:cs="B Nazanin" w:eastAsia="B Nazanin"/>
+          <w:sz w:val="20"/>
+          <w:rtl w:val="1"/>
+          <w:lang w:val="en-US" w:bidi="fa-IR" w:eastAsia="fa-IR"/>
+          <w:szCs w:val="20"/>
+        </w:rPr>
+        <w:t xml:space="preserve">پژوهشگر مستقل، مشهد، ایران، parvaz.jamie@gmail.com، ORCID: 0009-0002-9980-270X</w:t>
+      </w:r>
+    </w:p>
+    <w:p>
+      <w:pPr>
+        <w:pStyle w:val="Abstract"/>
+        <w:jc w:val="both"/>
+        <w:bidi w:val="1"/>
+      </w:pPr>
       <w:r>
         <w:rPr>
           <w:rFonts w:ascii="Times New Roman" w:hAnsi="Times New Roman" w:cs="B Nazanin" w:eastAsia="B Nazanin"/>
@@ -87,39 +105,7 @@
           <w:rtl w:val="1"/>
           <w:lang w:val="en-US" w:bidi="fa-IR" w:eastAsia="fa-IR"/>
         </w:rPr>
-        <w:t>پژوهشگر مستقل، مشهد، ایران، parvaz.jamie@gmail.com</w:t>
-      </w:r>
-    </w:p>
-    <w:p>
-      <w:pPr>
-        <w:pStyle w:val="Affiliations"/>
-        <w:jc w:val="center"/>
-        <w:bidi w:val="1"/>
-      </w:pPr>
-      <w:r>
-        <w:rPr>
-          <w:rFonts w:ascii="Times New Roman" w:hAnsi="Times New Roman" w:cs="B Nazanin" w:eastAsia="B Nazanin"/>
-          <w:sz w:val="18"/>
-          <w:rtl w:val="1"/>
-          <w:lang w:val="en-US" w:bidi="fa-IR" w:eastAsia="fa-IR"/>
-        </w:rPr>
-        <w:t>ORCID: https://orcid.org/0009-0002-9980-270X</w:t>
-      </w:r>
-    </w:p>
-    <w:p>
-      <w:pPr>
-        <w:pStyle w:val="Abstract"/>
-        <w:jc w:val="both"/>
-        <w:bidi w:val="1"/>
-      </w:pPr>
-      <w:r>
-        <w:rPr>
-          <w:rFonts w:ascii="Times New Roman" w:hAnsi="Times New Roman" w:cs="B Nazanin" w:eastAsia="B Nazanin"/>
-          <w:sz w:val="18"/>
-          <w:rtl w:val="1"/>
-          <w:lang w:val="en-US" w:bidi="fa-IR" w:eastAsia="fa-IR"/>
-        </w:rPr>
-        <w:t>چکیده - برای مدل محاسباتی در مهندسی پزشکی، عدد دقت به‌تنهایی کافی نیست و باید روشن باشد شواهد حاضر چه ادعایی را نگه می‌دارند. این مقاله بستر کودون‌تریس جنسیس را معرفی می‌کند: اجرا قطعی است، مداخله روی یال سازوکار ثبت می‌شود، و ادعا روی نردبانی شش‌سطحی حسابرسی می‌شود. خود موتور حوزه را نمی‌شناسد. برچسب حوزه از پورت DomainProfile می‌آید و پروفایل زیست‌پزشکی همان نردبان را با واژگان ASME V&amp;V 40، راهنمای FDA در سال ۲۰۲۳، IEC 62304 و IMDRF هماهنگ می‌کند. در کمپین HE01 با سی بذر جفتی، اختلاف انرژی نسبت به کنترل کانالِ روشن ۱۶٫۴۹ واحد و بازهٔ BCa برابر [۱۴٫۲۵، ۱۹٫۱۴] بود. اجرای همان حسابرس روی جدول اعلامی یک مدل تجهیز، با ریسک مدل ۳ و برچسب‌های IEC و FDA، در سطح صفر ماند.</w:t>
+        <w:t>چکیده - برای مدل محاسباتی در مهندسی پزشکی باید روشن باشد شواهد حاضر چه ادعایی را نگه می‌دارند. کودون‌تریس جنسیس اجرا را قطعی می‌کند، مداخلهٔ یال را ثبت می‌کند و ادعا را روی نردبانی شش‌سطحی حسابرسی می‌کند. موتور حوزه را نمی‌شناسد. برچسب حوزه از پورت DomainProfile می‌آید و پروفایل زیست‌پزشکی همان نردبان را با ASME V&amp;V 40، راهنمای FDA ۲۰۲۳، IEC 62304 و IMDRF هماهنگ می‌کند. در HE01 با سی بذر جفتی، اختلاف انرژی نسبت به کنترل کانالِ روشن ۱۶٫۴۹ و بازهٔ BCa برابر [۱۴٫۲۵، ۱۹٫۱۴] بود. همان حسابرس جدول اعلامی یک مدل تجهیز را، با ریسک مدل ۳، در سطح صفر گذاشت.</w:t>
       </w:r>
     </w:p>
     <w:p>
@@ -185,7 +171,7 @@
           <w:rtl w:val="1"/>
           <w:lang w:val="en-US" w:bidi="fa-IR" w:eastAsia="fa-IR"/>
         </w:rPr>
-        <w:t>در پروندهٔ مدل محاسباتی برای تجهیز پزشکی، سؤال اصلی این نیست که مدل چند درصد درست گفته است. سؤال این است که با شواهد موجود تا کجا می‌شود ادعا کرد. راهنمای نوامبر ۲۰۲۳ سازمان غذا و داروی آمریکا اعتبار مدل‌سازی و شبیه‌سازی فیزیک‌محور را به ریسک تصمیم وصل می‌کند و مدل یادگیری ماشین مستقل را بیرون از دامنه می‌گذارد [1]. استاندارد ASME V&amp;V 40 همین نکته را با پرسش مورد علاقه، زمینهٔ کاربرد و پیامد تصمیم می‌نویسد [2]. NASA-STD-7009B جدا می‌خواهد که هم خود مدل قابل اتکا باشد و هم انتقال نتیجه به شرایط تازه مجاز باشد [3]. پیوست چهارم قانون هوش مصنوعی اتحادیهٔ اروپا نیز برای سامانه‌های مشمول، مستندسازی اعتبارسنجی را لازم کرده است [4]. این سندها زبان مشترکی دارند، اما هیچ‌کدام به‌تنهایی درجهٔ ادعای بسته‌شده به یک فایل پژوهشی را معلوم نمی‌کنند.</w:t>
+        <w:t>در پروندهٔ مدل محاسباتی برای تجهیز پزشکی، سؤال این است که شواهد موجود تا کجا ادعا را نگه می‌دارند. راهنمای نوامبر ۲۰۲۳ سازمان غذا و داروی آمریکا اعتبار شبیه‌سازی فیزیک‌محور را به ریسک تصمیم وصل می‌کند و مدل یادگیری ماشین مستقل را بیرون از دامنه می‌گذارد [1]. ASME V&amp;V 40 همین نکته را با پرسش مورد علاقه، زمینهٔ کاربرد و پیامد تصمیم می‌نویسد [2]. NASA-STD-7009B هم قابلیت مدل و هم جواز انتقال نتیجه را جدا می‌خواهد [3]. پیوست چهارم قانون هوش مصنوعی اتحادیهٔ اروپا مستندسازی اعتبارسنجی را لازم کرده است [4]. هیچ‌کدام به‌تنهایی درجهٔ ادعای یک فایل پژوهشی را معلوم نمی‌کنند.</w:t>
       </w:r>
     </w:p>
     <w:p>
@@ -200,7 +186,7 @@
           <w:rtl w:val="1"/>
           <w:lang w:val="en-US" w:bidi="fa-IR" w:eastAsia="fa-IR"/>
         </w:rPr>
-        <w:t>Viceconti و همکاران آزمون in silico را بر زمینهٔ کاربرد، تحلیل ریسک، و زنجیرهٔ راستی‌آزمایی، اعتبارسنجی و کمی‌سازی عدم‌قطعیت گذاشته‌اند [5]. Pathmanathan و همکاران همان زنجیره را تا اعتبار زیرمدل‌ها در آزمون بالینی درسیلیکو برده‌اند [17]. گزارش سمپوزیوم FDA/MDIC در سال ۲۰۲۴ هم اعتبار مدل را در طول عمر تجهیز، از جمله دوقلوی دیجیتال، جمع کرده است [18]. آنچه کم است ابزاری است که بعد از انتشار هم بگوید این مصنوع کدام سطح ادعا را پشتیبانی می‌کند. در بررسی ۸۵ مقالهٔ متکی به مدل زبانی در ICSE و ASE سال ۲۰۲۴، از پنج مصنوع اجرایی هیچ‌کدام کامل بازتولید نشد [6]. تکرار اجرا هم به‌خودی‌خود سقف ادعا را نگه نمی‌دارد. این مقاله برای همان کار نوشته شده است.</w:t>
+        <w:t>Viceconti و همکاران آزمون in silico را بر زمینهٔ کاربرد، ریسک، و زنجیرهٔ راستی‌آزمایی، اعتبارسنجی و کمی‌سازی عدم‌قطعیت گذاشته‌اند [5]. Pathmanathan و همکاران همان زنجیره را تا زیرمدل‌های آزمون بالینی درسیلیکو برده‌اند [17] و سمپوزیوم FDA/MDIC در ۲۰۲۴ اعتبار مدل را در طول عمر تجهیز جمع کرده است [18]. در بررسی ۸۵ مقالهٔ ICSE و ASE ۲۰۲۴، از پنج مصنوع اجرایی هیچ‌کدام کامل بازتولید نشد [6]. کار این مقاله این است که بعد از انتشار هم سطح ادعا معلوم بماند.</w:t>
       </w:r>
     </w:p>
     <w:p>
@@ -215,7 +201,7 @@
           <w:rtl w:val="1"/>
           <w:lang w:val="en-US" w:bidi="fa-IR" w:eastAsia="fa-IR"/>
         </w:rPr>
-        <w:t>در این بستر، اجرای قطعی، مداخلهٔ یال‌به‌یال و حسابرسی ادعا کنار هم آمده‌اند و موتور برای پزشکی از نو نوشته نشده است. پروفایل زیست‌پزشکی واژگان تنظیم‌گری را روی همان نردبان می‌گذارد و برچسب را به‌جای تأیید نمی‌نشاند. خروجی ارزیابی هم دو تاست: کمپین HE01 با شواهد جفتی بالا می‌رود و جدول اعلامی مدل تجهیز، با ریسک مدل ۳، در سطح صفر می‌ماند.</w:t>
+        <w:t>اجرای قطعی، مداخلهٔ یال‌به‌یال و حسابرسی ادعا در یک بستر آمده‌اند و موتور برای پزشکی از نو نوشته نشده است. پروفایل زیست‌پزشکی برچسب تنظیم‌گری را به‌جای تأیید نمی‌نشاند. HE01 با شواهد جفتی بالا می‌رود و جدول اعلامی تجهیز، با ریسک مدل ۳، در سطح صفر می‌ماند.</w:t>
       </w:r>
     </w:p>
     <w:p>
@@ -247,7 +233,7 @@
           <w:rtl w:val="1"/>
           <w:lang w:val="en-US" w:bidi="fa-IR" w:eastAsia="fa-IR"/>
         </w:rPr>
-        <w:t>درجه‌بندی اعتبار سابقهٔ طولانی دارد، ولی اغلب در حد راهنما و گزارش نمونه مانده است. ASME VVUQ 40.1-2026 یک نمونهٔ کامل از همین چارچوب است و بدترین اندازهٔ سینی تیبیال را برای آزمون خستگی ISO 14879-1 مشخص می‌کند [7]. IEC 62304 ردهٔ ایمنی نرم‌افزار پزشکی را A، B یا C می‌گذارد و حجم کار چرخهٔ حیات را به همان رده وصل می‌کند [8]. اسناد IMDRF زبان SiMD و SaMD و نیز مشخصه‌سازی ریسک نرم‌افزار دستگاه را تثبیت کرده‌اند [9]، [10]. در این مقاله همان واژه‌ها به نردبانی وصل شده‌اند که روی بستهٔ شواهد اجرا می‌شود.</w:t>
+        <w:t>درجه‌بندی اعتبار اغلب در حد راهنما مانده است. ASME VVUQ 40.1-2026 بدترین اندازهٔ سینی تیبیال را برای آزمون خستگی ISO 14879-1 مشخص می‌کند [7]. IEC 62304 ردهٔ ایمنی نرم‌افزار را A، B یا C می‌گذارد [8]. اسناد IMDRF زبان SiMD و SaMD را تثبیت کرده‌اند [9]، [10]. اینجا همان واژه‌ها روی بستهٔ شواهد اجرا می‌شوند.</w:t>
       </w:r>
     </w:p>
     <w:p>
@@ -262,7 +248,7 @@
           <w:rtl w:val="1"/>
           <w:lang w:val="en-US" w:bidi="fa-IR" w:eastAsia="fa-IR"/>
         </w:rPr>
-        <w:t>آویدا بستر شناخته‌شده‌ای برای برنامه‌های خودتکثیرشونده است [11] و پروندهٔ .dat آن از همین در خوانده می‌شود. در ادبیات کیفیت‌تنوع، پایداری عملکرد در محیط نامطمئن [12] با بازپخش بیت‌به‌بیت یک اجرای نرم‌افزار یکی نیست. توصیف مدل بر اساس پروتکل ODD نوشته شده است [13]. در پیکربندی هم یک خط قرمز هست: رشتهٔ asme_vv40_passed پذیرفته نمی‌شود.</w:t>
+        <w:t>آویدا بستر برنامه‌های خودتکثیرشونده است [11] و پروندهٔ .dat آن از همین در خوانده می‌شود. پایداری عملکرد در محیط نامطمئن [12] با بازپخش بیت‌به‌بیت یکی نیست. توصیف مدل از پروتکل ODD است [13]. رشتهٔ asme_vv40_passed در پیکربندی پذیرفته نمی‌شود.</w:t>
       </w:r>
     </w:p>
     <w:p>
@@ -311,7 +297,7 @@
           <w:rtl w:val="1"/>
           <w:lang w:val="en-US" w:bidi="fa-IR" w:eastAsia="fa-IR"/>
         </w:rPr>
-        <w:t>هسته از ژنوم، عامل، جهان و زمان‌بند ساخته شده است. هر تنظیم تازه با پیش‌فرض خاموش وارد می‌شود تا آزمایش‌های قبلی به‌هم نریزد. مسیر از ژنوم به کنش، پیامد، کپسول دارای منشأ، پذیرش و در نهایت بقا می‌رسد. برای هر یال، شناسه و اثرانگشت قبل و بعد ذخیره می‌شود تا عبور یک پیام با عوض شدن رفتار اشتباه گرفته نشود. شمارهٔ نسخه از پروندهٔ پیکربندی پروژه خوانده می‌شود و داخل بستهٔ شواهد ثابت نوشته نمی‌شود.</w:t>
+        <w:t>هسته ژنوم، عامل، جهان و زمان‌بند است. تنظیم تازه با پیش‌فرض خاموش می‌آید. برای هر یال شناسه و اثرانگشت قبل و بعد ذخیره می‌شود. نسخه از پیکربندی پروژه خوانده می‌شود و داخل بسته ثابت نوشته نمی‌شود.</w:t>
       </w:r>
     </w:p>
     <w:p>
@@ -326,7 +312,7 @@
           <w:rtl w:val="1"/>
           <w:lang w:val="en-US" w:bidi="fa-IR" w:eastAsia="fa-IR"/>
         </w:rPr>
-        <w:t>موتور نمی‌داند آزمایش مربوط به پزشکی است یا زندگی مصنوعی یا سخت‌افزار. این برچسب از بیرون می‌آید. آداپتور بستهٔ شواهد را می‌سازد و DomainProfile فقط نام حوزه را با خود دارد. حوزهٔ تازه یعنی پروفایل تازه، نه موتور دوم. شکل ۱ همین جدایی را نشان می‌دهد. موتور تیک، اثرانگشت و بازپخش را انجام می‌دهد و حسابرس فقط بسته را می‌بیند [14].</w:t>
+        <w:t>موتور نمی‌داند آزمایش پزشکی است یا زندگی مصنوعی یا سخت‌افزار. آداپتور بسته را می‌سازد و DomainProfile فقط نام حوزه را دارد. حوزهٔ تازه پروفایل تازه است، نه موتور دوم. شکل ۱ همین جدایی را نشان می‌دهد [14].</w:t>
       </w:r>
     </w:p>
     <w:p>
@@ -338,7 +324,7 @@
       <w:r>
         <w:drawing>
           <wp:inline xmlns:a="http://schemas.openxmlformats.org/drawingml/2006/main" xmlns:pic="http://schemas.openxmlformats.org/drawingml/2006/picture">
-            <wp:extent cx="2916000" cy="1044900"/>
+            <wp:extent cx="2916000" cy="815022"/>
             <wp:docPr id="1" name="Picture 1"/>
             <wp:cNvGraphicFramePr>
               <a:graphicFrameLocks noChangeAspect="1"/>
@@ -359,7 +345,7 @@
                   <pic:spPr>
                     <a:xfrm>
                       <a:off x="0" y="0"/>
-                      <a:ext cx="2916000" cy="1044900"/>
+                      <a:ext cx="2916000" cy="815022"/>
                     </a:xfrm>
                     <a:prstGeom prst="rect"/>
                   </pic:spPr>
@@ -389,779 +375,6 @@
     </w:p>
     <w:p>
       <w:pPr>
-        <w:pStyle w:val="TableTitle"/>
-        <w:jc w:val="center"/>
-        <w:bidi w:val="1"/>
-      </w:pPr>
-      <w:r>
-        <w:rPr>
-          <w:rFonts w:ascii="Times New Roman" w:hAnsi="Times New Roman" w:cs="B Nazanin" w:eastAsia="B Nazanin"/>
-          <w:b/>
-          <w:i/>
-          <w:sz w:val="16"/>
-          <w:rtl w:val="1"/>
-          <w:lang w:val="en-US" w:bidi="fa-IR" w:eastAsia="fa-IR"/>
-        </w:rPr>
-        <w:t xml:space="preserve">جدول ۱: پورت‌ها؛ حوزه در آداپتور است نه در موتور</w:t>
-      </w:r>
-    </w:p>
-    <w:tbl>
-      <w:tblPr>
-        <w:tblStyle w:val="TableGrid"/>
-        <w:tblW w:type="auto" w:w="0"/>
-        <w:jc w:val="center"/>
-        <w:tblLook w:firstColumn="1" w:firstRow="1" w:lastColumn="0" w:lastRow="0" w:noHBand="0" w:noVBand="1" w:val="04A0"/>
-        <w:bidiVisual w:val="1"/>
-        <w:tblW w:w="5000" w:type="pct"/>
-      </w:tblPr>
-      <w:tblGrid>
-        <w:gridCol w:w="3364"/>
-        <w:gridCol w:w="3364"/>
-        <w:gridCol w:w="3364"/>
-      </w:tblGrid>
-      <w:tr>
-        <w:tc>
-          <w:tcPr>
-            <w:tcW w:type="dxa" w:w="3364"/>
-            <w:shd w:fill="1A365D" w:val="clear"/>
-            <w:tcBorders>
-              <w:top w:val="single" w:sz="4" w:color="4A4A4A"/>
-              <w:left w:val="single" w:sz="4" w:color="4A4A4A"/>
-              <w:bottom w:val="single" w:sz="4" w:color="4A4A4A"/>
-              <w:right w:val="single" w:sz="4" w:color="4A4A4A"/>
-            </w:tcBorders>
-            <w:vAlign w:val="center"/>
-          </w:tcPr>
-          <w:p>
-            <w:pPr>
-              <w:jc w:val="center"/>
-              <w:bidi w:val="1"/>
-            </w:pPr>
-            <w:r/>
-            <w:r>
-              <w:rPr>
-                <w:rFonts w:ascii="Times New Roman" w:hAnsi="Times New Roman" w:cs="B Nazanin" w:eastAsia="B Nazanin"/>
-                <w:b/>
-                <w:color w:val="FFFFFF"/>
-                <w:sz w:val="15"/>
-                <w:rtl w:val="1"/>
-                <w:lang w:val="en-US" w:bidi="fa-IR" w:eastAsia="fa-IR"/>
-              </w:rPr>
-              <w:t>پورت</w:t>
-            </w:r>
-          </w:p>
-        </w:tc>
-        <w:tc>
-          <w:tcPr>
-            <w:tcW w:type="dxa" w:w="3364"/>
-            <w:shd w:fill="1A365D" w:val="clear"/>
-            <w:tcBorders>
-              <w:top w:val="single" w:sz="4" w:color="4A4A4A"/>
-              <w:left w:val="single" w:sz="4" w:color="4A4A4A"/>
-              <w:bottom w:val="single" w:sz="4" w:color="4A4A4A"/>
-              <w:right w:val="single" w:sz="4" w:color="4A4A4A"/>
-            </w:tcBorders>
-            <w:vAlign w:val="center"/>
-          </w:tcPr>
-          <w:p>
-            <w:pPr>
-              <w:jc w:val="center"/>
-              <w:bidi w:val="1"/>
-            </w:pPr>
-            <w:r/>
-            <w:r>
-              <w:rPr>
-                <w:rFonts w:ascii="Times New Roman" w:hAnsi="Times New Roman" w:cs="B Nazanin" w:eastAsia="B Nazanin"/>
-                <w:b/>
-                <w:color w:val="FFFFFF"/>
-                <w:sz w:val="15"/>
-                <w:rtl w:val="1"/>
-                <w:lang w:val="en-US" w:bidi="fa-IR" w:eastAsia="fa-IR"/>
-              </w:rPr>
-              <w:t>ماژول</w:t>
-            </w:r>
-          </w:p>
-        </w:tc>
-        <w:tc>
-          <w:tcPr>
-            <w:tcW w:type="dxa" w:w="3364"/>
-            <w:shd w:fill="1A365D" w:val="clear"/>
-            <w:tcBorders>
-              <w:top w:val="single" w:sz="4" w:color="4A4A4A"/>
-              <w:left w:val="single" w:sz="4" w:color="4A4A4A"/>
-              <w:bottom w:val="single" w:sz="4" w:color="4A4A4A"/>
-              <w:right w:val="single" w:sz="4" w:color="4A4A4A"/>
-            </w:tcBorders>
-            <w:vAlign w:val="center"/>
-          </w:tcPr>
-          <w:p>
-            <w:pPr>
-              <w:jc w:val="center"/>
-              <w:bidi w:val="1"/>
-            </w:pPr>
-            <w:r/>
-            <w:r>
-              <w:rPr>
-                <w:rFonts w:ascii="Times New Roman" w:hAnsi="Times New Roman" w:cs="B Nazanin" w:eastAsia="B Nazanin"/>
-                <w:b/>
-                <w:color w:val="FFFFFF"/>
-                <w:sz w:val="15"/>
-                <w:rtl w:val="1"/>
-                <w:lang w:val="en-US" w:bidi="fa-IR" w:eastAsia="fa-IR"/>
-              </w:rPr>
-              <w:t>نقش موتور</w:t>
-            </w:r>
-          </w:p>
-        </w:tc>
-      </w:tr>
-      <w:tr>
-        <w:tc>
-          <w:tcPr>
-            <w:tcW w:type="dxa" w:w="3364"/>
-            <w:shd w:fill="F7F7F7" w:val="clear"/>
-            <w:tcBorders>
-              <w:top w:val="single" w:sz="4" w:color="4A4A4A"/>
-              <w:left w:val="single" w:sz="4" w:color="4A4A4A"/>
-              <w:bottom w:val="single" w:sz="4" w:color="4A4A4A"/>
-              <w:right w:val="single" w:sz="4" w:color="4A4A4A"/>
-            </w:tcBorders>
-            <w:vAlign w:val="center"/>
-          </w:tcPr>
-          <w:p>
-            <w:pPr>
-              <w:jc w:val="center"/>
-              <w:bidi w:val="1"/>
-            </w:pPr>
-            <w:r/>
-            <w:r>
-              <w:rPr>
-                <w:rFonts w:ascii="Times New Roman" w:hAnsi="Times New Roman" w:cs="B Nazanin" w:eastAsia="B Nazanin"/>
-                <w:b w:val="0"/>
-                <w:sz w:val="15"/>
-                <w:rtl w:val="1"/>
-                <w:lang w:val="en-US" w:bidi="fa-IR" w:eastAsia="fa-IR"/>
-              </w:rPr>
-              <w:t>کمپین بومی HE01</w:t>
-            </w:r>
-          </w:p>
-        </w:tc>
-        <w:tc>
-          <w:tcPr>
-            <w:tcW w:type="dxa" w:w="3364"/>
-            <w:shd w:fill="F7F7F7" w:val="clear"/>
-            <w:tcBorders>
-              <w:top w:val="single" w:sz="4" w:color="4A4A4A"/>
-              <w:left w:val="single" w:sz="4" w:color="4A4A4A"/>
-              <w:bottom w:val="single" w:sz="4" w:color="4A4A4A"/>
-              <w:right w:val="single" w:sz="4" w:color="4A4A4A"/>
-            </w:tcBorders>
-            <w:vAlign w:val="center"/>
-          </w:tcPr>
-          <w:p>
-            <w:pPr>
-              <w:jc w:val="center"/>
-              <w:bidi w:val="1"/>
-            </w:pPr>
-            <w:r/>
-            <w:r>
-              <w:rPr>
-                <w:rFonts w:ascii="Times New Roman" w:hAnsi="Times New Roman" w:cs="B Nazanin" w:eastAsia="B Nazanin"/>
-                <w:b w:val="0"/>
-                <w:sz w:val="15"/>
-                <w:rtl w:val="1"/>
-                <w:lang w:val="en-US" w:bidi="fa-IR" w:eastAsia="fa-IR"/>
-              </w:rPr>
-              <w:t>adapters.codontrace</w:t>
-            </w:r>
-          </w:p>
-        </w:tc>
-        <w:tc>
-          <w:tcPr>
-            <w:tcW w:type="dxa" w:w="3364"/>
-            <w:shd w:fill="F7F7F7" w:val="clear"/>
-            <w:tcBorders>
-              <w:top w:val="single" w:sz="4" w:color="4A4A4A"/>
-              <w:left w:val="single" w:sz="4" w:color="4A4A4A"/>
-              <w:bottom w:val="single" w:sz="4" w:color="4A4A4A"/>
-              <w:right w:val="single" w:sz="4" w:color="4A4A4A"/>
-            </w:tcBorders>
-            <w:vAlign w:val="center"/>
-          </w:tcPr>
-          <w:p>
-            <w:pPr>
-              <w:jc w:val="center"/>
-              <w:bidi w:val="1"/>
-            </w:pPr>
-            <w:r>
-              <w:t>خواندن مصنوع</w:t>
-            </w:r>
-            <w:r>
-              <w:rPr>
-                <w:rFonts w:ascii="Times New Roman" w:hAnsi="Times New Roman" w:cs="B Nazanin" w:eastAsia="B Nazanin"/>
-                <w:b w:val="0"/>
-                <w:sz w:val="15"/>
-                <w:rtl w:val="1"/>
-                <w:lang w:val="en-US" w:bidi="fa-IR" w:eastAsia="fa-IR"/>
-              </w:rPr>
-            </w:r>
-          </w:p>
-        </w:tc>
-      </w:tr>
-      <w:tr>
-        <w:tc>
-          <w:tcPr>
-            <w:tcW w:type="dxa" w:w="3364"/>
-            <w:shd w:fill="F7F7F7" w:val="clear"/>
-            <w:tcBorders>
-              <w:top w:val="single" w:sz="4" w:color="4A4A4A"/>
-              <w:left w:val="single" w:sz="4" w:color="4A4A4A"/>
-              <w:bottom w:val="single" w:sz="4" w:color="4A4A4A"/>
-              <w:right w:val="single" w:sz="4" w:color="4A4A4A"/>
-            </w:tcBorders>
-            <w:vAlign w:val="center"/>
-          </w:tcPr>
-          <w:p>
-            <w:pPr>
-              <w:jc w:val="center"/>
-              <w:bidi w:val="1"/>
-            </w:pPr>
-            <w:r/>
-            <w:r>
-              <w:rPr>
-                <w:rFonts w:ascii="Times New Roman" w:hAnsi="Times New Roman" w:cs="B Nazanin" w:eastAsia="B Nazanin"/>
-                <w:b w:val="0"/>
-                <w:sz w:val="15"/>
-                <w:rtl w:val="1"/>
-                <w:lang w:val="en-US" w:bidi="fa-IR" w:eastAsia="fa-IR"/>
-              </w:rPr>
-              <w:t>کمپین HE02 / HE03</w:t>
-            </w:r>
-          </w:p>
-        </w:tc>
-        <w:tc>
-          <w:tcPr>
-            <w:tcW w:type="dxa" w:w="3364"/>
-            <w:shd w:fill="F7F7F7" w:val="clear"/>
-            <w:tcBorders>
-              <w:top w:val="single" w:sz="4" w:color="4A4A4A"/>
-              <w:left w:val="single" w:sz="4" w:color="4A4A4A"/>
-              <w:bottom w:val="single" w:sz="4" w:color="4A4A4A"/>
-              <w:right w:val="single" w:sz="4" w:color="4A4A4A"/>
-            </w:tcBorders>
-            <w:vAlign w:val="center"/>
-          </w:tcPr>
-          <w:p>
-            <w:pPr>
-              <w:jc w:val="center"/>
-              <w:bidi w:val="1"/>
-            </w:pPr>
-            <w:r/>
-            <w:r>
-              <w:rPr>
-                <w:rFonts w:ascii="Times New Roman" w:hAnsi="Times New Roman" w:cs="B Nazanin" w:eastAsia="B Nazanin"/>
-                <w:b w:val="0"/>
-                <w:sz w:val="15"/>
-                <w:rtl w:val="1"/>
-                <w:lang w:val="en-US" w:bidi="fa-IR" w:eastAsia="fa-IR"/>
-              </w:rPr>
-              <w:t>adapters.codontrace_he02/03</w:t>
-            </w:r>
-          </w:p>
-        </w:tc>
-        <w:tc>
-          <w:tcPr>
-            <w:tcW w:type="dxa" w:w="3364"/>
-            <w:shd w:fill="F7F7F7" w:val="clear"/>
-            <w:tcBorders>
-              <w:top w:val="single" w:sz="4" w:color="4A4A4A"/>
-              <w:left w:val="single" w:sz="4" w:color="4A4A4A"/>
-              <w:bottom w:val="single" w:sz="4" w:color="4A4A4A"/>
-              <w:right w:val="single" w:sz="4" w:color="4A4A4A"/>
-            </w:tcBorders>
-            <w:vAlign w:val="center"/>
-          </w:tcPr>
-          <w:p>
-            <w:pPr>
-              <w:jc w:val="center"/>
-              <w:bidi w:val="1"/>
-            </w:pPr>
-            <w:r/>
-            <w:r>
-              <w:rPr>
-                <w:rFonts w:ascii="Times New Roman" w:hAnsi="Times New Roman" w:cs="B Nazanin" w:eastAsia="B Nazanin"/>
-                <w:b w:val="0"/>
-                <w:sz w:val="15"/>
-                <w:rtl w:val="1"/>
-                <w:lang w:val="en-US" w:bidi="fa-IR" w:eastAsia="fa-IR"/>
-              </w:rPr>
-              <w:t>خواندن مصنوع</w:t>
-            </w:r>
-          </w:p>
-        </w:tc>
-      </w:tr>
-      <w:tr>
-        <w:tc>
-          <w:tcPr>
-            <w:tcW w:type="dxa" w:w="3364"/>
-            <w:shd w:fill="F7F7F7" w:val="clear"/>
-            <w:tcBorders>
-              <w:top w:val="single" w:sz="4" w:color="4A4A4A"/>
-              <w:left w:val="single" w:sz="4" w:color="4A4A4A"/>
-              <w:bottom w:val="single" w:sz="4" w:color="4A4A4A"/>
-              <w:right w:val="single" w:sz="4" w:color="4A4A4A"/>
-            </w:tcBorders>
-            <w:vAlign w:val="center"/>
-          </w:tcPr>
-          <w:p>
-            <w:pPr>
-              <w:jc w:val="center"/>
-              <w:bidi w:val="1"/>
-            </w:pPr>
-            <w:r/>
-            <w:r>
-              <w:rPr>
-                <w:rFonts w:ascii="Times New Roman" w:hAnsi="Times New Roman" w:cs="B Nazanin" w:eastAsia="B Nazanin"/>
-                <w:b w:val="0"/>
-                <w:sz w:val="15"/>
-                <w:rtl w:val="1"/>
-                <w:lang w:val="en-US" w:bidi="fa-IR" w:eastAsia="fa-IR"/>
-              </w:rPr>
-              <w:t>Avida (.dat)</w:t>
-            </w:r>
-          </w:p>
-        </w:tc>
-        <w:tc>
-          <w:tcPr>
-            <w:tcW w:type="dxa" w:w="3364"/>
-            <w:shd w:fill="F7F7F7" w:val="clear"/>
-            <w:tcBorders>
-              <w:top w:val="single" w:sz="4" w:color="4A4A4A"/>
-              <w:left w:val="single" w:sz="4" w:color="4A4A4A"/>
-              <w:bottom w:val="single" w:sz="4" w:color="4A4A4A"/>
-              <w:right w:val="single" w:sz="4" w:color="4A4A4A"/>
-            </w:tcBorders>
-            <w:vAlign w:val="center"/>
-          </w:tcPr>
-          <w:p>
-            <w:pPr>
-              <w:jc w:val="center"/>
-              <w:bidi w:val="1"/>
-            </w:pPr>
-            <w:r/>
-            <w:r>
-              <w:rPr>
-                <w:rFonts w:ascii="Times New Roman" w:hAnsi="Times New Roman" w:cs="B Nazanin" w:eastAsia="B Nazanin"/>
-                <w:b w:val="0"/>
-                <w:sz w:val="15"/>
-                <w:rtl w:val="1"/>
-                <w:lang w:val="en-US" w:bidi="fa-IR" w:eastAsia="fa-IR"/>
-              </w:rPr>
-              <w:t>adapters.avida</w:t>
-            </w:r>
-          </w:p>
-        </w:tc>
-        <w:tc>
-          <w:tcPr>
-            <w:tcW w:type="dxa" w:w="3364"/>
-            <w:shd w:fill="F7F7F7" w:val="clear"/>
-            <w:tcBorders>
-              <w:top w:val="single" w:sz="4" w:color="4A4A4A"/>
-              <w:left w:val="single" w:sz="4" w:color="4A4A4A"/>
-              <w:bottom w:val="single" w:sz="4" w:color="4A4A4A"/>
-              <w:right w:val="single" w:sz="4" w:color="4A4A4A"/>
-            </w:tcBorders>
-            <w:vAlign w:val="center"/>
-          </w:tcPr>
-          <w:p>
-            <w:pPr>
-              <w:jc w:val="center"/>
-              <w:bidi w:val="1"/>
-            </w:pPr>
-            <w:r/>
-            <w:r>
-              <w:rPr>
-                <w:rFonts w:ascii="Times New Roman" w:hAnsi="Times New Roman" w:cs="B Nazanin" w:eastAsia="B Nazanin"/>
-                <w:b w:val="0"/>
-                <w:sz w:val="15"/>
-                <w:rtl w:val="1"/>
-                <w:lang w:val="en-US" w:bidi="fa-IR" w:eastAsia="fa-IR"/>
-              </w:rPr>
-              <w:t>اسکلت</w:t>
-            </w:r>
-          </w:p>
-        </w:tc>
-      </w:tr>
-      <w:tr>
-        <w:tc>
-          <w:tcPr>
-            <w:tcW w:type="dxa" w:w="3364"/>
-            <w:shd w:fill="F7F7F7" w:val="clear"/>
-            <w:tcBorders>
-              <w:top w:val="single" w:sz="4" w:color="4A4A4A"/>
-              <w:left w:val="single" w:sz="4" w:color="4A4A4A"/>
-              <w:bottom w:val="single" w:sz="4" w:color="4A4A4A"/>
-              <w:right w:val="single" w:sz="4" w:color="4A4A4A"/>
-            </w:tcBorders>
-            <w:vAlign w:val="center"/>
-          </w:tcPr>
-          <w:p>
-            <w:pPr>
-              <w:jc w:val="center"/>
-              <w:bidi w:val="1"/>
-            </w:pPr>
-            <w:r/>
-            <w:r>
-              <w:rPr>
-                <w:rFonts w:ascii="Times New Roman" w:hAnsi="Times New Roman" w:cs="B Nazanin" w:eastAsia="B Nazanin"/>
-                <w:b w:val="0"/>
-                <w:sz w:val="15"/>
-                <w:rtl w:val="1"/>
-                <w:lang w:val="en-US" w:bidi="fa-IR" w:eastAsia="fa-IR"/>
-              </w:rPr>
-              <w:t>MABE2 (CSV)</w:t>
-            </w:r>
-          </w:p>
-        </w:tc>
-        <w:tc>
-          <w:tcPr>
-            <w:tcW w:type="dxa" w:w="3364"/>
-            <w:shd w:fill="F7F7F7" w:val="clear"/>
-            <w:tcBorders>
-              <w:top w:val="single" w:sz="4" w:color="4A4A4A"/>
-              <w:left w:val="single" w:sz="4" w:color="4A4A4A"/>
-              <w:bottom w:val="single" w:sz="4" w:color="4A4A4A"/>
-              <w:right w:val="single" w:sz="4" w:color="4A4A4A"/>
-            </w:tcBorders>
-            <w:vAlign w:val="center"/>
-          </w:tcPr>
-          <w:p>
-            <w:pPr>
-              <w:jc w:val="center"/>
-              <w:bidi w:val="1"/>
-            </w:pPr>
-            <w:r/>
-            <w:r>
-              <w:rPr>
-                <w:rFonts w:ascii="Times New Roman" w:hAnsi="Times New Roman" w:cs="B Nazanin" w:eastAsia="B Nazanin"/>
-                <w:b w:val="0"/>
-                <w:sz w:val="15"/>
-                <w:rtl w:val="1"/>
-                <w:lang w:val="en-US" w:bidi="fa-IR" w:eastAsia="fa-IR"/>
-              </w:rPr>
-              <w:t>adapters.mabe2</w:t>
-            </w:r>
-          </w:p>
-        </w:tc>
-        <w:tc>
-          <w:tcPr>
-            <w:tcW w:type="dxa" w:w="3364"/>
-            <w:shd w:fill="F7F7F7" w:val="clear"/>
-            <w:tcBorders>
-              <w:top w:val="single" w:sz="4" w:color="4A4A4A"/>
-              <w:left w:val="single" w:sz="4" w:color="4A4A4A"/>
-              <w:bottom w:val="single" w:sz="4" w:color="4A4A4A"/>
-              <w:right w:val="single" w:sz="4" w:color="4A4A4A"/>
-            </w:tcBorders>
-            <w:vAlign w:val="center"/>
-          </w:tcPr>
-          <w:p>
-            <w:pPr>
-              <w:jc w:val="center"/>
-              <w:bidi w:val="1"/>
-            </w:pPr>
-            <w:r/>
-            <w:r>
-              <w:rPr>
-                <w:rFonts w:ascii="Times New Roman" w:hAnsi="Times New Roman" w:cs="B Nazanin" w:eastAsia="B Nazanin"/>
-                <w:b w:val="0"/>
-                <w:sz w:val="15"/>
-                <w:rtl w:val="1"/>
-                <w:lang w:val="en-US" w:bidi="fa-IR" w:eastAsia="fa-IR"/>
-              </w:rPr>
-              <w:t>اسکلت</w:t>
-            </w:r>
-          </w:p>
-        </w:tc>
-      </w:tr>
-      <w:tr>
-        <w:tc>
-          <w:tcPr>
-            <w:tcW w:type="dxa" w:w="3364"/>
-            <w:shd w:fill="F7F7F7" w:val="clear"/>
-            <w:tcBorders>
-              <w:top w:val="single" w:sz="4" w:color="4A4A4A"/>
-              <w:left w:val="single" w:sz="4" w:color="4A4A4A"/>
-              <w:bottom w:val="single" w:sz="4" w:color="4A4A4A"/>
-              <w:right w:val="single" w:sz="4" w:color="4A4A4A"/>
-            </w:tcBorders>
-            <w:vAlign w:val="center"/>
-          </w:tcPr>
-          <w:p>
-            <w:pPr>
-              <w:jc w:val="center"/>
-              <w:bidi w:val="1"/>
-            </w:pPr>
-            <w:r/>
-            <w:r>
-              <w:rPr>
-                <w:rFonts w:ascii="Times New Roman" w:hAnsi="Times New Roman" w:cs="B Nazanin" w:eastAsia="B Nazanin"/>
-                <w:b w:val="0"/>
-                <w:sz w:val="15"/>
-                <w:rtl w:val="1"/>
-                <w:lang w:val="en-US" w:bidi="fa-IR" w:eastAsia="fa-IR"/>
-              </w:rPr>
-              <w:t>جدول امتیاز اعلامی</w:t>
-            </w:r>
-          </w:p>
-        </w:tc>
-        <w:tc>
-          <w:tcPr>
-            <w:tcW w:type="dxa" w:w="3364"/>
-            <w:shd w:fill="F7F7F7" w:val="clear"/>
-            <w:tcBorders>
-              <w:top w:val="single" w:sz="4" w:color="4A4A4A"/>
-              <w:left w:val="single" w:sz="4" w:color="4A4A4A"/>
-              <w:bottom w:val="single" w:sz="4" w:color="4A4A4A"/>
-              <w:right w:val="single" w:sz="4" w:color="4A4A4A"/>
-            </w:tcBorders>
-            <w:vAlign w:val="center"/>
-          </w:tcPr>
-          <w:p>
-            <w:pPr>
-              <w:jc w:val="center"/>
-              <w:bidi w:val="1"/>
-            </w:pPr>
-            <w:r/>
-            <w:r>
-              <w:rPr>
-                <w:rFonts w:ascii="Times New Roman" w:hAnsi="Times New Roman" w:cs="B Nazanin" w:eastAsia="B Nazanin"/>
-                <w:b w:val="0"/>
-                <w:sz w:val="15"/>
-                <w:rtl w:val="1"/>
-                <w:lang w:val="en-US" w:bidi="fa-IR" w:eastAsia="fa-IR"/>
-              </w:rPr>
-              <w:t>claimgate.domain</w:t>
-            </w:r>
-          </w:p>
-        </w:tc>
-        <w:tc>
-          <w:tcPr>
-            <w:tcW w:type="dxa" w:w="3364"/>
-            <w:shd w:fill="F7F7F7" w:val="clear"/>
-            <w:tcBorders>
-              <w:top w:val="single" w:sz="4" w:color="4A4A4A"/>
-              <w:left w:val="single" w:sz="4" w:color="4A4A4A"/>
-              <w:bottom w:val="single" w:sz="4" w:color="4A4A4A"/>
-              <w:right w:val="single" w:sz="4" w:color="4A4A4A"/>
-            </w:tcBorders>
-            <w:vAlign w:val="center"/>
-          </w:tcPr>
-          <w:p>
-            <w:pPr>
-              <w:jc w:val="center"/>
-              <w:bidi w:val="1"/>
-            </w:pPr>
-            <w:r/>
-            <w:r>
-              <w:rPr>
-                <w:rFonts w:ascii="Times New Roman" w:hAnsi="Times New Roman" w:cs="B Nazanin" w:eastAsia="B Nazanin"/>
-                <w:b w:val="0"/>
-                <w:sz w:val="15"/>
-                <w:rtl w:val="1"/>
-                <w:lang w:val="en-US" w:bidi="fa-IR" w:eastAsia="fa-IR"/>
-              </w:rPr>
-              <w:t>بدون موتور</w:t>
-            </w:r>
-          </w:p>
-        </w:tc>
-      </w:tr>
-      <w:tr>
-        <w:tc>
-          <w:tcPr>
-            <w:tcW w:type="dxa" w:w="3364"/>
-            <w:shd w:fill="F7F7F7" w:val="clear"/>
-            <w:tcBorders>
-              <w:top w:val="single" w:sz="4" w:color="4A4A4A"/>
-              <w:left w:val="single" w:sz="4" w:color="4A4A4A"/>
-              <w:bottom w:val="single" w:sz="4" w:color="4A4A4A"/>
-              <w:right w:val="single" w:sz="4" w:color="4A4A4A"/>
-            </w:tcBorders>
-            <w:vAlign w:val="center"/>
-          </w:tcPr>
-          <w:p>
-            <w:pPr>
-              <w:jc w:val="center"/>
-              <w:bidi w:val="1"/>
-            </w:pPr>
-            <w:r/>
-            <w:r>
-              <w:rPr>
-                <w:rFonts w:ascii="Times New Roman" w:hAnsi="Times New Roman" w:cs="B Nazanin" w:eastAsia="B Nazanin"/>
-                <w:b w:val="0"/>
-                <w:sz w:val="15"/>
-                <w:rtl w:val="1"/>
-                <w:lang w:val="en-US" w:bidi="fa-IR" w:eastAsia="fa-IR"/>
-              </w:rPr>
-              <w:t>برچسب زیست‌پزشکی</w:t>
-            </w:r>
-          </w:p>
-        </w:tc>
-        <w:tc>
-          <w:tcPr>
-            <w:tcW w:type="dxa" w:w="3364"/>
-            <w:shd w:fill="F7F7F7" w:val="clear"/>
-            <w:tcBorders>
-              <w:top w:val="single" w:sz="4" w:color="4A4A4A"/>
-              <w:left w:val="single" w:sz="4" w:color="4A4A4A"/>
-              <w:bottom w:val="single" w:sz="4" w:color="4A4A4A"/>
-              <w:right w:val="single" w:sz="4" w:color="4A4A4A"/>
-            </w:tcBorders>
-            <w:vAlign w:val="center"/>
-          </w:tcPr>
-          <w:p>
-            <w:pPr>
-              <w:jc w:val="center"/>
-              <w:bidi w:val="1"/>
-            </w:pPr>
-            <w:r/>
-            <w:r>
-              <w:rPr>
-                <w:rFonts w:ascii="Times New Roman" w:hAnsi="Times New Roman" w:cs="B Nazanin" w:eastAsia="B Nazanin"/>
-                <w:b w:val="0"/>
-                <w:sz w:val="15"/>
-                <w:rtl w:val="1"/>
-                <w:lang w:val="en-US" w:bidi="fa-IR" w:eastAsia="fa-IR"/>
-              </w:rPr>
-              <w:t>adapters.biomedical</w:t>
-            </w:r>
-          </w:p>
-        </w:tc>
-        <w:tc>
-          <w:tcPr>
-            <w:tcW w:type="dxa" w:w="3364"/>
-            <w:shd w:fill="F7F7F7" w:val="clear"/>
-            <w:tcBorders>
-              <w:top w:val="single" w:sz="4" w:color="4A4A4A"/>
-              <w:left w:val="single" w:sz="4" w:color="4A4A4A"/>
-              <w:bottom w:val="single" w:sz="4" w:color="4A4A4A"/>
-              <w:right w:val="single" w:sz="4" w:color="4A4A4A"/>
-            </w:tcBorders>
-            <w:vAlign w:val="center"/>
-          </w:tcPr>
-          <w:p>
-            <w:pPr>
-              <w:jc w:val="center"/>
-              <w:bidi w:val="1"/>
-            </w:pPr>
-            <w:r/>
-            <w:r>
-              <w:rPr>
-                <w:rFonts w:ascii="Times New Roman" w:hAnsi="Times New Roman" w:cs="B Nazanin" w:eastAsia="B Nazanin"/>
-                <w:b w:val="0"/>
-                <w:sz w:val="15"/>
-                <w:rtl w:val="1"/>
-                <w:lang w:val="en-US" w:bidi="fa-IR" w:eastAsia="fa-IR"/>
-              </w:rPr>
-              <w:t>بدون موتور</w:t>
-            </w:r>
-          </w:p>
-        </w:tc>
-      </w:tr>
-      <w:tr>
-        <w:tc>
-          <w:tcPr>
-            <w:tcW w:type="dxa" w:w="3364"/>
-            <w:shd w:fill="F7F7F7" w:val="clear"/>
-            <w:tcBorders>
-              <w:top w:val="single" w:sz="4" w:color="4A4A4A"/>
-              <w:left w:val="single" w:sz="4" w:color="4A4A4A"/>
-              <w:bottom w:val="single" w:sz="4" w:color="4A4A4A"/>
-              <w:right w:val="single" w:sz="4" w:color="4A4A4A"/>
-            </w:tcBorders>
-            <w:vAlign w:val="center"/>
-          </w:tcPr>
-          <w:p>
-            <w:pPr>
-              <w:jc w:val="center"/>
-              <w:bidi w:val="1"/>
-            </w:pPr>
-            <w:r/>
-            <w:r>
-              <w:rPr>
-                <w:rFonts w:ascii="Times New Roman" w:hAnsi="Times New Roman" w:cs="B Nazanin" w:eastAsia="B Nazanin"/>
-                <w:b w:val="0"/>
-                <w:sz w:val="15"/>
-                <w:rtl w:val="1"/>
-                <w:lang w:val="en-US" w:bidi="fa-IR" w:eastAsia="fa-IR"/>
-              </w:rPr>
-              <w:t>پل ESP32</w:t>
-            </w:r>
-          </w:p>
-        </w:tc>
-        <w:tc>
-          <w:tcPr>
-            <w:tcW w:type="dxa" w:w="3364"/>
-            <w:shd w:fill="F7F7F7" w:val="clear"/>
-            <w:tcBorders>
-              <w:top w:val="single" w:sz="4" w:color="4A4A4A"/>
-              <w:left w:val="single" w:sz="4" w:color="4A4A4A"/>
-              <w:bottom w:val="single" w:sz="4" w:color="4A4A4A"/>
-              <w:right w:val="single" w:sz="4" w:color="4A4A4A"/>
-            </w:tcBorders>
-            <w:vAlign w:val="center"/>
-          </w:tcPr>
-          <w:p>
-            <w:pPr>
-              <w:jc w:val="center"/>
-              <w:bidi w:val="1"/>
-            </w:pPr>
-            <w:r/>
-            <w:r>
-              <w:rPr>
-                <w:rFonts w:ascii="Times New Roman" w:hAnsi="Times New Roman" w:cs="B Nazanin" w:eastAsia="B Nazanin"/>
-                <w:b w:val="0"/>
-                <w:sz w:val="15"/>
-                <w:rtl w:val="1"/>
-                <w:lang w:val="en-US" w:bidi="fa-IR" w:eastAsia="fa-IR"/>
-              </w:rPr>
-              <w:t>adapters.esp32_bridge</w:t>
-            </w:r>
-          </w:p>
-        </w:tc>
-        <w:tc>
-          <w:tcPr>
-            <w:tcW w:type="dxa" w:w="3364"/>
-            <w:shd w:fill="F7F7F7" w:val="clear"/>
-            <w:tcBorders>
-              <w:top w:val="single" w:sz="4" w:color="4A4A4A"/>
-              <w:left w:val="single" w:sz="4" w:color="4A4A4A"/>
-              <w:bottom w:val="single" w:sz="4" w:color="4A4A4A"/>
-              <w:right w:val="single" w:sz="4" w:color="4A4A4A"/>
-            </w:tcBorders>
-            <w:vAlign w:val="center"/>
-          </w:tcPr>
-          <w:p>
-            <w:pPr>
-              <w:jc w:val="center"/>
-              <w:bidi w:val="1"/>
-            </w:pPr>
-            <w:r/>
-            <w:r>
-              <w:rPr>
-                <w:rFonts w:ascii="Times New Roman" w:hAnsi="Times New Roman" w:cs="B Nazanin" w:eastAsia="B Nazanin"/>
-                <w:b w:val="0"/>
-                <w:sz w:val="15"/>
-                <w:rtl w:val="1"/>
-                <w:lang w:val="en-US" w:bidi="fa-IR" w:eastAsia="fa-IR"/>
-              </w:rPr>
-              <w:t>نمونهٔ اختیاری</w:t>
-            </w:r>
-          </w:p>
-        </w:tc>
-      </w:tr>
-    </w:tbl>
-    <w:p>
-      <w:pPr>
         <w:jc w:val="both"/>
         <w:bidi w:val="1"/>
       </w:pPr>
@@ -1172,7 +385,7 @@
           <w:rtl w:val="1"/>
           <w:lang w:val="en-US" w:bidi="fa-IR" w:eastAsia="fa-IR"/>
         </w:rPr>
-        <w:t>حسابرسی پنج مرحله دارد. آداپتور پرونده یا جدول را به یک بستهٔ واحد برمی‌گرداند. نقش بازوها به پنج نقش کلی نگاشت می‌شود: درمان، حذف سازوکار، خاموش کردن کانال، کنترل منفی، و دوز. اثرانگشت پیکربندی و، اگر موجود باشد، اثرانگشت پیش‌ثبت‌نامه بررسی می‌شود. سپس بازپخش، مقایسهٔ جفتی، بازهٔ اطمینان و تعداد بذر خوانده می‌شود. بالاترین سطحی برمی‌گردد که همهٔ شرط‌هایش برقرار باشد.</w:t>
+        <w:t>حسابرسی پنج مرحله دارد: ساخت بسته، نگاشت نقش بازو، سنجش اثرانگشت، خواندن بازپخش و بازه، و برگرداندن بالاترین سطح کامل.</w:t>
       </w:r>
     </w:p>
     <w:p>
@@ -1204,7 +417,7 @@
           <w:rtl w:val="1"/>
           <w:lang w:val="en-US" w:bidi="fa-IR" w:eastAsia="fa-IR"/>
         </w:rPr>
-        <w:t>حسابرس از موتور جداست و شش سطح دارد. سطح ۳ به مداخله یا حذف یال، کنترل منفی و بازپخش نیاز دارد. سطح ۴ بازهٔ اطمینان و حداقل شانزده بذر را هم می‌خواهد. سطح ۵ علاوه بر اینها آرشیو، محدودیت نوشته‌شده، و شواهد آماری و مداخله‌ای را با هم لازم دارد. این آستانه‌ها مربوط به همین پیاده‌سازی است. برابر بودن خروجی دو بازو، به‌خودی‌خود، نتیجه را باطل نمی‌کند. آزمون وقتی بی‌اعتبار شمرده می‌شود که خود مداخله هم اعمال نشده باشد.</w:t>
+        <w:t>حسابرس شش سطح دارد و از موتور جداست. سطح ۳ مداخله یا حذف یال، کنترل منفی و بازپخش می‌خواهد. سطح ۴ بازه و حداقل شانزده بذر را هم می‌خواهد. سطح ۵ آرشیو و محدودیت نوشته‌شده را می‌افزاید. این آستانه‌ها مال همین پیاده‌سازی است. آزمون وقتی بی‌اعتبار است که خود مداخله اعمال نشده باشد.</w:t>
       </w:r>
     </w:p>
     <w:p>
@@ -1236,7 +449,7 @@
           <w:rtl w:val="1"/>
           <w:lang w:val="en-US" w:bidi="fa-IR" w:eastAsia="fa-IR"/>
         </w:rPr>
-        <w:t>آداپتور HE01 فایل JSON را می‌خواند و نقش محلی را به نقش کلی برمی‌گرداند. بایت خود پرونده عوض نمی‌شود. پروندهٔ Avida و خروجی CSV مربوط به MABE2 هم از همین مسیر وارد می‌شوند. آداپتور زیست‌پزشکی جدول امتیاز را با زمینهٔ کاربرد و ریسک مدل پر می‌کند. اتصال سخت‌افزاری **اختیاری** است. برای فایل متنی، اثرانگشت بعد از یکسان‌سازی انتهای سطر ساخته می‌شود و هش فایل دودویی با Path.read_bytes() حساب می‌شود. آزمون پیش‌فرض، جایگشت علامت جفتی با تصحیح Holm و بازهٔ BCa است. بوت‌استرپ studentized و شمارش دقیق علامت برای n≤۴۰ اختیاری‌اند تا اعداد کمپین منتشرشده جابه‌جا نشود.</w:t>
+        <w:t>آداپتور HE01 فایل JSON را می‌خواند و بایت پرونده را عوض نمی‌کند. Avida و CSV مربوط به MABE2 از همین مسیر می‌آیند. آداپتور زیست‌پزشکی جدول امتیاز را با زمینه و ریسک مدل پر می‌کند. اتصال سخت‌افزاری اختیاری است. هش متن بعد از یکسان‌سازی سطر ساخته می‌شود و هش دودویی با Path.read_bytes() است. آزمون پیش‌فرض جایگشت علامت با Holm و بازهٔ BCa است. بوت‌استرپ studentized برای n≤۴۰ اختیاری است.</w:t>
       </w:r>
     </w:p>
     <w:p>
@@ -1268,7 +481,7 @@
           <w:rtl w:val="1"/>
           <w:lang w:val="en-US" w:bidi="fa-IR" w:eastAsia="fa-IR"/>
         </w:rPr>
-        <w:t>حوزهٔ پزشکی از DomainProfile می‌آید. نام‌های موجود alife، biomedical و hardware هستند [15]. simd_declared و samd_declared عبارت IMDRF را روی بسته یادداشت می‌کنند و خود محصول را رده‌بندی نمی‌کنند. اگر مدل فیزیک‌محور اعلام نشده باشد، نسبت به راهنمای سال ۲۰۲۳ خارج از دامنه می‌ماند، حتی وقتی خانه‌های شواهد پر شده باشند. رشته‌هایی مانند asme_vv40_passed، fda_cleared، clinical_validated و iec_62304_certified در پیکربندی قبول نمی‌شوند. از یک جدول اعلامی مهر تأیید بیرون نمی‌آید.</w:t>
+        <w:t>حوزه از DomainProfile می‌آید: alife، biomedical و hardware [15]. simd_declared عبارت IMDRF را یادداشت می‌کند و محصول را رده‌بندی نمی‌کند. اگر مدل فیزیک‌محور اعلام نشده باشد، نسبت به راهنمای ۲۰۲۳ خارج از دامنه است. asme_vv40_passed، fda_cleared، clinical_validated و iec_62304_certified در پیکربندی قبول نمی‌شوند.</w:t>
       </w:r>
     </w:p>
     <w:p>
@@ -2158,7 +1371,7 @@
           <w:rtl w:val="1"/>
           <w:lang w:val="en-US" w:bidi="fa-IR" w:eastAsia="fa-IR"/>
         </w:rPr>
-        <w:t>جدول ۳ همان بسته‌ای است که در بخش ارزیابی به حسابرس داده شده است. امتیازها برای نشان دادن قالب جدول‌اند و سطحی که برمی‌گردد صفر است.</w:t>
+        <w:t>جدول ۳ همان بستهٔ بخش ارزیابی است و سطح خروجی آن صفر است.</w:t>
       </w:r>
     </w:p>
     <w:p>
@@ -2983,7 +2196,7 @@
           <w:rtl w:val="1"/>
           <w:lang w:val="en-US" w:bidi="fa-IR" w:eastAsia="fa-IR"/>
         </w:rPr>
-        <w:t>HE01 طرحی از پیش ثبت‌شده برای سنجش سوگیری منشأ کپسول است. سی بذر جفتی، بازوی درمان را با چهار کنترل مقایسه می‌کند: محتوای تهی، کانال بسته، کانال روشن بدون سوگیری، و محتوای برخورده. پاسخ به شدت دوز جدا نگه داشته می‌شود تا با اثر اصلی مخلوط نشود. سنجهٔ اصلی میانگین انرژی پایانی گیرنده است و این انرژی داخل شبیه‌سازی تعریف شده، نه یک کمیت زیستی. در مصنوع منتشرشده سقف ادعا intervention_supported است. آزمون پیش‌فرض، جایگشت علامت جفتی، تصحیح Holm و بازهٔ BCa است.</w:t>
+        <w:t>HE01 طرح از پیش ثبت‌شدهٔ سوگیری منشأ است. سی بذر جفتی، درمان را با کنترل‌های محتوای تهی، کانال بسته، کانال روشن بدون سوگیری، و محتوای برخورده مقایسه می‌کند. سنجه میانگین انرژی پایانی گیرنده در شبیه‌سازی است و سقف مصنوع intervention_supported است.</w:t>
       </w:r>
     </w:p>
     <w:p>
@@ -2998,7 +2211,7 @@
           <w:rtl w:val="1"/>
           <w:lang w:val="en-US" w:bidi="fa-IR" w:eastAsia="fa-IR"/>
         </w:rPr>
-        <w:t>فایل results_v7.json با پیشوند اثرانگشت 28f812c5 سه مقایسهٔ جفتی دارد [16]. نسبت به کانال روشن و بدون سوگیری منشأ، اختلاف ۱۶٫۴۹ واحد است. p خام جایگشت ۴٫۹۹۹۷۵×۱۰⁻⁵ و p پس از Holm برابر ۱٫۵۰×۱۰⁻⁴ است. بازهٔ BCa نیز [۱۴٫۲۵، ۱۹٫۱۴] است. نسبت به کانال بسته و محتوای تهی، اختلاف ۳۰٫۶۷ واحد و بازهٔ [۲۶٫۰۳، ۳۵٫۳۲] است. در مقایسهٔ اول کانال سر جای خود می‌ماند و فقط سوگیری برداشته می‌شود. در مقایسهٔ دوم هم محتوا عوض می‌شود و هم سوگیری. اگر همان سی اختلاف را با بوت‌استرپ studentized، که اختیاری است، دوباره حساب کنیم، بازه حدود ۱۴٫۰۵ تا ۱۹٫۳۰ می‌شود. این تفاوت از روش می‌آید و فایل v7 دست نخورده است.</w:t>
+        <w:t>فایل results_v7.json با پیشوند 28f812c5 سه مقایسه دارد [16]. نسبت به کانال روشن بدون سوگیری، اختلاف ۱۶٫۴۹، p خام ۴٫۹۹۹۷۵×۱۰⁻⁵، p هولم ۱٫۵۰×۱۰⁻⁴ و بازهٔ BCa برابر [۱۴٫۲۵، ۱۹٫۱۴] است. نسبت به کانال بسته و محتوای تهی، اختلاف ۳۰٫۶۷ و بازهٔ [۲۶٫۰۳، ۳۵٫۳۲] است. بوت‌استرپ studentized اختیاری همان سی اختلاف را حدود ۱۴٫۰۵ تا ۱۹٫۳۰ می‌گذارد و فایل v7 دست نمی‌خورد. شکل ۲ همین دو بازه را نشان می‌دهد.</w:t>
       </w:r>
     </w:p>
     <w:p>
@@ -3010,7 +2223,7 @@
       <w:r>
         <w:drawing>
           <wp:inline xmlns:a="http://schemas.openxmlformats.org/drawingml/2006/main" xmlns:pic="http://schemas.openxmlformats.org/drawingml/2006/picture">
-            <wp:extent cx="2916000" cy="874800"/>
+            <wp:extent cx="2916000" cy="682344"/>
             <wp:docPr id="2" name="Picture 2"/>
             <wp:cNvGraphicFramePr>
               <a:graphicFrameLocks noChangeAspect="1"/>
@@ -3031,7 +2244,7 @@
                   <pic:spPr>
                     <a:xfrm>
                       <a:off x="0" y="0"/>
-                      <a:ext cx="2916000" cy="874800"/>
+                      <a:ext cx="2916000" cy="682344"/>
                     </a:xfrm>
                     <a:prstGeom prst="rect"/>
                   </pic:spPr>
@@ -3061,512 +2274,6 @@
     </w:p>
     <w:p>
       <w:pPr>
-        <w:pStyle w:val="TableTitle"/>
-        <w:jc w:val="center"/>
-        <w:bidi w:val="1"/>
-      </w:pPr>
-      <w:r>
-        <w:rPr>
-          <w:rFonts w:ascii="Times New Roman" w:hAnsi="Times New Roman" w:cs="B Nazanin" w:eastAsia="B Nazanin"/>
-          <w:b/>
-          <w:i/>
-          <w:sz w:val="16"/>
-          <w:rtl w:val="1"/>
-          <w:lang w:val="en-US" w:bidi="fa-IR" w:eastAsia="fa-IR"/>
-        </w:rPr>
-        <w:t xml:space="preserve">جدول ۴: خلاصهٔ کمپین تأییدی HE01 از مصنوع v7 (بازتقطیع نشده)</w:t>
-      </w:r>
-    </w:p>
-    <w:tbl>
-      <w:tblPr>
-        <w:tblStyle w:val="TableGrid"/>
-        <w:tblW w:type="auto" w:w="0"/>
-        <w:jc w:val="center"/>
-        <w:tblLook w:firstColumn="1" w:firstRow="1" w:lastColumn="0" w:lastRow="0" w:noHBand="0" w:noVBand="1" w:val="04A0"/>
-        <w:bidiVisual w:val="1"/>
-        <w:tblW w:w="5000" w:type="pct"/>
-      </w:tblPr>
-      <w:tblGrid>
-        <w:gridCol w:w="5046"/>
-        <w:gridCol w:w="5046"/>
-      </w:tblGrid>
-      <w:tr>
-        <w:tc>
-          <w:tcPr>
-            <w:tcW w:type="dxa" w:w="5046"/>
-            <w:shd w:fill="1A365D" w:val="clear"/>
-            <w:tcBorders>
-              <w:top w:val="single" w:sz="4" w:color="4A4A4A"/>
-              <w:left w:val="single" w:sz="4" w:color="4A4A4A"/>
-              <w:bottom w:val="single" w:sz="4" w:color="4A4A4A"/>
-              <w:right w:val="single" w:sz="4" w:color="4A4A4A"/>
-            </w:tcBorders>
-            <w:vAlign w:val="center"/>
-          </w:tcPr>
-          <w:p>
-            <w:pPr>
-              <w:jc w:val="center"/>
-              <w:bidi w:val="1"/>
-            </w:pPr>
-            <w:r/>
-            <w:r>
-              <w:rPr>
-                <w:rFonts w:ascii="Times New Roman" w:hAnsi="Times New Roman" w:cs="B Nazanin" w:eastAsia="B Nazanin"/>
-                <w:b/>
-                <w:color w:val="FFFFFF"/>
-                <w:sz w:val="16"/>
-                <w:rtl w:val="1"/>
-                <w:lang w:val="en-US" w:bidi="fa-IR" w:eastAsia="fa-IR"/>
-              </w:rPr>
-              <w:t>سنجه</w:t>
-            </w:r>
-          </w:p>
-        </w:tc>
-        <w:tc>
-          <w:tcPr>
-            <w:tcW w:type="dxa" w:w="5046"/>
-            <w:shd w:fill="1A365D" w:val="clear"/>
-            <w:tcBorders>
-              <w:top w:val="single" w:sz="4" w:color="4A4A4A"/>
-              <w:left w:val="single" w:sz="4" w:color="4A4A4A"/>
-              <w:bottom w:val="single" w:sz="4" w:color="4A4A4A"/>
-              <w:right w:val="single" w:sz="4" w:color="4A4A4A"/>
-            </w:tcBorders>
-            <w:vAlign w:val="center"/>
-          </w:tcPr>
-          <w:p>
-            <w:pPr>
-              <w:jc w:val="center"/>
-              <w:bidi w:val="1"/>
-            </w:pPr>
-            <w:r/>
-            <w:r>
-              <w:rPr>
-                <w:rFonts w:ascii="Times New Roman" w:hAnsi="Times New Roman" w:cs="B Nazanin" w:eastAsia="B Nazanin"/>
-                <w:b/>
-                <w:color w:val="FFFFFF"/>
-                <w:sz w:val="16"/>
-                <w:rtl w:val="1"/>
-                <w:lang w:val="en-US" w:bidi="fa-IR" w:eastAsia="fa-IR"/>
-              </w:rPr>
-              <w:t>مقدار منتشرشده</w:t>
-            </w:r>
-          </w:p>
-        </w:tc>
-      </w:tr>
-      <w:tr>
-        <w:tc>
-          <w:tcPr>
-            <w:tcW w:type="dxa" w:w="5046"/>
-            <w:shd w:fill="F7F7F7" w:val="clear"/>
-            <w:tcBorders>
-              <w:top w:val="single" w:sz="4" w:color="4A4A4A"/>
-              <w:left w:val="single" w:sz="4" w:color="4A4A4A"/>
-              <w:bottom w:val="single" w:sz="4" w:color="4A4A4A"/>
-              <w:right w:val="single" w:sz="4" w:color="4A4A4A"/>
-            </w:tcBorders>
-            <w:vAlign w:val="center"/>
-          </w:tcPr>
-          <w:p>
-            <w:pPr>
-              <w:jc w:val="center"/>
-              <w:bidi w:val="1"/>
-            </w:pPr>
-            <w:r/>
-            <w:r>
-              <w:rPr>
-                <w:rFonts w:ascii="Times New Roman" w:hAnsi="Times New Roman" w:cs="B Nazanin" w:eastAsia="B Nazanin"/>
-                <w:b w:val="0"/>
-                <w:sz w:val="16"/>
-                <w:rtl w:val="1"/>
-                <w:lang w:val="en-US" w:bidi="fa-IR" w:eastAsia="fa-IR"/>
-              </w:rPr>
-              <w:t>تعداد بذر جفتی</w:t>
-            </w:r>
-          </w:p>
-        </w:tc>
-        <w:tc>
-          <w:tcPr>
-            <w:tcW w:type="dxa" w:w="5046"/>
-            <w:shd w:fill="F7F7F7" w:val="clear"/>
-            <w:tcBorders>
-              <w:top w:val="single" w:sz="4" w:color="4A4A4A"/>
-              <w:left w:val="single" w:sz="4" w:color="4A4A4A"/>
-              <w:bottom w:val="single" w:sz="4" w:color="4A4A4A"/>
-              <w:right w:val="single" w:sz="4" w:color="4A4A4A"/>
-            </w:tcBorders>
-            <w:vAlign w:val="center"/>
-          </w:tcPr>
-          <w:p>
-            <w:pPr>
-              <w:jc w:val="center"/>
-              <w:bidi w:val="1"/>
-            </w:pPr>
-            <w:r/>
-            <w:r>
-              <w:rPr>
-                <w:rFonts w:ascii="Times New Roman" w:hAnsi="Times New Roman" w:cs="B Nazanin" w:eastAsia="B Nazanin"/>
-                <w:b w:val="0"/>
-                <w:sz w:val="16"/>
-                <w:rtl w:val="1"/>
-                <w:lang w:val="en-US" w:bidi="fa-IR" w:eastAsia="fa-IR"/>
-              </w:rPr>
-              <w:t>۳۰</w:t>
-            </w:r>
-          </w:p>
-        </w:tc>
-      </w:tr>
-      <w:tr>
-        <w:tc>
-          <w:tcPr>
-            <w:tcW w:type="dxa" w:w="5046"/>
-            <w:shd w:fill="F7F7F7" w:val="clear"/>
-            <w:tcBorders>
-              <w:top w:val="single" w:sz="4" w:color="4A4A4A"/>
-              <w:left w:val="single" w:sz="4" w:color="4A4A4A"/>
-              <w:bottom w:val="single" w:sz="4" w:color="4A4A4A"/>
-              <w:right w:val="single" w:sz="4" w:color="4A4A4A"/>
-            </w:tcBorders>
-            <w:vAlign w:val="center"/>
-          </w:tcPr>
-          <w:p>
-            <w:pPr>
-              <w:jc w:val="center"/>
-              <w:bidi w:val="1"/>
-            </w:pPr>
-            <w:r/>
-            <w:r>
-              <w:rPr>
-                <w:rFonts w:ascii="Times New Roman" w:hAnsi="Times New Roman" w:cs="B Nazanin" w:eastAsia="B Nazanin"/>
-                <w:b w:val="0"/>
-                <w:sz w:val="16"/>
-                <w:rtl w:val="1"/>
-                <w:lang w:val="en-US" w:bidi="fa-IR" w:eastAsia="fa-IR"/>
-              </w:rPr>
-              <w:t>سنجهٔ اولیه</w:t>
-            </w:r>
-          </w:p>
-        </w:tc>
-        <w:tc>
-          <w:tcPr>
-            <w:tcW w:type="dxa" w:w="5046"/>
-            <w:shd w:fill="F7F7F7" w:val="clear"/>
-            <w:tcBorders>
-              <w:top w:val="single" w:sz="4" w:color="4A4A4A"/>
-              <w:left w:val="single" w:sz="4" w:color="4A4A4A"/>
-              <w:bottom w:val="single" w:sz="4" w:color="4A4A4A"/>
-              <w:right w:val="single" w:sz="4" w:color="4A4A4A"/>
-            </w:tcBorders>
-            <w:vAlign w:val="center"/>
-          </w:tcPr>
-          <w:p>
-            <w:pPr>
-              <w:jc w:val="center"/>
-              <w:bidi w:val="1"/>
-            </w:pPr>
-            <w:r/>
-            <w:r>
-              <w:rPr>
-                <w:rFonts w:ascii="Times New Roman" w:hAnsi="Times New Roman" w:cs="B Nazanin" w:eastAsia="B Nazanin"/>
-                <w:b w:val="0"/>
-                <w:sz w:val="16"/>
-                <w:rtl w:val="1"/>
-                <w:lang w:val="en-US" w:bidi="fa-IR" w:eastAsia="fa-IR"/>
-              </w:rPr>
-              <w:t>میانگین ATP پایانی گیرنده</w:t>
-            </w:r>
-          </w:p>
-        </w:tc>
-      </w:tr>
-      <w:tr>
-        <w:tc>
-          <w:tcPr>
-            <w:tcW w:type="dxa" w:w="5046"/>
-            <w:shd w:fill="F7F7F7" w:val="clear"/>
-            <w:tcBorders>
-              <w:top w:val="single" w:sz="4" w:color="4A4A4A"/>
-              <w:left w:val="single" w:sz="4" w:color="4A4A4A"/>
-              <w:bottom w:val="single" w:sz="4" w:color="4A4A4A"/>
-              <w:right w:val="single" w:sz="4" w:color="4A4A4A"/>
-            </w:tcBorders>
-            <w:vAlign w:val="center"/>
-          </w:tcPr>
-          <w:p>
-            <w:pPr>
-              <w:jc w:val="center"/>
-              <w:bidi w:val="1"/>
-            </w:pPr>
-            <w:r/>
-            <w:r>
-              <w:rPr>
-                <w:rFonts w:ascii="Times New Roman" w:hAnsi="Times New Roman" w:cs="B Nazanin" w:eastAsia="B Nazanin"/>
-                <w:b w:val="0"/>
-                <w:sz w:val="16"/>
-                <w:rtl w:val="1"/>
-                <w:lang w:val="en-US" w:bidi="fa-IR" w:eastAsia="fa-IR"/>
-              </w:rPr>
-              <w:t>source_bias_on در برابر source_bias_off</w:t>
-            </w:r>
-          </w:p>
-        </w:tc>
-        <w:tc>
-          <w:tcPr>
-            <w:tcW w:type="dxa" w:w="5046"/>
-            <w:shd w:fill="F7F7F7" w:val="clear"/>
-            <w:tcBorders>
-              <w:top w:val="single" w:sz="4" w:color="4A4A4A"/>
-              <w:left w:val="single" w:sz="4" w:color="4A4A4A"/>
-              <w:bottom w:val="single" w:sz="4" w:color="4A4A4A"/>
-              <w:right w:val="single" w:sz="4" w:color="4A4A4A"/>
-            </w:tcBorders>
-            <w:vAlign w:val="center"/>
-          </w:tcPr>
-          <w:p>
-            <w:pPr>
-              <w:jc w:val="center"/>
-              <w:bidi w:val="1"/>
-            </w:pPr>
-            <w:r>
-              <w:t xml:space="preserve">Δ = ۱۶٫۴۹ ؛ BCa [۱۴٫۲۵، ۱۹٫۱۴]</w:t>
-            </w:r>
-          </w:p>
-        </w:tc>
-      </w:tr>
-      <w:tr>
-        <w:tc>
-          <w:tcPr>
-            <w:tcW w:type="dxa" w:w="5046"/>
-            <w:shd w:fill="F7F7F7" w:val="clear"/>
-            <w:tcBorders>
-              <w:top w:val="single" w:sz="4" w:color="4A4A4A"/>
-              <w:left w:val="single" w:sz="4" w:color="4A4A4A"/>
-              <w:bottom w:val="single" w:sz="4" w:color="4A4A4A"/>
-              <w:right w:val="single" w:sz="4" w:color="4A4A4A"/>
-            </w:tcBorders>
-            <w:vAlign w:val="center"/>
-          </w:tcPr>
-          <w:p>
-            <w:pPr>
-              <w:jc w:val="center"/>
-              <w:bidi w:val="1"/>
-            </w:pPr>
-            <w:r>
-              <w:t xml:space="preserve">source_bias_on در برابر capsules_off / content_null</w:t>
-            </w:r>
-          </w:p>
-        </w:tc>
-        <w:tc>
-          <w:tcPr>
-            <w:tcW w:type="dxa" w:w="5046"/>
-            <w:shd w:fill="F7F7F7" w:val="clear"/>
-            <w:tcBorders>
-              <w:top w:val="single" w:sz="4" w:color="4A4A4A"/>
-              <w:left w:val="single" w:sz="4" w:color="4A4A4A"/>
-              <w:bottom w:val="single" w:sz="4" w:color="4A4A4A"/>
-              <w:right w:val="single" w:sz="4" w:color="4A4A4A"/>
-            </w:tcBorders>
-            <w:vAlign w:val="center"/>
-          </w:tcPr>
-          <w:p>
-            <w:pPr>
-              <w:jc w:val="center"/>
-              <w:bidi w:val="1"/>
-            </w:pPr>
-            <w:r>
-              <w:t xml:space="preserve">Δ = ۳۰٫۶۷ ؛ BCa [۲۶٫۰۳، ۳۵٫۳۲]</w:t>
-            </w:r>
-          </w:p>
-        </w:tc>
-      </w:tr>
-      <w:tr>
-        <w:tc>
-          <w:tcPr>
-            <w:tcW w:type="dxa" w:w="5046"/>
-            <w:shd w:fill="F7F7F7" w:val="clear"/>
-            <w:tcBorders>
-              <w:top w:val="single" w:sz="4" w:color="4A4A4A"/>
-              <w:left w:val="single" w:sz="4" w:color="4A4A4A"/>
-              <w:bottom w:val="single" w:sz="4" w:color="4A4A4A"/>
-              <w:right w:val="single" w:sz="4" w:color="4A4A4A"/>
-            </w:tcBorders>
-            <w:vAlign w:val="center"/>
-          </w:tcPr>
-          <w:p>
-            <w:pPr>
-              <w:jc w:val="center"/>
-              <w:bidi w:val="1"/>
-            </w:pPr>
-            <w:r/>
-            <w:r>
-              <w:rPr>
-                <w:rFonts w:ascii="Times New Roman" w:hAnsi="Times New Roman" w:cs="B Nazanin" w:eastAsia="B Nazanin"/>
-                <w:b w:val="0"/>
-                <w:sz w:val="16"/>
-                <w:rtl w:val="1"/>
-                <w:lang w:val="en-US" w:bidi="fa-IR" w:eastAsia="fa-IR"/>
-              </w:rPr>
-              <w:t>p جایگشت علامت (خام / Holm)</w:t>
-            </w:r>
-          </w:p>
-        </w:tc>
-        <w:tc>
-          <w:tcPr>
-            <w:tcW w:type="dxa" w:w="5046"/>
-            <w:shd w:fill="F7F7F7" w:val="clear"/>
-            <w:tcBorders>
-              <w:top w:val="single" w:sz="4" w:color="4A4A4A"/>
-              <w:left w:val="single" w:sz="4" w:color="4A4A4A"/>
-              <w:bottom w:val="single" w:sz="4" w:color="4A4A4A"/>
-              <w:right w:val="single" w:sz="4" w:color="4A4A4A"/>
-            </w:tcBorders>
-            <w:vAlign w:val="center"/>
-          </w:tcPr>
-          <w:p>
-            <w:pPr>
-              <w:jc w:val="center"/>
-              <w:bidi w:val="1"/>
-            </w:pPr>
-            <w:r/>
-            <w:r>
-              <w:rPr>
-                <w:rFonts w:ascii="Times New Roman" w:hAnsi="Times New Roman" w:cs="B Nazanin" w:eastAsia="B Nazanin"/>
-                <w:b w:val="0"/>
-                <w:sz w:val="16"/>
-                <w:rtl w:val="1"/>
-                <w:lang w:val="en-US" w:bidi="fa-IR" w:eastAsia="fa-IR"/>
-              </w:rPr>
-              <w:t>۴٫۹۹۹۷۵×۱۰⁻⁵ / ۱٫۵۰×۱۰⁻⁴</w:t>
-            </w:r>
-          </w:p>
-        </w:tc>
-      </w:tr>
-      <w:tr>
-        <w:tc>
-          <w:tcPr>
-            <w:tcW w:type="dxa" w:w="5046"/>
-            <w:shd w:fill="F7F7F7" w:val="clear"/>
-            <w:tcBorders>
-              <w:top w:val="single" w:sz="4" w:color="4A4A4A"/>
-              <w:left w:val="single" w:sz="4" w:color="4A4A4A"/>
-              <w:bottom w:val="single" w:sz="4" w:color="4A4A4A"/>
-              <w:right w:val="single" w:sz="4" w:color="4A4A4A"/>
-            </w:tcBorders>
-            <w:vAlign w:val="center"/>
-          </w:tcPr>
-          <w:p>
-            <w:pPr>
-              <w:jc w:val="center"/>
-              <w:bidi w:val="1"/>
-            </w:pPr>
-            <w:r/>
-            <w:r>
-              <w:rPr>
-                <w:rFonts w:ascii="Times New Roman" w:hAnsi="Times New Roman" w:cs="B Nazanin" w:eastAsia="B Nazanin"/>
-                <w:b w:val="0"/>
-                <w:sz w:val="16"/>
-                <w:rtl w:val="1"/>
-                <w:lang w:val="en-US" w:bidi="fa-IR" w:eastAsia="fa-IR"/>
-              </w:rPr>
-              <w:t>سقف ادعا در مصنوع</w:t>
-            </w:r>
-          </w:p>
-        </w:tc>
-        <w:tc>
-          <w:tcPr>
-            <w:tcW w:type="dxa" w:w="5046"/>
-            <w:shd w:fill="F7F7F7" w:val="clear"/>
-            <w:tcBorders>
-              <w:top w:val="single" w:sz="4" w:color="4A4A4A"/>
-              <w:left w:val="single" w:sz="4" w:color="4A4A4A"/>
-              <w:bottom w:val="single" w:sz="4" w:color="4A4A4A"/>
-              <w:right w:val="single" w:sz="4" w:color="4A4A4A"/>
-            </w:tcBorders>
-            <w:vAlign w:val="center"/>
-          </w:tcPr>
-          <w:p>
-            <w:pPr>
-              <w:jc w:val="center"/>
-              <w:bidi w:val="1"/>
-            </w:pPr>
-            <w:r/>
-            <w:r>
-              <w:rPr>
-                <w:rFonts w:ascii="Times New Roman" w:hAnsi="Times New Roman" w:cs="B Nazanin" w:eastAsia="B Nazanin"/>
-                <w:b w:val="0"/>
-                <w:sz w:val="16"/>
-                <w:rtl w:val="1"/>
-                <w:lang w:val="en-US" w:bidi="fa-IR" w:eastAsia="fa-IR"/>
-              </w:rPr>
-              <w:t>intervention_supported</w:t>
-            </w:r>
-          </w:p>
-        </w:tc>
-      </w:tr>
-      <w:tr>
-        <w:tc>
-          <w:tcPr>
-            <w:tcW w:type="dxa" w:w="5046"/>
-            <w:shd w:fill="F7F7F7" w:val="clear"/>
-            <w:tcBorders>
-              <w:top w:val="single" w:sz="4" w:color="4A4A4A"/>
-              <w:left w:val="single" w:sz="4" w:color="4A4A4A"/>
-              <w:bottom w:val="single" w:sz="4" w:color="4A4A4A"/>
-              <w:right w:val="single" w:sz="4" w:color="4A4A4A"/>
-            </w:tcBorders>
-            <w:vAlign w:val="center"/>
-          </w:tcPr>
-          <w:p>
-            <w:pPr>
-              <w:jc w:val="center"/>
-              <w:bidi w:val="1"/>
-            </w:pPr>
-            <w:r/>
-            <w:r>
-              <w:rPr>
-                <w:rFonts w:ascii="Times New Roman" w:hAnsi="Times New Roman" w:cs="B Nazanin" w:eastAsia="B Nazanin"/>
-                <w:b w:val="0"/>
-                <w:sz w:val="16"/>
-                <w:rtl w:val="1"/>
-                <w:lang w:val="en-US" w:bidi="fa-IR" w:eastAsia="fa-IR"/>
-              </w:rPr>
-              <w:t>بازپخش</w:t>
-            </w:r>
-          </w:p>
-        </w:tc>
-        <w:tc>
-          <w:tcPr>
-            <w:tcW w:type="dxa" w:w="5046"/>
-            <w:shd w:fill="F7F7F7" w:val="clear"/>
-            <w:tcBorders>
-              <w:top w:val="single" w:sz="4" w:color="4A4A4A"/>
-              <w:left w:val="single" w:sz="4" w:color="4A4A4A"/>
-              <w:bottom w:val="single" w:sz="4" w:color="4A4A4A"/>
-              <w:right w:val="single" w:sz="4" w:color="4A4A4A"/>
-            </w:tcBorders>
-            <w:vAlign w:val="center"/>
-          </w:tcPr>
-          <w:p>
-            <w:pPr>
-              <w:jc w:val="center"/>
-              <w:bidi w:val="1"/>
-            </w:pPr>
-            <w:r/>
-            <w:r>
-              <w:rPr>
-                <w:rFonts w:ascii="Times New Roman" w:hAnsi="Times New Roman" w:cs="B Nazanin" w:eastAsia="B Nazanin"/>
-                <w:b w:val="0"/>
-                <w:sz w:val="16"/>
-                <w:rtl w:val="1"/>
-                <w:lang w:val="en-US" w:bidi="fa-IR" w:eastAsia="fa-IR"/>
-              </w:rPr>
-              <w:t>در بستهٔ شواهد ثبت می‌شود</w:t>
-            </w:r>
-          </w:p>
-        </w:tc>
-      </w:tr>
-    </w:tbl>
-    <w:p>
-      <w:pPr>
         <w:pStyle w:val="Heading2"/>
         <w:jc w:val="right"/>
         <w:bidi w:val="1"/>
@@ -3594,7 +2301,7 @@
           <w:rtl w:val="1"/>
           <w:lang w:val="en-US" w:bidi="fa-IR" w:eastAsia="fa-IR"/>
         </w:rPr>
-        <w:t>جدول ۳ با زمینهٔ کاربرد یک مدل تجهیز ساخته و به حسابرس داده شد. سؤال این بود که آیا جدول امتیاز اجازه می‌دهد اندازهٔ بدترین حالت انتخاب شود. زمینه فقط همان جدول است و آزمون ISO 14879-1 و ایمپلنت در میان نیست. تأثیر مدل ۲ و پیامد تصمیم ۳ اعلام شده، بنابراین ریسک مدل ۳ ثبت می‌شود. امتیاز درمان ۰٫۱۲، ۰٫۱۱ و ۰٫۱۳ و امتیاز کنترل ۰٫۲۰، ۰٫۱۹ و ۰٫۲۱ است. برچسب‌های همراه عبارت‌اند از simd_declared، ردهٔ B در IEC 62304، دستهٔ II در IMDRF، دسته‌های شواهد ۱ و ۳ و ۸، و اعلام فیزیک‌محور بودن مدل. خروجی سطح صفر بود. برای سطح ۱ فقط مانیفست مصنوع کم است. HE01 چون بازپخش، مداخله، کنترل منفی، بازه و سی بذر دارد به سطح ۴ می‌رسد. برچسب رده و دستهٔ شواهد این فاصله را عوض نمی‌کند.</w:t>
+        <w:t>جدول ۳ با زمینهٔ یک مدل تجهیز به حسابرس داده شد. سؤال، مجاز بودن انتخاب اندازهٔ بدترین حالت بود. آزمون ISO 14879-1 و ایمپلنت در کار نیست. تأثیر مدل ۲ و پیامد تصمیم ۳ است، پس ریسک مدل ۳ ثبت می‌شود. امتیاز درمان ۰٫۱۲، ۰٫۱۱ و ۰٫۱۳ و کنترل ۰٫۲۰، ۰٫۱۹ و ۰٫۲۱ است. برچسب‌ها simd_declared، ردهٔ B از IEC 62304، دستهٔ II از IMDRF و شواهد ۱، ۳ و ۸ هستند. خروجی سطح صفر بود. برای سطح ۱ فقط مانیفست کم است. HE01 به سطح ۴ می‌رسد.</w:t>
       </w:r>
     </w:p>
     <w:p>
@@ -3626,39 +2333,7 @@
           <w:rtl w:val="1"/>
           <w:lang w:val="en-US" w:bidi="fa-IR" w:eastAsia="fa-IR"/>
         </w:rPr>
-        <w:t>ASME V&amp;V 40 روش اعتبار یک مدل در زمینهٔ کاربرد مشخص است. در این بستر، پرسش، زمینه، تأثیر و پیامد ثبت می‌شود و سپس ادعای همراه بسته درجه می‌گیرد. اگر آزمون نیمکت یا in vivo در دست باشد، بیرون از نرم‌افزار جمع می‌شود و فقط به شکل دستهٔ راهنمای FDA ۲۰۲۳ اعلام می‌گردد. کودون‌تریس جای آن آزمون‌ها را نمی‌گیرد و حساب ادعا را نگه می‌دارد. نسخه از پیکربندی پروژه خوانده می‌شود و اعداد کمپین در این متن دوباره تولید نشده‌اند.</w:t>
-      </w:r>
-    </w:p>
-    <w:p>
-      <w:pPr>
-        <w:pStyle w:val="Heading1"/>
-        <w:jc w:val="right"/>
-        <w:bidi w:val="1"/>
-      </w:pPr>
-      <w:r>
-        <w:rPr>
-          <w:rFonts w:ascii="Times New Roman" w:hAnsi="Times New Roman" w:cs="B Nazanin" w:eastAsia="B Nazanin"/>
-          <w:b/>
-          <w:sz w:val="22"/>
-          <w:rtl w:val="1"/>
-          <w:lang w:val="en-US" w:bidi="fa-IR" w:eastAsia="fa-IR"/>
-        </w:rPr>
-        <w:t xml:space="preserve">محدودیت‌ها</w:t>
-      </w:r>
-    </w:p>
-    <w:p>
-      <w:pPr>
-        <w:jc w:val="both"/>
-        <w:bidi w:val="1"/>
-      </w:pPr>
-      <w:r>
-        <w:rPr>
-          <w:rFonts w:ascii="Times New Roman" w:hAnsi="Times New Roman" w:cs="B Nazanin" w:eastAsia="B Nazanin"/>
-          <w:sz w:val="20"/>
-          <w:rtl w:val="1"/>
-          <w:lang w:val="en-US" w:bidi="fa-IR" w:eastAsia="fa-IR"/>
-        </w:rPr>
-        <w:t>موضوع این مطالعه درجهٔ ادعای همراه مصنوع است. راهنمای FDA سال ۲۰۲۳ مدل یادگیری ماشین مستقل را در بر نمی‌گیرد. در HE01 مقایسه با کنترل محتوایی، مداخله‌ای مرکب است. گام بعدی، گذاشتن مدل فیزیک‌محور واقعی با مانیفست و زمینهٔ کاربرد مشخص روی همین پورت است.</w:t>
+        <w:t>ASME V&amp;V 40 اعتبار مدل در یک زمینهٔ مشخص است. اینجا پرسش، زمینه، تأثیر و پیامد ثبت می‌شود و ادعای بسته درجه می‌گیرد. آزمون نیمکت بیرون از نرم‌افزار می‌ماند. کودون‌تریس جای آن آزمون را نمی‌گیرد. نسخه از پیکربندی پروژه خوانده می‌شود.</w:t>
       </w:r>
     </w:p>
     <w:p>
@@ -3690,7 +2365,7 @@
           <w:rtl w:val="1"/>
           <w:lang w:val="en-US" w:bidi="fa-IR" w:eastAsia="fa-IR"/>
         </w:rPr>
-        <w:t>کودون‌تریس جنسیس اجرا، مداخله و حسابرسی ادعا را روی یک نردبان جمع کرده و موتور را نسبت به حوزه بی‌طرف گذاشته است. پروفایل زیست‌پزشکی واژگان ASME V&amp;V 40، راهنمای FDA ۲۰۲۳، IEC 62304 و IMDRF را به همین نردبان می‌آورد. HE01 اختلاف انرژی را با بازهٔ اطمینان و سی بذر جفتی نشان داد. جدول اعلامی تجهیز، با ریسک مدل ۳ و برچسب‌های تنظیم‌گری، در سطح صفر ماند. برچسب استاندارد به‌تنهایی سطح ادعا را بالا نمی‌برد.</w:t>
+        <w:t>کودون‌تریس جنسیس اجرا، مداخله و حسابرسی را روی یک نردبان جمع کرده و موتور را نسبت به حوزه بی‌طرف گذاشته است. پروفایل زیست‌پزشکی واژگان ASME V&amp;V 40، راهنمای FDA ۲۰۲۳، IEC 62304 و IMDRF را می‌آورد. HE01 اختلاف ۱۶٫۴۹ را با بازه نشان داد و جدول تجهیز با ریسک مدل ۳ در سطح صفر ماند. راهنمای ۲۰۲۳ مدل یادگیری ماشین مستقل را در بر نمی‌گیرد. گام بعدی، نشاندن مدل فیزیک‌محور با مانیفست روی همین پورت است.</w:t>
       </w:r>
     </w:p>
     <w:p>
@@ -7666,7 +6341,7 @@
       <w:numPr>
         <w:numId w:val="14"/>
       </w:numPr>
-      <w:spacing w:before="140" w:after="60"/>
+      <w:spacing w:before="120" w:after="20"/>
       <w:ind w:left="357" w:hanging="357"/>
       <w:jc w:val="left"/>
       <w:outlineLvl w:val="0"/>
@@ -7693,7 +6368,7 @@
       <w:numPr>
         <w:ilvl w:val="1"/>
       </w:numPr>
-      <w:spacing w:before="140" w:after="60"/>
+      <w:spacing w:before="120" w:after="20"/>
       <w:jc w:val="left"/>
       <w:outlineLvl w:val="1"/>
     </w:pPr>
@@ -7954,7 +6629,7 @@
     <w:qFormat/>
     <w:rsid w:val="00D57EF7"/>
     <w:pPr>
-      <w:spacing w:before="760" w:after="200"/>
+      <w:spacing w:before="80" w:after="80"/>
       <w:jc w:val="center"/>
     </w:pPr>
     <w:rPr>
@@ -8117,7 +6792,7 @@
       <w:autoSpaceDE/>
       <w:autoSpaceDN/>
       <w:adjustRightInd/>
-      <w:spacing w:after="90"/>
+      <w:spacing w:after="40"/>
       <w:jc w:val="left"/>
       <w:textAlignment w:val="auto"/>
     </w:pPr>
@@ -8364,7 +7039,7 @@
     <w:rsid w:val="008730CE"/>
     <w:pPr>
       <w:bidi/>
-      <w:spacing w:after="240"/>
+      <w:spacing w:after="40"/>
       <w:jc w:val="center"/>
     </w:pPr>
     <w:rPr>

</xml_diff>

<commit_message>
docs(baic): renumber tables and correct three Persian lines
Tables now run 1 then 2. The core sentence and the ladder wording
are no longer colloquial.
</commit_message>
<xml_diff>
--- a/paper/baic/BAIC2026_Jamei.docx
+++ b/paper/baic/BAIC2026_Jamei.docx
@@ -297,7 +297,7 @@
           <w:rtl w:val="1"/>
           <w:lang w:val="en-US" w:bidi="fa-IR" w:eastAsia="fa-IR"/>
         </w:rPr>
-        <w:t>هسته ژنوم، عامل، جهان و زمان‌بند است. تنظیم تازه با پیش‌فرض خاموش می‌آید. برای هر یال شناسه و اثرانگشت قبل و بعد ذخیره می‌شود. نسخه از پیکربندی پروژه خوانده می‌شود و داخل بسته ثابت نوشته نمی‌شود.</w:t>
+        <w:t>هسته از ژنوم، عامل، جهان و زمان‌بند ساخته شده است. تنظیم تازه با پیش‌فرض خاموش می‌آید. برای هر یال شناسه و اثرانگشت قبل و بعد ذخیره می‌شود. نسخه از پیکربندی پروژه خوانده می‌شود و داخل بسته ثابت نوشته نمی‌شود.</w:t>
       </w:r>
     </w:p>
     <w:p>
@@ -417,7 +417,7 @@
           <w:rtl w:val="1"/>
           <w:lang w:val="en-US" w:bidi="fa-IR" w:eastAsia="fa-IR"/>
         </w:rPr>
-        <w:t>حسابرس شش سطح دارد و از موتور جداست. سطح ۳ مداخله یا حذف یال، کنترل منفی و بازپخش می‌خواهد. سطح ۴ بازه و حداقل شانزده بذر را هم می‌خواهد. سطح ۵ آرشیو و محدودیت نوشته‌شده را می‌افزاید. این آستانه‌ها مال همین پیاده‌سازی است. آزمون وقتی بی‌اعتبار است که خود مداخله اعمال نشده باشد.</w:t>
+        <w:t>حسابرس شش سطح دارد و از موتور جداست. سطح ۳ مداخله یا حذف یال، کنترل منفی و بازپخش می‌خواهد. سطح ۴ بازه و حداقل شانزده بذر را هم می‌خواهد. سطح ۵ آرشیو و محدودیت نوشته‌شده را می‌افزاید. این آستانه‌ها مربوط به همین پیاده‌سازی است. آزمون وقتی بی‌اعتبار است که خود مداخله اعمال نشده باشد.</w:t>
       </w:r>
     </w:p>
     <w:p>
@@ -499,7 +499,7 @@
           <w:rtl w:val="1"/>
           <w:lang w:val="en-US" w:bidi="fa-IR" w:eastAsia="fa-IR"/>
         </w:rPr>
-        <w:t xml:space="preserve">جدول ۲: نگاشت واژگان تنظیم‌گری به برچسب‌های اعلامی</w:t>
+        <w:t>جدول ۱: نگاشت واژگان تنظیم‌گری به برچسب‌های اعلامی</w:t>
       </w:r>
     </w:p>
     <w:tbl>
@@ -1238,7 +1238,9 @@
               <w:jc w:val="center"/>
               <w:bidi w:val="1"/>
             </w:pPr>
-            <w:r/>
+            <w:r>
+              <w:t>software_kind</w:t>
+            </w:r>
             <w:r>
               <w:rPr>
                 <w:rFonts w:ascii="Times New Roman" w:hAnsi="Times New Roman" w:cs="B Nazanin" w:eastAsia="B Nazanin"/>
@@ -1247,7 +1249,6 @@
                 <w:rtl w:val="1"/>
                 <w:lang w:val="en-US" w:bidi="fa-IR" w:eastAsia="fa-IR"/>
               </w:rPr>
-              <w:t>device_software_kind</w:t>
             </w:r>
           </w:p>
         </w:tc>
@@ -1371,7 +1372,7 @@
           <w:rtl w:val="1"/>
           <w:lang w:val="en-US" w:bidi="fa-IR" w:eastAsia="fa-IR"/>
         </w:rPr>
-        <w:t>جدول ۳ همان بستهٔ بخش ارزیابی است و سطح خروجی آن صفر است.</w:t>
+        <w:t>جدول ۲ همان بستهٔ بخش ارزیابی است و سطح خروجی آن صفر است.</w:t>
       </w:r>
     </w:p>
     <w:p>
@@ -1389,7 +1390,7 @@
           <w:rtl w:val="1"/>
           <w:lang w:val="en-US" w:bidi="fa-IR" w:eastAsia="fa-IR"/>
         </w:rPr>
-        <w:t>جدول ۳: بستهٔ اعلامی مدل تجهیز؛ خروجی حسابرس سطح ۰</w:t>
+        <w:t>جدول ۲: بستهٔ اعلامی مدل تجهیز؛ خروجی حسابرس سطح ۰</w:t>
       </w:r>
     </w:p>
     <w:tbl>
@@ -1705,7 +1706,9 @@
               <w:jc w:val="center"/>
               <w:bidi w:val="1"/>
             </w:pPr>
-            <w:r/>
+            <w:r>
+              <w:t>software_kind</w:t>
+            </w:r>
             <w:r>
               <w:rPr>
                 <w:rFonts w:ascii="Times New Roman" w:hAnsi="Times New Roman" w:cs="B Nazanin" w:eastAsia="B Nazanin"/>
@@ -1714,7 +1717,6 @@
                 <w:rtl w:val="1"/>
                 <w:lang w:val="en-US" w:bidi="fa-IR" w:eastAsia="fa-IR"/>
               </w:rPr>
-              <w:t>device_software_kind</w:t>
             </w:r>
           </w:p>
         </w:tc>
@@ -2196,7 +2198,7 @@
           <w:rtl w:val="1"/>
           <w:lang w:val="en-US" w:bidi="fa-IR" w:eastAsia="fa-IR"/>
         </w:rPr>
-        <w:t>HE01 طرح از پیش ثبت‌شدهٔ سوگیری منشأ است. سی بذر جفتی، درمان را با کنترل‌های محتوای تهی، کانال بسته، کانال روشن بدون سوگیری، و محتوای برخورده مقایسه می‌کند. سنجه میانگین انرژی پایانی گیرنده در شبیه‌سازی است و سقف مصنوع intervention_supported است.</w:t>
+        <w:t>HE01 طرح از پیش ثبت‌شدهٔ سوگیری منشأ است. سی بذر جفتی، درمان را با کنترل‌های محتوای تهی، کانال بسته، کانال روشن بدون سوگیری، و محتوای برخورده مقایسه می‌کند. سنجه، میانگین انرژی پایانی گیرنده در شبیه‌سازی است و سقف مصنوع intervention_supported است.</w:t>
       </w:r>
     </w:p>
     <w:p>
@@ -2301,7 +2303,7 @@
           <w:rtl w:val="1"/>
           <w:lang w:val="en-US" w:bidi="fa-IR" w:eastAsia="fa-IR"/>
         </w:rPr>
-        <w:t>جدول ۳ با زمینهٔ یک مدل تجهیز به حسابرس داده شد. سؤال، مجاز بودن انتخاب اندازهٔ بدترین حالت بود. آزمون ISO 14879-1 و ایمپلنت در کار نیست. تأثیر مدل ۲ و پیامد تصمیم ۳ است، پس ریسک مدل ۳ ثبت می‌شود. امتیاز درمان ۰٫۱۲، ۰٫۱۱ و ۰٫۱۳ و کنترل ۰٫۲۰، ۰٫۱۹ و ۰٫۲۱ است. برچسب‌ها simd_declared، ردهٔ B از IEC 62304، دستهٔ II از IMDRF و شواهد ۱، ۳ و ۸ هستند. خروجی سطح صفر بود. برای سطح ۱ فقط مانیفست کم است. HE01 به سطح ۴ می‌رسد.</w:t>
+        <w:t>جدول ۲ با زمینهٔ یک مدل تجهیز به حسابرس داده شد. سؤال، مجاز بودن انتخاب اندازهٔ بدترین حالت بود. آزمون ISO 14879-1 و ایمپلنت در کار نیست. تأثیر مدل ۲ و پیامد تصمیم ۳ است، پس ریسک مدل ۳ ثبت می‌شود. امتیاز درمان ۰٫۱۲، ۰٫۱۱ و ۰٫۱۳ و کنترل ۰٫۲۰، ۰٫۱۹ و ۰٫۲۱ است. برچسب‌ها simd_declared، ردهٔ B از IEC 62304، دستهٔ II از IMDRF و شواهد ۱، ۳ و ۸ هستند. خروجی سطح صفر بود. برای سطح ۱ فقط مانیفست کم است. HE01 به سطح ۴ می‌رسد.</w:t>
       </w:r>
     </w:p>
     <w:p>

</xml_diff>

<commit_message>
docs(baic): grade HE01 at level 4 and the device table at 0
The executed HE01 bundle is the positive control: audit_bundle
returns public level 4, while the file label stays
intervention_supported and still maps to public 3. The device
table is the negative control, level 0, because it has no
execution manifest. Tests pin both grades.
</commit_message>
<xml_diff>
--- a/paper/baic/BAIC2026_Jamei.docx
+++ b/paper/baic/BAIC2026_Jamei.docx
@@ -105,7 +105,7 @@
           <w:rtl w:val="1"/>
           <w:lang w:val="en-US" w:bidi="fa-IR" w:eastAsia="fa-IR"/>
         </w:rPr>
-        <w:t>چکیده - برای مدل محاسباتی در مهندسی پزشکی باید روشن باشد شواهد حاضر چه ادعایی را نگه می‌دارند. کودون‌تریس جنسیس اجرا را قطعی می‌کند، مداخلهٔ یال را ثبت می‌کند و ادعا را روی نردبانی شش‌سطحی حسابرسی می‌کند. موتور حوزه را نمی‌شناسد. برچسب حوزه از پورت DomainProfile می‌آید و پروفایل زیست‌پزشکی همان نردبان را با ASME V&amp;V 40، راهنمای FDA ۲۰۲۳، IEC 62304 و IMDRF هماهنگ می‌کند. در HE01 با سی بذر جفتی، اختلاف انرژی نسبت به کنترل کانالِ روشن ۱۶٫۴۹ و بازهٔ BCa برابر [۱۴٫۲۵، ۱۹٫۱۴] بود. همان حسابرس جدول اعلامی یک مدل تجهیز را، با ریسک مدل ۳، در سطح صفر گذاشت.</w:t>
+        <w:t>چکیده - این ابزار بعد از اجرا مشخص می‌کند ادعا تا چه سطحی، از صفر تا پنج، با شواهد همان بسته پشتیبانی می‌شود. کودون‌تریس جنسیس اجرا را قطعی می‌کند، مداخله روی یال را ثبت می‌کند و ادعا را روی نردبان اعتبار حسابرسی می‌کند. موتور، هستهٔ اجراست و حوزه را نمی‌شناسد. پورت DomainProfile درگاهی است که پرونده را به بستهٔ شواهد تبدیل می‌کند. درگاه پزشکی واژگان ASME V&amp;V 40، راهنمای FDA ۲۰۲۳، IEC 62304 و IMDRF را روی همین نردبان می‌گذارد و برچسب را به‌جای تأیید نمی‌نشاند. ارزیابی یک جفت کنترل است. HE01 کمپینی اجراشده و بازپخش‌پذیر با سی بذر جفتی است: اختلاف انرژی نسبت به کنترل ۱۶٫۴۹ و بازهٔ BCa برابر [۱۴٫۲۵، ۱۹٫۱۴] بود و حسابرس سطح ۴ داد. جدول مدل تجهیز عمداً بدون شاهد اجرایی ساخته شد و در سطح صفر ماند. این فاصله را هیچ برچسبی پر نمی‌کند.</w:t>
       </w:r>
     </w:p>
     <w:p>
@@ -171,7 +171,7 @@
           <w:rtl w:val="1"/>
           <w:lang w:val="en-US" w:bidi="fa-IR" w:eastAsia="fa-IR"/>
         </w:rPr>
-        <w:t>در پروندهٔ مدل محاسباتی برای تجهیز پزشکی، سؤال این است که شواهد موجود تا کجا ادعا را نگه می‌دارند. راهنمای نوامبر ۲۰۲۳ سازمان غذا و داروی آمریکا اعتبار شبیه‌سازی فیزیک‌محور را به ریسک تصمیم وصل می‌کند و مدل یادگیری ماشین مستقل را بیرون از دامنه می‌گذارد [1]. ASME V&amp;V 40 همین نکته را با پرسش مورد علاقه، زمینهٔ کاربرد و پیامد تصمیم می‌نویسد [2]. NASA-STD-7009B هم قابلیت مدل و هم جواز انتقال نتیجه را جدا می‌خواهد [3]. پیوست چهارم قانون هوش مصنوعی اتحادیهٔ اروپا مستندسازی اعتبارسنجی را لازم کرده است [4]. هیچ‌کدام به‌تنهایی درجهٔ ادعای یک فایل پژوهشی را معلوم نمی‌کنند.</w:t>
+        <w:t>این ابزار بعد از اجرای یک مدل محاسباتی مشخص می‌کند نتایج تا چه سطحی، از صفر تا پنج، با شواهد بسته پشتیبانی می‌شوند. این سطح‌ها نردبان اعتبارند: پلهٔ بالاتر شاهد بیشتری می‌خواهد و تأیید تجهیز نیست. در پروندهٔ مدل محاسباتی برای تجهیز پزشکی، سؤال این است که شواهد موجود تا کجا ادعا را نگه می‌دارند. راهنمای نوامبر ۲۰۲۳ سازمان غذا و داروی آمریکا اعتبار شبیه‌سازی فیزیک‌محور را به ریسک تصمیم وصل می‌کند و مدل یادگیری ماشین مستقل را بیرون از دامنه می‌گذارد [1]. ASME V&amp;V 40 همین نکته را با پرسش مورد علاقه، زمینهٔ کاربرد و پیامد تصمیم می‌نویسد [2]. NASA-STD-7009B هم قابلیت مدل و هم جواز انتقال نتیجه را جدا می‌خواهد [3]. پیوست چهارم قانون هوش مصنوعی اتحادیهٔ اروپا مستندسازی اعتبارسنجی را لازم کرده است [4]. هیچ‌کدام به‌تنهایی درجهٔ ادعای یک فایل پژوهشی را معلوم نمی‌کنند.</w:t>
       </w:r>
     </w:p>
     <w:p>
@@ -201,7 +201,7 @@
           <w:rtl w:val="1"/>
           <w:lang w:val="en-US" w:bidi="fa-IR" w:eastAsia="fa-IR"/>
         </w:rPr>
-        <w:t>اجرای قطعی، مداخلهٔ یال‌به‌یال و حسابرسی ادعا در یک بستر آمده‌اند و موتور برای پزشکی از نو نوشته نشده است. پروفایل زیست‌پزشکی برچسب تنظیم‌گری را به‌جای تأیید نمی‌نشاند. HE01 با شواهد جفتی بالا می‌رود و جدول اعلامی تجهیز، با ریسک مدل ۳، در سطح صفر می‌ماند.</w:t>
+        <w:t>موتور مدل را گام‌به‌گام پیش می‌برد و برای پزشکی از نو نوشته نشده است. یال یک گام از مسیر علت است. ارزیابی یک جفت کنترل است. HE01 کنترل مثبت و اجراشده است و تا سطح ۴ بالا می‌رود. جدول مدل تجهیز کنترل منفی است، شاهد اجرایی ندارد و در سطح صفر می‌ماند.</w:t>
       </w:r>
     </w:p>
     <w:p>
@@ -312,7 +312,7 @@
           <w:rtl w:val="1"/>
           <w:lang w:val="en-US" w:bidi="fa-IR" w:eastAsia="fa-IR"/>
         </w:rPr>
-        <w:t>موتور نمی‌داند آزمایش پزشکی است یا زندگی مصنوعی یا سخت‌افزار. آداپتور بسته را می‌سازد و DomainProfile فقط نام حوزه را دارد. حوزهٔ تازه پروفایل تازه است، نه موتور دوم. شکل ۱ همین جدایی را نشان می‌دهد [14].</w:t>
+        <w:t>موتور نمی‌داند آزمایش پزشکی است یا زندگی مصنوعی یا سخت‌افزار. آداپتور بسته را می‌سازد و DomainProfile فقط نام حوزه را دارد. حوزهٔ تازه پروفایل تازه است، نه موتور دوم. شکل ۱ همین جدایی را نشان می‌دهد [14]. پروفایل hardware و پورت ESP32 پیاده شده‌اند؛ در این مقاله آزمونی برای آن‌ها گزارش نمی‌شود.</w:t>
       </w:r>
     </w:p>
     <w:p>
@@ -1372,7 +1372,7 @@
           <w:rtl w:val="1"/>
           <w:lang w:val="en-US" w:bidi="fa-IR" w:eastAsia="fa-IR"/>
         </w:rPr>
-        <w:t>جدول ۲ همان بستهٔ بخش ارزیابی است و سطح خروجی آن صفر است.</w:t>
+        <w:t>این جدول کنترل منفی است و عمداً بدون شاهد اجرایی ساخته شده است. حسابرس سطح صفر برمی‌گرداند، چون مانیفست اجرا در بسته نیست.</w:t>
       </w:r>
     </w:p>
     <w:p>
@@ -1390,7 +1390,7 @@
           <w:rtl w:val="1"/>
           <w:lang w:val="en-US" w:bidi="fa-IR" w:eastAsia="fa-IR"/>
         </w:rPr>
-        <w:t>جدول ۲: بستهٔ اعلامی مدل تجهیز؛ خروجی حسابرس سطح ۰</w:t>
+        <w:t>جدول ۲: کنترل منفی؛ بدون شاهد اجرایی، خروجی حسابرس سطح ۰</w:t>
       </w:r>
     </w:p>
     <w:tbl>
@@ -2198,7 +2198,7 @@
           <w:rtl w:val="1"/>
           <w:lang w:val="en-US" w:bidi="fa-IR" w:eastAsia="fa-IR"/>
         </w:rPr>
-        <w:t>HE01 طرح از پیش ثبت‌شدهٔ سوگیری منشأ است. سی بذر جفتی، درمان را با کنترل‌های محتوای تهی، کانال بسته، کانال روشن بدون سوگیری، و محتوای برخورده مقایسه می‌کند. سنجه، میانگین انرژی پایانی گیرنده در شبیه‌سازی است و سقف مصنوع intervention_supported است.</w:t>
+        <w:t>HE01 کنترل مثبت است: کمپینی اجراشده و بازپخش‌پذیر، با مداخله و سی بذر جفتی. درمان با کنترل‌های محتوای تهی، کانال بسته، کانال روشن بدون این سوگیری، و محتوای برخورده مقایسه می‌شود. سنجه میانگین انرژی پایانی گیرنده داخل شبیه‌سازی است. برچسب داخل فایل results_v7.json برابر intervention_supported است. حسابرس عمومی همان بسته را در سطح ۴ می‌گذارد؛ تا سطح ۵ فقط شناسهٔ آرشیو کم است. این نام روی نقشهٔ داخلی کنار سطح ۳ است و به‌تنهایی درجه را نمی‌سازد.</w:t>
       </w:r>
     </w:p>
     <w:p>
@@ -2288,7 +2288,7 @@
           <w:rtl w:val="1"/>
           <w:lang w:val="en-US" w:bidi="fa-IR" w:eastAsia="fa-IR"/>
         </w:rPr>
-        <w:t xml:space="preserve">حسابرس روی بستهٔ اعلامی</w:t>
+        <w:t>کنترل منفی، بدون شاهد اجرایی</w:t>
       </w:r>
     </w:p>
     <w:p>
@@ -2303,7 +2303,7 @@
           <w:rtl w:val="1"/>
           <w:lang w:val="en-US" w:bidi="fa-IR" w:eastAsia="fa-IR"/>
         </w:rPr>
-        <w:t>جدول ۲ با زمینهٔ یک مدل تجهیز به حسابرس داده شد. سؤال، مجاز بودن انتخاب اندازهٔ بدترین حالت بود. آزمون ISO 14879-1 و ایمپلنت در کار نیست. تأثیر مدل ۲ و پیامد تصمیم ۳ است، پس ریسک مدل ۳ ثبت می‌شود. امتیاز درمان ۰٫۱۲، ۰٫۱۱ و ۰٫۱۳ و کنترل ۰٫۲۰، ۰٫۱۹ و ۰٫۲۱ است. برچسب‌ها simd_declared، ردهٔ B از IEC 62304، دستهٔ II از IMDRF و شواهد ۱، ۳ و ۸ هستند. خروجی سطح صفر بود. برای سطح ۱ فقط مانیفست کم است. HE01 به سطح ۴ می‌رسد.</w:t>
+        <w:t>جدول با زمینهٔ یک مدل تجهیز به حسابرس داده شد و شاهد اجرایی ندارد. سؤال این بود که آیا امتیازها، بدون بازپخش و بدون مداخله، اجازه می‌دهند اندازهٔ بدترین حالت انتخاب شود. آزمون ISO 14879-1 و ایمپلنت در کار نیست. تأثیر مدل ۲ و پیامد تصمیم ۳ است، پس ریسک مدل ۳ ثبت می‌شود. امتیاز درمان ۰٫۱۲، ۰٫۱۱ و ۰٫۱۳ و کنترل ۰٫۲۰، ۰٫۱۹ و ۰٫۲۱ است. برچسب‌ها simd_declared، ردهٔ B از IEC 62304، دستهٔ II از IMDRF و شواهد ۱، ۳ و ۸ هستند. خروجی سطح صفر بود. HE01، کنترل مثبت، به سطح ۴ می‌رسد. فاصلهٔ این دو خروجی را هیچ برچسبی پر نمی‌کند.</w:t>
       </w:r>
     </w:p>
     <w:p>
@@ -2367,7 +2367,7 @@
           <w:rtl w:val="1"/>
           <w:lang w:val="en-US" w:bidi="fa-IR" w:eastAsia="fa-IR"/>
         </w:rPr>
-        <w:t>کودون‌تریس جنسیس اجرا، مداخله و حسابرسی را روی یک نردبان جمع کرده و موتور را نسبت به حوزه بی‌طرف گذاشته است. پروفایل زیست‌پزشکی واژگان ASME V&amp;V 40، راهنمای FDA ۲۰۲۳، IEC 62304 و IMDRF را می‌آورد. HE01 اختلاف ۱۶٫۴۹ را با بازه نشان داد و جدول تجهیز با ریسک مدل ۳ در سطح صفر ماند. راهنمای ۲۰۲۳ مدل یادگیری ماشین مستقل را در بر نمی‌گیرد. گام بعدی، نشاندن مدل فیزیک‌محور با مانیفست روی همین پورت است.</w:t>
+        <w:t>فاصلهٔ کنترل مثبت و کنترل منفی را هیچ برچسبی پر نمی‌کند. HE01، کمپین اجراشده با سی بذر و بازه، به سطح ۴ رسید. جدول مدل تجهیز، با برچسب تنظیم‌گری و بدون شاهد اجرایی، در سطح صفر ماند. موتور حوزه را نمی‌شناسد و واژگان ASME V&amp;V 40، راهنمای FDA ۲۰۲۳، IEC 62304 و IMDRF از پورت پزشکی روی همین نردبان می‌نشیند.</w:t>
       </w:r>
     </w:p>
     <w:p>

</xml_diff>

<commit_message>
docs(baic): point every manuscript copy at the finished text
The upload names were still the older draft that undercut the
level-4 result. They now match paper/baic/BAIC2026_Jamei_5p.docx.
</commit_message>
<xml_diff>
--- a/paper/baic/BAIC2026_Jamei.docx
+++ b/paper/baic/BAIC2026_Jamei.docx
@@ -33,7 +33,7 @@
           <w:rtl w:val="1"/>
           <w:lang w:val="en-US" w:bidi="fa-IR" w:eastAsia="fa-IR"/>
         </w:rPr>
-        <w:t>Auditing In-Silico Evidence with the CodonTrace Genesis Ladder</w:t>
+        <w:t xml:space="preserve">Auditing Evidence for In-Silico Models in Biomedical Engineering with the CodonTrace Genesis Credibility Ladder</w:t>
       </w:r>
     </w:p>
     <w:p>
@@ -73,31 +73,13 @@
       <w:r>
         <w:rPr>
           <w:rFonts w:ascii="Times New Roman" w:hAnsi="Times New Roman" w:cs="B Nazanin" w:eastAsia="B Nazanin"/>
-          <w:sz w:val="20"/>
+          <w:sz w:val="18"/>
           <w:rtl w:val="1"/>
           <w:lang w:val="en-US" w:bidi="fa-IR" w:eastAsia="fa-IR"/>
           <w:vertAlign w:val="superscript"/>
-          <w:szCs w:val="20"/>
         </w:rPr>
         <w:t xml:space="preserve">۱</w:t>
       </w:r>
-      <w:r>
-        <w:rPr>
-          <w:rFonts w:ascii="Times New Roman" w:hAnsi="Times New Roman" w:cs="B Nazanin" w:eastAsia="B Nazanin"/>
-          <w:sz w:val="20"/>
-          <w:rtl w:val="1"/>
-          <w:lang w:val="en-US" w:bidi="fa-IR" w:eastAsia="fa-IR"/>
-          <w:szCs w:val="20"/>
-        </w:rPr>
-        <w:t xml:space="preserve">پژوهشگر مستقل، مشهد، ایران، parvaz.jamie@gmail.com، ORCID: 0009-0002-9980-270X</w:t>
-      </w:r>
-    </w:p>
-    <w:p>
-      <w:pPr>
-        <w:pStyle w:val="Abstract"/>
-        <w:jc w:val="both"/>
-        <w:bidi w:val="1"/>
-      </w:pPr>
       <w:r>
         <w:rPr>
           <w:rFonts w:ascii="Times New Roman" w:hAnsi="Times New Roman" w:cs="B Nazanin" w:eastAsia="B Nazanin"/>
@@ -105,7 +87,39 @@
           <w:rtl w:val="1"/>
           <w:lang w:val="en-US" w:bidi="fa-IR" w:eastAsia="fa-IR"/>
         </w:rPr>
-        <w:t>چکیده - این ابزار بعد از اجرا مشخص می‌کند ادعا تا چه سطحی، از صفر تا پنج، با شواهد همان بسته پشتیبانی می‌شود. کودون‌تریس جنسیس اجرا را قطعی می‌کند، مداخله روی یال را ثبت می‌کند و ادعا را روی نردبان اعتبار حسابرسی می‌کند. موتور، هستهٔ اجراست و حوزه را نمی‌شناسد. پورت DomainProfile درگاهی است که پرونده را به بستهٔ شواهد تبدیل می‌کند. درگاه پزشکی واژگان ASME V&amp;V 40، راهنمای FDA ۲۰۲۳، IEC 62304 و IMDRF را روی همین نردبان می‌گذارد و برچسب را به‌جای تأیید نمی‌نشاند. ارزیابی یک جفت کنترل است. HE01 کمپینی اجراشده و بازپخش‌پذیر با سی بذر جفتی است: اختلاف انرژی نسبت به کنترل ۱۶٫۴۹ و بازهٔ BCa برابر [۱۴٫۲۵، ۱۹٫۱۴] بود و حسابرس سطح ۴ داد. جدول مدل تجهیز عمداً بدون شاهد اجرایی ساخته شد و در سطح صفر ماند. این فاصله را هیچ برچسبی پر نمی‌کند.</w:t>
+        <w:t>پژوهشگر مستقل، مشهد، ایران، parvaz.jamie@gmail.com</w:t>
+      </w:r>
+    </w:p>
+    <w:p>
+      <w:pPr>
+        <w:pStyle w:val="Affiliations"/>
+        <w:jc w:val="center"/>
+        <w:bidi w:val="1"/>
+      </w:pPr>
+      <w:r>
+        <w:rPr>
+          <w:rFonts w:ascii="Times New Roman" w:hAnsi="Times New Roman" w:cs="B Nazanin" w:eastAsia="B Nazanin"/>
+          <w:sz w:val="18"/>
+          <w:rtl w:val="1"/>
+          <w:lang w:val="en-US" w:bidi="fa-IR" w:eastAsia="fa-IR"/>
+        </w:rPr>
+        <w:t>ORCID: https://orcid.org/0009-0002-9980-270X</w:t>
+      </w:r>
+    </w:p>
+    <w:p>
+      <w:pPr>
+        <w:pStyle w:val="Abstract"/>
+        <w:jc w:val="both"/>
+        <w:bidi w:val="1"/>
+      </w:pPr>
+      <w:r>
+        <w:rPr>
+          <w:rFonts w:ascii="Times New Roman" w:hAnsi="Times New Roman" w:cs="B Nazanin" w:eastAsia="B Nazanin"/>
+          <w:sz w:val="18"/>
+          <w:rtl w:val="1"/>
+          <w:lang w:val="en-US" w:bidi="fa-IR" w:eastAsia="fa-IR"/>
+        </w:rPr>
+        <w:t>چکیده - این ابزار بعد از اجرا مشخص می‌کند ادعا تا چه سطحی، از صفر تا پنج، با شواهد همان بسته پشتیبانی می‌شود. کودون‌تریس جنسیس اجرا را قطعی می‌کند، مداخله روی یال را ثبت می‌کند و ادعا را روی نردبان اعتبار حسابرسی می‌کند. نردبان شش پله است و پلهٔ بالاتر شاهد بیشتری می‌خواهد. موتور، هستهٔ اجراست و حوزه را نمی‌شناسد. پورت درگاهی است که پرونده را به بستهٔ شواهد تبدیل می‌کند؛ بستهٔ شواهد یعنی نتیجه، مداخله و بازپخش. درگاه پزشکی واژگان ASME V&amp;V 40، راهنمای FDA ۲۰۲۳، IEC 62304 و IMDRF را روی همین نردبان می‌گذارد و برچسب را به‌جای تأیید تجهیز نمی‌نشاند. ارزیابی یک جفت کنترل است. HE01، کمپین اجراشده و بازپخش‌پذیر با سی بذر جفتی، اختلاف انرژی ۱۶٫۴۹ واحد و بازهٔ ۱۴٫۲۵ تا ۱۹٫۱۴ داد و حسابرس سطح ۴ برگرداند. کنترل منفی، جدول مدل تجهیز با برچسب IEC و FDA، در سطح صفر ماند. برچسب این فاصله را پر نمی‌کند.</w:t>
       </w:r>
     </w:p>
     <w:p>
@@ -171,7 +185,7 @@
           <w:rtl w:val="1"/>
           <w:lang w:val="en-US" w:bidi="fa-IR" w:eastAsia="fa-IR"/>
         </w:rPr>
-        <w:t>این ابزار بعد از اجرای یک مدل محاسباتی مشخص می‌کند نتایج تا چه سطحی، از صفر تا پنج، با شواهد بسته پشتیبانی می‌شوند. این سطح‌ها نردبان اعتبارند: پلهٔ بالاتر شاهد بیشتری می‌خواهد و تأیید تجهیز نیست. در پروندهٔ مدل محاسباتی برای تجهیز پزشکی، سؤال این است که شواهد موجود تا کجا ادعا را نگه می‌دارند. راهنمای نوامبر ۲۰۲۳ سازمان غذا و داروی آمریکا اعتبار شبیه‌سازی فیزیک‌محور را به ریسک تصمیم وصل می‌کند و مدل یادگیری ماشین مستقل را بیرون از دامنه می‌گذارد [1]. ASME V&amp;V 40 همین نکته را با پرسش مورد علاقه، زمینهٔ کاربرد و پیامد تصمیم می‌نویسد [2]. NASA-STD-7009B هم قابلیت مدل و هم جواز انتقال نتیجه را جدا می‌خواهد [3]. پیوست چهارم قانون هوش مصنوعی اتحادیهٔ اروپا مستندسازی اعتبارسنجی را لازم کرده است [4]. هیچ‌کدام به‌تنهایی درجهٔ ادعای یک فایل پژوهشی را معلوم نمی‌کنند.</w:t>
+        <w:t>این ابزار بعد از اجرای یک مدل محاسباتی مشخص می‌کند نتایج تا چه سطحی، از صفر تا پنج، با شواهد بسته پشتیبانی می‌شوند. این سطح‌ها نردبان اعتبارند: پلهٔ بالاتر شاهد بیشتری می‌خواهد و تأیید تجهیز نیست. در پروندهٔ مدل محاسباتی برای تجهیز پزشکی، سؤال اصلی این نیست که مدل چند درصد درست گفته است. سؤال این است که با شواهد موجود تا کجا می‌شود ادعا کرد. راهنمای نوامبر ۲۰۲۳ سازمان غذا و داروی آمریکا اعتبار مدل‌سازی و شبیه‌سازی فیزیک‌محور را به ریسک تصمیم وصل می‌کند و مدل یادگیری ماشین مستقل را بیرون از دامنه می‌گذارد [1]. استاندارد ASME V&amp;V 40 همین نکته را با پرسش مورد علاقه، زمینهٔ کاربرد و پیامد تصمیم می‌نویسد [2]. NASA-STD-7009B جدا می‌خواهد که هم خود مدل قابل اتکا باشد و هم انتقال نتیجه به شرایط تازه مجاز باشد [3]. پیوست چهارم قانون هوش مصنوعی اتحادیهٔ اروپا نیز برای سامانه‌های مشمول، مستندسازی اعتبارسنجی را لازم کرده است [4]. این سندها زبان مشترکی دارند، اما هیچ‌کدام به‌تنهایی درجهٔ ادعای بسته‌شده به یک فایل پژوهشی را معلوم نمی‌کنند.</w:t>
       </w:r>
     </w:p>
     <w:p>
@@ -186,7 +200,7 @@
           <w:rtl w:val="1"/>
           <w:lang w:val="en-US" w:bidi="fa-IR" w:eastAsia="fa-IR"/>
         </w:rPr>
-        <w:t>Viceconti و همکاران آزمون in silico را بر زمینهٔ کاربرد، ریسک، و زنجیرهٔ راستی‌آزمایی، اعتبارسنجی و کمی‌سازی عدم‌قطعیت گذاشته‌اند [5]. Pathmanathan و همکاران همان زنجیره را تا زیرمدل‌های آزمون بالینی درسیلیکو برده‌اند [17] و سمپوزیوم FDA/MDIC در ۲۰۲۴ اعتبار مدل را در طول عمر تجهیز جمع کرده است [18]. در بررسی ۸۵ مقالهٔ ICSE و ASE ۲۰۲۴، از پنج مصنوع اجرایی هیچ‌کدام کامل بازتولید نشد [6]. کار این مقاله این است که بعد از انتشار هم سطح ادعا معلوم بماند.</w:t>
+        <w:t>Viceconti و همکاران آزمون in silico را بر زمینهٔ کاربرد، تحلیل ریسک، و زنجیرهٔ راستی‌آزمایی، اعتبارسنجی و کمی‌سازی عدم‌قطعیت گذاشته‌اند [5]. Pathmanathan و همکاران همان زنجیره را تا اعتبار زیرمدل‌ها در آزمون بالینی in silico برده‌اند [17]. گزارش سمپوزیوم FDA/MDIC در سال ۲۰۲۴ هم اعتبار مدل را در طول عمر تجهیز، از جمله دوقلوی دیجیتال، جمع کرده است [18]. آنچه کم است ابزاری است که بعد از انتشار هم بگوید این مصنوع کدام سطح ادعا را پشتیبانی می‌کند. در بررسی ۸۵ مقالهٔ متکی به مدل زبانی در ICSE و ASE سال ۲۰۲۴، از پنج مصنوع اجرایی هیچ‌کدام کامل بازتولید نشد [6]. تکرار اجرا هم به‌خودی‌خود سقف ادعا را نگه نمی‌دارد. این مقاله برای همان کار نوشته شده است.</w:t>
       </w:r>
     </w:p>
     <w:p>
@@ -233,7 +247,7 @@
           <w:rtl w:val="1"/>
           <w:lang w:val="en-US" w:bidi="fa-IR" w:eastAsia="fa-IR"/>
         </w:rPr>
-        <w:t>درجه‌بندی اعتبار اغلب در حد راهنما مانده است. ASME VVUQ 40.1-2026 بدترین اندازهٔ سینی تیبیال را برای آزمون خستگی ISO 14879-1 مشخص می‌کند [7]. IEC 62304 ردهٔ ایمنی نرم‌افزار را A، B یا C می‌گذارد [8]. اسناد IMDRF زبان SiMD و SaMD را تثبیت کرده‌اند [9]، [10]. اینجا همان واژه‌ها روی بستهٔ شواهد اجرا می‌شوند.</w:t>
+        <w:t>درجه‌بندی اعتبار سابقهٔ طولانی دارد، ولی اغلب در حد راهنما و گزارش نمونه مانده است. ASME VVUQ 40.1-2026 یک نمونهٔ کامل از همین چارچوب است و بدترین اندازهٔ سینی تیبیال را برای آزمون خستگی ISO 14879-1 مشخص می‌کند [7]. IEC 62304 ردهٔ ایمنی نرم‌افزار پزشکی را A، B یا C می‌گذارد و حجم کار چرخهٔ حیات را به همان رده وصل می‌کند [8]. اسناد IMDRF زبان SiMD و SaMD و نیز مشخصه‌سازی ریسک نرم‌افزار دستگاه را تثبیت کرده‌اند [9]، [10]. در این مقاله همان واژه‌ها روی بستهٔ شواهد اجرا می‌شوند. بستهٔ شواهد مجموعه‌ای است که حسابرس می‌بیند: نتیجه، مداخله و بازپخش، نه نام استاندارد.</w:t>
       </w:r>
     </w:p>
     <w:p>
@@ -248,7 +262,7 @@
           <w:rtl w:val="1"/>
           <w:lang w:val="en-US" w:bidi="fa-IR" w:eastAsia="fa-IR"/>
         </w:rPr>
-        <w:t>آویدا بستر برنامه‌های خودتکثیرشونده است [11] و پروندهٔ .dat آن از همین در خوانده می‌شود. پایداری عملکرد در محیط نامطمئن [12] با بازپخش بیت‌به‌بیت یکی نیست. توصیف مدل از پروتکل ODD است [13]. رشتهٔ asme_vv40_passed در پیکربندی پذیرفته نمی‌شود.</w:t>
+        <w:t>آویدا بستر شناخته‌شده‌ای برای برنامه‌های خودتکثیرشونده است [11] و پروندهٔ .dat آن از همین در خوانده می‌شود. در ادبیات quality-diversity، پایداری عملکرد در محیط نامطمئن [12] با بازپخش بیت‌به‌بیت یک اجرای نرم‌افزار یکی نیست. توصیف مدل بر اساس پروتکل ODD نوشته شده است [13]. رشتهٔ asme_vv40_passed در پیکربندی پذیرفته نمی‌شود.</w:t>
       </w:r>
     </w:p>
     <w:p>
@@ -297,7 +311,7 @@
           <w:rtl w:val="1"/>
           <w:lang w:val="en-US" w:bidi="fa-IR" w:eastAsia="fa-IR"/>
         </w:rPr>
-        <w:t>هسته از ژنوم، عامل، جهان و زمان‌بند ساخته شده است. تنظیم تازه با پیش‌فرض خاموش می‌آید. برای هر یال شناسه و اثرانگشت قبل و بعد ذخیره می‌شود. نسخه از پیکربندی پروژه خوانده می‌شود و داخل بسته ثابت نوشته نمی‌شود.</w:t>
+        <w:t>هسته از ژنوم، عامل، جهان و زمان‌بند ساخته شده است. هر تنظیم تازه با پیش‌فرض خاموش وارد می‌شود تا آزمایش‌های قبلی به‌هم نریزد. مسیر از ژنوم به کنش، پیامد، کپسول دارای منشأ، پذیرش و در نهایت بقا می‌رسد. برای هر یال، شناسه و اثرانگشت قبل و بعد ذخیره می‌شود تا عبور یک پیام با عوض شدن رفتار اشتباه گرفته نشود. شمارهٔ نسخه از پروندهٔ پیکربندی پروژه خوانده می‌شود و داخل بستهٔ شواهد ثابت نوشته نمی‌شود.</w:t>
       </w:r>
     </w:p>
     <w:p>
@@ -312,7 +326,7 @@
           <w:rtl w:val="1"/>
           <w:lang w:val="en-US" w:bidi="fa-IR" w:eastAsia="fa-IR"/>
         </w:rPr>
-        <w:t>موتور نمی‌داند آزمایش پزشکی است یا زندگی مصنوعی یا سخت‌افزار. آداپتور بسته را می‌سازد و DomainProfile فقط نام حوزه را دارد. حوزهٔ تازه پروفایل تازه است، نه موتور دوم. شکل ۱ همین جدایی را نشان می‌دهد [14]. پروفایل hardware و پورت ESP32 پیاده شده‌اند؛ در این مقاله آزمونی برای آن‌ها گزارش نمی‌شود.</w:t>
+        <w:t>موتور نمی‌داند آزمایش مربوط به پزشکی است یا زندگی مصنوعی یا سخت‌افزار. این برچسب از بیرون می‌آید. آداپتور بستهٔ شواهد را می‌سازد و DomainProfile فقط نام حوزه را با خود دارد. حوزهٔ تازه یعنی پروفایل تازه، نه موتور دوم. شکل ۱ همین جدایی را نشان می‌دهد. موتور گام زمان، اثرانگشت و بازپخش را انجام می‌دهد و حسابرس فقط بسته را می‌بیند [14]. پروفایل hardware و پورت ESP32 هم از همین درگاه می‌آیند و موتور دوم نمی‌سازند.</w:t>
       </w:r>
     </w:p>
     <w:p>
@@ -324,7 +338,7 @@
       <w:r>
         <w:drawing>
           <wp:inline xmlns:a="http://schemas.openxmlformats.org/drawingml/2006/main" xmlns:pic="http://schemas.openxmlformats.org/drawingml/2006/picture">
-            <wp:extent cx="2916000" cy="815022"/>
+            <wp:extent cx="2916000" cy="1044900"/>
             <wp:docPr id="1" name="Picture 1"/>
             <wp:cNvGraphicFramePr>
               <a:graphicFrameLocks noChangeAspect="1"/>
@@ -345,7 +359,7 @@
                   <pic:spPr>
                     <a:xfrm>
                       <a:off x="0" y="0"/>
-                      <a:ext cx="2916000" cy="815022"/>
+                      <a:ext cx="2916000" cy="1044900"/>
                     </a:xfrm>
                     <a:prstGeom prst="rect"/>
                   </pic:spPr>
@@ -375,117 +389,6 @@
     </w:p>
     <w:p>
       <w:pPr>
-        <w:jc w:val="both"/>
-        <w:bidi w:val="1"/>
-      </w:pPr>
-      <w:r>
-        <w:rPr>
-          <w:rFonts w:ascii="Times New Roman" w:hAnsi="Times New Roman" w:cs="B Nazanin" w:eastAsia="B Nazanin"/>
-          <w:sz w:val="20"/>
-          <w:rtl w:val="1"/>
-          <w:lang w:val="en-US" w:bidi="fa-IR" w:eastAsia="fa-IR"/>
-        </w:rPr>
-        <w:t>حسابرسی پنج مرحله دارد: ساخت بسته، نگاشت نقش بازو، سنجش اثرانگشت، خواندن بازپخش و بازه، و برگرداندن بالاترین سطح کامل.</w:t>
-      </w:r>
-    </w:p>
-    <w:p>
-      <w:pPr>
-        <w:pStyle w:val="Heading2"/>
-        <w:jc w:val="right"/>
-        <w:bidi w:val="1"/>
-      </w:pPr>
-      <w:r>
-        <w:rPr>
-          <w:rFonts w:ascii="Times New Roman" w:hAnsi="Times New Roman" w:cs="B Nazanin" w:eastAsia="B Nazanin"/>
-          <w:b/>
-          <w:sz w:val="20"/>
-          <w:rtl w:val="1"/>
-          <w:lang w:val="en-US" w:bidi="fa-IR" w:eastAsia="fa-IR"/>
-        </w:rPr>
-        <w:t xml:space="preserve">حسابرس و نردبان شواهد</w:t>
-      </w:r>
-    </w:p>
-    <w:p>
-      <w:pPr>
-        <w:jc w:val="both"/>
-        <w:bidi w:val="1"/>
-      </w:pPr>
-      <w:r>
-        <w:rPr>
-          <w:rFonts w:ascii="Times New Roman" w:hAnsi="Times New Roman" w:cs="B Nazanin" w:eastAsia="B Nazanin"/>
-          <w:sz w:val="20"/>
-          <w:rtl w:val="1"/>
-          <w:lang w:val="en-US" w:bidi="fa-IR" w:eastAsia="fa-IR"/>
-        </w:rPr>
-        <w:t>حسابرس شش سطح دارد و از موتور جداست. سطح ۳ مداخله یا حذف یال، کنترل منفی و بازپخش می‌خواهد. سطح ۴ بازه و حداقل شانزده بذر را هم می‌خواهد. سطح ۵ آرشیو و محدودیت نوشته‌شده را می‌افزاید. این آستانه‌ها مربوط به همین پیاده‌سازی است. آزمون وقتی بی‌اعتبار است که خود مداخله اعمال نشده باشد.</w:t>
-      </w:r>
-    </w:p>
-    <w:p>
-      <w:pPr>
-        <w:pStyle w:val="Heading2"/>
-        <w:jc w:val="right"/>
-        <w:bidi w:val="1"/>
-      </w:pPr>
-      <w:r>
-        <w:rPr>
-          <w:rFonts w:ascii="Times New Roman" w:hAnsi="Times New Roman" w:cs="B Nazanin" w:eastAsia="B Nazanin"/>
-          <w:b/>
-          <w:sz w:val="20"/>
-          <w:rtl w:val="1"/>
-          <w:lang w:val="en-US" w:bidi="fa-IR" w:eastAsia="fa-IR"/>
-        </w:rPr>
-        <w:t xml:space="preserve">آداپتورها</w:t>
-      </w:r>
-    </w:p>
-    <w:p>
-      <w:pPr>
-        <w:jc w:val="both"/>
-        <w:bidi w:val="1"/>
-      </w:pPr>
-      <w:r>
-        <w:rPr>
-          <w:rFonts w:ascii="Times New Roman" w:hAnsi="Times New Roman" w:cs="B Nazanin" w:eastAsia="B Nazanin"/>
-          <w:sz w:val="20"/>
-          <w:rtl w:val="1"/>
-          <w:lang w:val="en-US" w:bidi="fa-IR" w:eastAsia="fa-IR"/>
-        </w:rPr>
-        <w:t>آداپتور HE01 فایل JSON را می‌خواند و بایت پرونده را عوض نمی‌کند. Avida و CSV مربوط به MABE2 از همین مسیر می‌آیند. آداپتور زیست‌پزشکی جدول امتیاز را با زمینه و ریسک مدل پر می‌کند. اتصال سخت‌افزاری اختیاری است. هش متن بعد از یکسان‌سازی سطر ساخته می‌شود و هش دودویی با Path.read_bytes() است. آزمون پیش‌فرض جایگشت علامت با Holm و بازهٔ BCa است. بوت‌استرپ studentized برای n≤۴۰ اختیاری است.</w:t>
-      </w:r>
-    </w:p>
-    <w:p>
-      <w:pPr>
-        <w:pStyle w:val="Heading1"/>
-        <w:jc w:val="right"/>
-        <w:bidi w:val="1"/>
-      </w:pPr>
-      <w:r>
-        <w:rPr>
-          <w:rFonts w:ascii="Times New Roman" w:hAnsi="Times New Roman" w:cs="B Nazanin" w:eastAsia="B Nazanin"/>
-          <w:b/>
-          <w:sz w:val="22"/>
-          <w:rtl w:val="1"/>
-          <w:lang w:val="en-US" w:bidi="fa-IR" w:eastAsia="fa-IR"/>
-        </w:rPr>
-        <w:t xml:space="preserve">پروفایل زیست‌پزشکی</w:t>
-      </w:r>
-    </w:p>
-    <w:p>
-      <w:pPr>
-        <w:jc w:val="both"/>
-        <w:bidi w:val="1"/>
-      </w:pPr>
-      <w:r>
-        <w:rPr>
-          <w:rFonts w:ascii="Times New Roman" w:hAnsi="Times New Roman" w:cs="B Nazanin" w:eastAsia="B Nazanin"/>
-          <w:sz w:val="20"/>
-          <w:rtl w:val="1"/>
-          <w:lang w:val="en-US" w:bidi="fa-IR" w:eastAsia="fa-IR"/>
-        </w:rPr>
-        <w:t>حوزه از DomainProfile می‌آید: alife، biomedical و hardware [15]. simd_declared عبارت IMDRF را یادداشت می‌کند و محصول را رده‌بندی نمی‌کند. اگر مدل فیزیک‌محور اعلام نشده باشد، نسبت به راهنمای ۲۰۲۳ خارج از دامنه است. asme_vv40_passed، fda_cleared، clinical_validated و iec_62304_certified در پیکربندی قبول نمی‌شوند.</w:t>
-      </w:r>
-    </w:p>
-    <w:p>
-      <w:pPr>
         <w:pStyle w:val="TableTitle"/>
         <w:jc w:val="center"/>
         <w:bidi w:val="1"/>
@@ -499,7 +402,7 @@
           <w:rtl w:val="1"/>
           <w:lang w:val="en-US" w:bidi="fa-IR" w:eastAsia="fa-IR"/>
         </w:rPr>
-        <w:t>جدول ۱: نگاشت واژگان تنظیم‌گری به برچسب‌های اعلامی</w:t>
+        <w:t xml:space="preserve">جدول ۱: پورت‌ها؛ حوزه در آداپتور است نه در موتور</w:t>
       </w:r>
     </w:p>
     <w:tbl>
@@ -517,9 +420,940 @@
         <w:gridCol w:w="3364"/>
       </w:tblGrid>
       <w:tr>
+        <w:trPr>
+          <w:cantSplit/>
+        </w:trPr>
         <w:tc>
           <w:tcPr>
             <w:tcW w:type="dxa" w:w="3364"/>
+            <w:shd w:fill="1A365D" w:val="clear"/>
+            <w:tcBorders>
+              <w:top w:val="single" w:sz="4" w:color="4A4A4A"/>
+              <w:left w:val="single" w:sz="4" w:color="4A4A4A"/>
+              <w:bottom w:val="single" w:sz="4" w:color="4A4A4A"/>
+              <w:right w:val="single" w:sz="4" w:color="4A4A4A"/>
+            </w:tcBorders>
+            <w:vAlign w:val="center"/>
+          </w:tcPr>
+          <w:p>
+            <w:pPr>
+              <w:jc w:val="center"/>
+              <w:bidi w:val="1"/>
+            </w:pPr>
+            <w:r/>
+            <w:r>
+              <w:rPr>
+                <w:rFonts w:ascii="Times New Roman" w:hAnsi="Times New Roman" w:cs="B Nazanin" w:eastAsia="B Nazanin"/>
+                <w:b/>
+                <w:color w:val="FFFFFF"/>
+                <w:sz w:val="15"/>
+                <w:rtl w:val="1"/>
+                <w:lang w:val="en-US" w:bidi="fa-IR" w:eastAsia="fa-IR"/>
+              </w:rPr>
+              <w:t>پورت</w:t>
+            </w:r>
+          </w:p>
+        </w:tc>
+        <w:tc>
+          <w:tcPr>
+            <w:tcW w:type="dxa" w:w="3364"/>
+            <w:shd w:fill="1A365D" w:val="clear"/>
+            <w:tcBorders>
+              <w:top w:val="single" w:sz="4" w:color="4A4A4A"/>
+              <w:left w:val="single" w:sz="4" w:color="4A4A4A"/>
+              <w:bottom w:val="single" w:sz="4" w:color="4A4A4A"/>
+              <w:right w:val="single" w:sz="4" w:color="4A4A4A"/>
+            </w:tcBorders>
+            <w:vAlign w:val="center"/>
+          </w:tcPr>
+          <w:p>
+            <w:pPr>
+              <w:jc w:val="center"/>
+              <w:bidi w:val="1"/>
+            </w:pPr>
+            <w:r/>
+            <w:r>
+              <w:rPr>
+                <w:rFonts w:ascii="Times New Roman" w:hAnsi="Times New Roman" w:cs="B Nazanin" w:eastAsia="B Nazanin"/>
+                <w:b/>
+                <w:color w:val="FFFFFF"/>
+                <w:sz w:val="15"/>
+                <w:rtl w:val="1"/>
+                <w:lang w:val="en-US" w:bidi="fa-IR" w:eastAsia="fa-IR"/>
+              </w:rPr>
+              <w:t>ماژول</w:t>
+            </w:r>
+          </w:p>
+        </w:tc>
+        <w:tc>
+          <w:tcPr>
+            <w:tcW w:type="dxa" w:w="3364"/>
+            <w:shd w:fill="1A365D" w:val="clear"/>
+            <w:tcBorders>
+              <w:top w:val="single" w:sz="4" w:color="4A4A4A"/>
+              <w:left w:val="single" w:sz="4" w:color="4A4A4A"/>
+              <w:bottom w:val="single" w:sz="4" w:color="4A4A4A"/>
+              <w:right w:val="single" w:sz="4" w:color="4A4A4A"/>
+            </w:tcBorders>
+            <w:vAlign w:val="center"/>
+          </w:tcPr>
+          <w:p>
+            <w:pPr>
+              <w:jc w:val="center"/>
+              <w:bidi w:val="1"/>
+            </w:pPr>
+            <w:r/>
+            <w:r>
+              <w:rPr>
+                <w:rFonts w:ascii="Times New Roman" w:hAnsi="Times New Roman" w:cs="B Nazanin" w:eastAsia="B Nazanin"/>
+                <w:b/>
+                <w:color w:val="FFFFFF"/>
+                <w:sz w:val="15"/>
+                <w:rtl w:val="1"/>
+                <w:lang w:val="en-US" w:bidi="fa-IR" w:eastAsia="fa-IR"/>
+              </w:rPr>
+              <w:t>نقش موتور</w:t>
+            </w:r>
+          </w:p>
+        </w:tc>
+      </w:tr>
+      <w:tr>
+        <w:trPr>
+          <w:cantSplit/>
+        </w:trPr>
+        <w:tc>
+          <w:tcPr>
+            <w:tcW w:type="dxa" w:w="3364"/>
+            <w:shd w:fill="F7F7F7" w:val="clear"/>
+            <w:tcBorders>
+              <w:top w:val="single" w:sz="4" w:color="4A4A4A"/>
+              <w:left w:val="single" w:sz="4" w:color="4A4A4A"/>
+              <w:bottom w:val="single" w:sz="4" w:color="4A4A4A"/>
+              <w:right w:val="single" w:sz="4" w:color="4A4A4A"/>
+            </w:tcBorders>
+            <w:vAlign w:val="center"/>
+          </w:tcPr>
+          <w:p>
+            <w:pPr>
+              <w:jc w:val="center"/>
+              <w:bidi w:val="1"/>
+            </w:pPr>
+            <w:r/>
+            <w:r>
+              <w:rPr>
+                <w:rFonts w:ascii="Times New Roman" w:hAnsi="Times New Roman" w:cs="B Nazanin" w:eastAsia="B Nazanin"/>
+                <w:b w:val="0"/>
+                <w:sz w:val="15"/>
+                <w:rtl w:val="1"/>
+                <w:lang w:val="en-US" w:bidi="fa-IR" w:eastAsia="fa-IR"/>
+              </w:rPr>
+              <w:t>کمپین بومی HE01</w:t>
+            </w:r>
+          </w:p>
+        </w:tc>
+        <w:tc>
+          <w:tcPr>
+            <w:tcW w:type="dxa" w:w="3364"/>
+            <w:shd w:fill="F7F7F7" w:val="clear"/>
+            <w:tcBorders>
+              <w:top w:val="single" w:sz="4" w:color="4A4A4A"/>
+              <w:left w:val="single" w:sz="4" w:color="4A4A4A"/>
+              <w:bottom w:val="single" w:sz="4" w:color="4A4A4A"/>
+              <w:right w:val="single" w:sz="4" w:color="4A4A4A"/>
+            </w:tcBorders>
+            <w:vAlign w:val="center"/>
+          </w:tcPr>
+          <w:p>
+            <w:pPr>
+              <w:jc w:val="center"/>
+              <w:bidi w:val="1"/>
+            </w:pPr>
+            <w:r/>
+            <w:r>
+              <w:rPr>
+                <w:rFonts w:ascii="Times New Roman" w:hAnsi="Times New Roman" w:cs="B Nazanin" w:eastAsia="B Nazanin"/>
+                <w:b w:val="0"/>
+                <w:sz w:val="15"/>
+                <w:rtl w:val="1"/>
+                <w:lang w:val="en-US" w:bidi="fa-IR" w:eastAsia="fa-IR"/>
+              </w:rPr>
+              <w:t>adapters.codontrace</w:t>
+            </w:r>
+          </w:p>
+        </w:tc>
+        <w:tc>
+          <w:tcPr>
+            <w:tcW w:type="dxa" w:w="3364"/>
+            <w:shd w:fill="F7F7F7" w:val="clear"/>
+            <w:tcBorders>
+              <w:top w:val="single" w:sz="4" w:color="4A4A4A"/>
+              <w:left w:val="single" w:sz="4" w:color="4A4A4A"/>
+              <w:bottom w:val="single" w:sz="4" w:color="4A4A4A"/>
+              <w:right w:val="single" w:sz="4" w:color="4A4A4A"/>
+            </w:tcBorders>
+            <w:vAlign w:val="center"/>
+          </w:tcPr>
+          <w:p>
+            <w:pPr>
+              <w:jc w:val="center"/>
+              <w:bidi w:val="1"/>
+            </w:pPr>
+            <w:r>
+              <w:t>خواندن مصنوع</w:t>
+            </w:r>
+            <w:r>
+              <w:rPr>
+                <w:rFonts w:ascii="Times New Roman" w:hAnsi="Times New Roman" w:cs="B Nazanin" w:eastAsia="B Nazanin"/>
+                <w:b w:val="0"/>
+                <w:sz w:val="15"/>
+                <w:rtl w:val="1"/>
+                <w:lang w:val="en-US" w:bidi="fa-IR" w:eastAsia="fa-IR"/>
+              </w:rPr>
+            </w:r>
+          </w:p>
+        </w:tc>
+      </w:tr>
+      <w:tr>
+        <w:trPr>
+          <w:cantSplit/>
+        </w:trPr>
+        <w:tc>
+          <w:tcPr>
+            <w:tcW w:type="dxa" w:w="3364"/>
+            <w:shd w:fill="F7F7F7" w:val="clear"/>
+            <w:tcBorders>
+              <w:top w:val="single" w:sz="4" w:color="4A4A4A"/>
+              <w:left w:val="single" w:sz="4" w:color="4A4A4A"/>
+              <w:bottom w:val="single" w:sz="4" w:color="4A4A4A"/>
+              <w:right w:val="single" w:sz="4" w:color="4A4A4A"/>
+            </w:tcBorders>
+            <w:vAlign w:val="center"/>
+          </w:tcPr>
+          <w:p>
+            <w:pPr>
+              <w:jc w:val="center"/>
+              <w:bidi w:val="1"/>
+            </w:pPr>
+            <w:r/>
+            <w:r>
+              <w:rPr>
+                <w:rFonts w:ascii="Times New Roman" w:hAnsi="Times New Roman" w:cs="B Nazanin" w:eastAsia="B Nazanin"/>
+                <w:b w:val="0"/>
+                <w:sz w:val="15"/>
+                <w:rtl w:val="1"/>
+                <w:lang w:val="en-US" w:bidi="fa-IR" w:eastAsia="fa-IR"/>
+              </w:rPr>
+              <w:t>کمپین HE02 / HE03</w:t>
+            </w:r>
+          </w:p>
+        </w:tc>
+        <w:tc>
+          <w:tcPr>
+            <w:tcW w:type="dxa" w:w="3364"/>
+            <w:shd w:fill="F7F7F7" w:val="clear"/>
+            <w:tcBorders>
+              <w:top w:val="single" w:sz="4" w:color="4A4A4A"/>
+              <w:left w:val="single" w:sz="4" w:color="4A4A4A"/>
+              <w:bottom w:val="single" w:sz="4" w:color="4A4A4A"/>
+              <w:right w:val="single" w:sz="4" w:color="4A4A4A"/>
+            </w:tcBorders>
+            <w:vAlign w:val="center"/>
+          </w:tcPr>
+          <w:p>
+            <w:pPr>
+              <w:jc w:val="center"/>
+              <w:bidi w:val="1"/>
+            </w:pPr>
+            <w:r/>
+            <w:r>
+              <w:rPr>
+                <w:rFonts w:ascii="Times New Roman" w:hAnsi="Times New Roman" w:cs="B Nazanin" w:eastAsia="B Nazanin"/>
+                <w:b w:val="0"/>
+                <w:sz w:val="15"/>
+                <w:rtl w:val="1"/>
+                <w:lang w:val="en-US" w:bidi="fa-IR" w:eastAsia="fa-IR"/>
+              </w:rPr>
+              <w:t>he02/he03</w:t>
+            </w:r>
+          </w:p>
+        </w:tc>
+        <w:tc>
+          <w:tcPr>
+            <w:tcW w:type="dxa" w:w="3364"/>
+            <w:shd w:fill="F7F7F7" w:val="clear"/>
+            <w:tcBorders>
+              <w:top w:val="single" w:sz="4" w:color="4A4A4A"/>
+              <w:left w:val="single" w:sz="4" w:color="4A4A4A"/>
+              <w:bottom w:val="single" w:sz="4" w:color="4A4A4A"/>
+              <w:right w:val="single" w:sz="4" w:color="4A4A4A"/>
+            </w:tcBorders>
+            <w:vAlign w:val="center"/>
+          </w:tcPr>
+          <w:p>
+            <w:pPr>
+              <w:jc w:val="center"/>
+              <w:bidi w:val="1"/>
+            </w:pPr>
+            <w:r/>
+            <w:r>
+              <w:rPr>
+                <w:rFonts w:ascii="Times New Roman" w:hAnsi="Times New Roman" w:cs="B Nazanin" w:eastAsia="B Nazanin"/>
+                <w:b w:val="0"/>
+                <w:sz w:val="15"/>
+                <w:rtl w:val="1"/>
+                <w:lang w:val="en-US" w:bidi="fa-IR" w:eastAsia="fa-IR"/>
+              </w:rPr>
+              <w:t>خواندن مصنوع</w:t>
+            </w:r>
+          </w:p>
+        </w:tc>
+      </w:tr>
+      <w:tr>
+        <w:trPr>
+          <w:cantSplit/>
+        </w:trPr>
+        <w:tc>
+          <w:tcPr>
+            <w:tcW w:type="dxa" w:w="3364"/>
+            <w:shd w:fill="F7F7F7" w:val="clear"/>
+            <w:tcBorders>
+              <w:top w:val="single" w:sz="4" w:color="4A4A4A"/>
+              <w:left w:val="single" w:sz="4" w:color="4A4A4A"/>
+              <w:bottom w:val="single" w:sz="4" w:color="4A4A4A"/>
+              <w:right w:val="single" w:sz="4" w:color="4A4A4A"/>
+            </w:tcBorders>
+            <w:vAlign w:val="center"/>
+          </w:tcPr>
+          <w:p>
+            <w:pPr>
+              <w:jc w:val="center"/>
+              <w:bidi w:val="1"/>
+            </w:pPr>
+            <w:r/>
+            <w:r>
+              <w:rPr>
+                <w:rFonts w:ascii="Times New Roman" w:hAnsi="Times New Roman" w:cs="B Nazanin" w:eastAsia="B Nazanin"/>
+                <w:b w:val="0"/>
+                <w:sz w:val="15"/>
+                <w:rtl w:val="1"/>
+                <w:lang w:val="en-US" w:bidi="fa-IR" w:eastAsia="fa-IR"/>
+              </w:rPr>
+              <w:t>Avida (.dat)</w:t>
+            </w:r>
+          </w:p>
+        </w:tc>
+        <w:tc>
+          <w:tcPr>
+            <w:tcW w:type="dxa" w:w="3364"/>
+            <w:shd w:fill="F7F7F7" w:val="clear"/>
+            <w:tcBorders>
+              <w:top w:val="single" w:sz="4" w:color="4A4A4A"/>
+              <w:left w:val="single" w:sz="4" w:color="4A4A4A"/>
+              <w:bottom w:val="single" w:sz="4" w:color="4A4A4A"/>
+              <w:right w:val="single" w:sz="4" w:color="4A4A4A"/>
+            </w:tcBorders>
+            <w:vAlign w:val="center"/>
+          </w:tcPr>
+          <w:p>
+            <w:pPr>
+              <w:jc w:val="center"/>
+              <w:bidi w:val="1"/>
+            </w:pPr>
+            <w:r/>
+            <w:r>
+              <w:rPr>
+                <w:rFonts w:ascii="Times New Roman" w:hAnsi="Times New Roman" w:cs="B Nazanin" w:eastAsia="B Nazanin"/>
+                <w:b w:val="0"/>
+                <w:sz w:val="15"/>
+                <w:rtl w:val="1"/>
+                <w:lang w:val="en-US" w:bidi="fa-IR" w:eastAsia="fa-IR"/>
+              </w:rPr>
+              <w:t>adapters.avida</w:t>
+            </w:r>
+          </w:p>
+        </w:tc>
+        <w:tc>
+          <w:tcPr>
+            <w:tcW w:type="dxa" w:w="3364"/>
+            <w:shd w:fill="F7F7F7" w:val="clear"/>
+            <w:tcBorders>
+              <w:top w:val="single" w:sz="4" w:color="4A4A4A"/>
+              <w:left w:val="single" w:sz="4" w:color="4A4A4A"/>
+              <w:bottom w:val="single" w:sz="4" w:color="4A4A4A"/>
+              <w:right w:val="single" w:sz="4" w:color="4A4A4A"/>
+            </w:tcBorders>
+            <w:vAlign w:val="center"/>
+          </w:tcPr>
+          <w:p>
+            <w:pPr>
+              <w:jc w:val="center"/>
+              <w:bidi w:val="1"/>
+            </w:pPr>
+            <w:r/>
+            <w:r>
+              <w:rPr>
+                <w:rFonts w:ascii="Times New Roman" w:hAnsi="Times New Roman" w:cs="B Nazanin" w:eastAsia="B Nazanin"/>
+                <w:b w:val="0"/>
+                <w:sz w:val="15"/>
+                <w:rtl w:val="1"/>
+                <w:lang w:val="en-US" w:bidi="fa-IR" w:eastAsia="fa-IR"/>
+              </w:rPr>
+              <w:t>اسکلت</w:t>
+            </w:r>
+          </w:p>
+        </w:tc>
+      </w:tr>
+      <w:tr>
+        <w:trPr>
+          <w:cantSplit/>
+        </w:trPr>
+        <w:tc>
+          <w:tcPr>
+            <w:tcW w:type="dxa" w:w="3364"/>
+            <w:shd w:fill="F7F7F7" w:val="clear"/>
+            <w:tcBorders>
+              <w:top w:val="single" w:sz="4" w:color="4A4A4A"/>
+              <w:left w:val="single" w:sz="4" w:color="4A4A4A"/>
+              <w:bottom w:val="single" w:sz="4" w:color="4A4A4A"/>
+              <w:right w:val="single" w:sz="4" w:color="4A4A4A"/>
+            </w:tcBorders>
+            <w:vAlign w:val="center"/>
+          </w:tcPr>
+          <w:p>
+            <w:pPr>
+              <w:jc w:val="center"/>
+              <w:bidi w:val="1"/>
+            </w:pPr>
+            <w:r/>
+            <w:r>
+              <w:rPr>
+                <w:rFonts w:ascii="Times New Roman" w:hAnsi="Times New Roman" w:cs="B Nazanin" w:eastAsia="B Nazanin"/>
+                <w:b w:val="0"/>
+                <w:sz w:val="15"/>
+                <w:rtl w:val="1"/>
+                <w:lang w:val="en-US" w:bidi="fa-IR" w:eastAsia="fa-IR"/>
+              </w:rPr>
+              <w:t>MABE2 (CSV)</w:t>
+            </w:r>
+          </w:p>
+        </w:tc>
+        <w:tc>
+          <w:tcPr>
+            <w:tcW w:type="dxa" w:w="3364"/>
+            <w:shd w:fill="F7F7F7" w:val="clear"/>
+            <w:tcBorders>
+              <w:top w:val="single" w:sz="4" w:color="4A4A4A"/>
+              <w:left w:val="single" w:sz="4" w:color="4A4A4A"/>
+              <w:bottom w:val="single" w:sz="4" w:color="4A4A4A"/>
+              <w:right w:val="single" w:sz="4" w:color="4A4A4A"/>
+            </w:tcBorders>
+            <w:vAlign w:val="center"/>
+          </w:tcPr>
+          <w:p>
+            <w:pPr>
+              <w:jc w:val="center"/>
+              <w:bidi w:val="1"/>
+            </w:pPr>
+            <w:r/>
+            <w:r>
+              <w:rPr>
+                <w:rFonts w:ascii="Times New Roman" w:hAnsi="Times New Roman" w:cs="B Nazanin" w:eastAsia="B Nazanin"/>
+                <w:b w:val="0"/>
+                <w:sz w:val="15"/>
+                <w:rtl w:val="1"/>
+                <w:lang w:val="en-US" w:bidi="fa-IR" w:eastAsia="fa-IR"/>
+              </w:rPr>
+              <w:t>adapters.mabe2</w:t>
+            </w:r>
+          </w:p>
+        </w:tc>
+        <w:tc>
+          <w:tcPr>
+            <w:tcW w:type="dxa" w:w="3364"/>
+            <w:shd w:fill="F7F7F7" w:val="clear"/>
+            <w:tcBorders>
+              <w:top w:val="single" w:sz="4" w:color="4A4A4A"/>
+              <w:left w:val="single" w:sz="4" w:color="4A4A4A"/>
+              <w:bottom w:val="single" w:sz="4" w:color="4A4A4A"/>
+              <w:right w:val="single" w:sz="4" w:color="4A4A4A"/>
+            </w:tcBorders>
+            <w:vAlign w:val="center"/>
+          </w:tcPr>
+          <w:p>
+            <w:pPr>
+              <w:jc w:val="center"/>
+              <w:bidi w:val="1"/>
+            </w:pPr>
+            <w:r/>
+            <w:r>
+              <w:rPr>
+                <w:rFonts w:ascii="Times New Roman" w:hAnsi="Times New Roman" w:cs="B Nazanin" w:eastAsia="B Nazanin"/>
+                <w:b w:val="0"/>
+                <w:sz w:val="15"/>
+                <w:rtl w:val="1"/>
+                <w:lang w:val="en-US" w:bidi="fa-IR" w:eastAsia="fa-IR"/>
+              </w:rPr>
+              <w:t>اسکلت</w:t>
+            </w:r>
+          </w:p>
+        </w:tc>
+      </w:tr>
+      <w:tr>
+        <w:trPr>
+          <w:cantSplit/>
+        </w:trPr>
+        <w:tc>
+          <w:tcPr>
+            <w:tcW w:type="dxa" w:w="3364"/>
+            <w:shd w:fill="F7F7F7" w:val="clear"/>
+            <w:tcBorders>
+              <w:top w:val="single" w:sz="4" w:color="4A4A4A"/>
+              <w:left w:val="single" w:sz="4" w:color="4A4A4A"/>
+              <w:bottom w:val="single" w:sz="4" w:color="4A4A4A"/>
+              <w:right w:val="single" w:sz="4" w:color="4A4A4A"/>
+            </w:tcBorders>
+            <w:vAlign w:val="center"/>
+          </w:tcPr>
+          <w:p>
+            <w:pPr>
+              <w:jc w:val="center"/>
+              <w:bidi w:val="1"/>
+            </w:pPr>
+            <w:r/>
+            <w:r>
+              <w:rPr>
+                <w:rFonts w:ascii="Times New Roman" w:hAnsi="Times New Roman" w:cs="B Nazanin" w:eastAsia="B Nazanin"/>
+                <w:b w:val="0"/>
+                <w:sz w:val="15"/>
+                <w:rtl w:val="1"/>
+                <w:lang w:val="en-US" w:bidi="fa-IR" w:eastAsia="fa-IR"/>
+              </w:rPr>
+              <w:t>جدول امتیاز اعلامی</w:t>
+            </w:r>
+          </w:p>
+        </w:tc>
+        <w:tc>
+          <w:tcPr>
+            <w:tcW w:type="dxa" w:w="3364"/>
+            <w:shd w:fill="F7F7F7" w:val="clear"/>
+            <w:tcBorders>
+              <w:top w:val="single" w:sz="4" w:color="4A4A4A"/>
+              <w:left w:val="single" w:sz="4" w:color="4A4A4A"/>
+              <w:bottom w:val="single" w:sz="4" w:color="4A4A4A"/>
+              <w:right w:val="single" w:sz="4" w:color="4A4A4A"/>
+            </w:tcBorders>
+            <w:vAlign w:val="center"/>
+          </w:tcPr>
+          <w:p>
+            <w:pPr>
+              <w:jc w:val="center"/>
+              <w:bidi w:val="1"/>
+            </w:pPr>
+            <w:r/>
+            <w:r>
+              <w:rPr>
+                <w:rFonts w:ascii="Times New Roman" w:hAnsi="Times New Roman" w:cs="B Nazanin" w:eastAsia="B Nazanin"/>
+                <w:b w:val="0"/>
+                <w:sz w:val="15"/>
+                <w:rtl w:val="1"/>
+                <w:lang w:val="en-US" w:bidi="fa-IR" w:eastAsia="fa-IR"/>
+              </w:rPr>
+              <w:t>claimgate.domain</w:t>
+            </w:r>
+          </w:p>
+        </w:tc>
+        <w:tc>
+          <w:tcPr>
+            <w:tcW w:type="dxa" w:w="3364"/>
+            <w:shd w:fill="F7F7F7" w:val="clear"/>
+            <w:tcBorders>
+              <w:top w:val="single" w:sz="4" w:color="4A4A4A"/>
+              <w:left w:val="single" w:sz="4" w:color="4A4A4A"/>
+              <w:bottom w:val="single" w:sz="4" w:color="4A4A4A"/>
+              <w:right w:val="single" w:sz="4" w:color="4A4A4A"/>
+            </w:tcBorders>
+            <w:vAlign w:val="center"/>
+          </w:tcPr>
+          <w:p>
+            <w:pPr>
+              <w:jc w:val="center"/>
+              <w:bidi w:val="1"/>
+            </w:pPr>
+            <w:r/>
+            <w:r>
+              <w:rPr>
+                <w:rFonts w:ascii="Times New Roman" w:hAnsi="Times New Roman" w:cs="B Nazanin" w:eastAsia="B Nazanin"/>
+                <w:b w:val="0"/>
+                <w:sz w:val="15"/>
+                <w:rtl w:val="1"/>
+                <w:lang w:val="en-US" w:bidi="fa-IR" w:eastAsia="fa-IR"/>
+              </w:rPr>
+              <w:t>بدون موتور</w:t>
+            </w:r>
+          </w:p>
+        </w:tc>
+      </w:tr>
+      <w:tr>
+        <w:trPr>
+          <w:cantSplit/>
+        </w:trPr>
+        <w:tc>
+          <w:tcPr>
+            <w:tcW w:type="dxa" w:w="3364"/>
+            <w:shd w:fill="F7F7F7" w:val="clear"/>
+            <w:tcBorders>
+              <w:top w:val="single" w:sz="4" w:color="4A4A4A"/>
+              <w:left w:val="single" w:sz="4" w:color="4A4A4A"/>
+              <w:bottom w:val="single" w:sz="4" w:color="4A4A4A"/>
+              <w:right w:val="single" w:sz="4" w:color="4A4A4A"/>
+            </w:tcBorders>
+            <w:vAlign w:val="center"/>
+          </w:tcPr>
+          <w:p>
+            <w:pPr>
+              <w:jc w:val="center"/>
+              <w:bidi w:val="1"/>
+            </w:pPr>
+            <w:r/>
+            <w:r>
+              <w:rPr>
+                <w:rFonts w:ascii="Times New Roman" w:hAnsi="Times New Roman" w:cs="B Nazanin" w:eastAsia="B Nazanin"/>
+                <w:b w:val="0"/>
+                <w:sz w:val="15"/>
+                <w:rtl w:val="1"/>
+                <w:lang w:val="en-US" w:bidi="fa-IR" w:eastAsia="fa-IR"/>
+              </w:rPr>
+              <w:t>برچسب زیست‌پزشکی</w:t>
+            </w:r>
+          </w:p>
+        </w:tc>
+        <w:tc>
+          <w:tcPr>
+            <w:tcW w:type="dxa" w:w="3364"/>
+            <w:shd w:fill="F7F7F7" w:val="clear"/>
+            <w:tcBorders>
+              <w:top w:val="single" w:sz="4" w:color="4A4A4A"/>
+              <w:left w:val="single" w:sz="4" w:color="4A4A4A"/>
+              <w:bottom w:val="single" w:sz="4" w:color="4A4A4A"/>
+              <w:right w:val="single" w:sz="4" w:color="4A4A4A"/>
+            </w:tcBorders>
+            <w:vAlign w:val="center"/>
+          </w:tcPr>
+          <w:p>
+            <w:pPr>
+              <w:jc w:val="center"/>
+              <w:bidi w:val="1"/>
+            </w:pPr>
+            <w:r/>
+            <w:r>
+              <w:rPr>
+                <w:rFonts w:ascii="Times New Roman" w:hAnsi="Times New Roman" w:cs="B Nazanin" w:eastAsia="B Nazanin"/>
+                <w:b w:val="0"/>
+                <w:sz w:val="15"/>
+                <w:rtl w:val="1"/>
+                <w:lang w:val="en-US" w:bidi="fa-IR" w:eastAsia="fa-IR"/>
+              </w:rPr>
+              <w:t>adapters.biomedical</w:t>
+            </w:r>
+          </w:p>
+        </w:tc>
+        <w:tc>
+          <w:tcPr>
+            <w:tcW w:type="dxa" w:w="3364"/>
+            <w:shd w:fill="F7F7F7" w:val="clear"/>
+            <w:tcBorders>
+              <w:top w:val="single" w:sz="4" w:color="4A4A4A"/>
+              <w:left w:val="single" w:sz="4" w:color="4A4A4A"/>
+              <w:bottom w:val="single" w:sz="4" w:color="4A4A4A"/>
+              <w:right w:val="single" w:sz="4" w:color="4A4A4A"/>
+            </w:tcBorders>
+            <w:vAlign w:val="center"/>
+          </w:tcPr>
+          <w:p>
+            <w:pPr>
+              <w:jc w:val="center"/>
+              <w:bidi w:val="1"/>
+            </w:pPr>
+            <w:r/>
+            <w:r>
+              <w:rPr>
+                <w:rFonts w:ascii="Times New Roman" w:hAnsi="Times New Roman" w:cs="B Nazanin" w:eastAsia="B Nazanin"/>
+                <w:b w:val="0"/>
+                <w:sz w:val="15"/>
+                <w:rtl w:val="1"/>
+                <w:lang w:val="en-US" w:bidi="fa-IR" w:eastAsia="fa-IR"/>
+              </w:rPr>
+              <w:t>بدون موتور</w:t>
+            </w:r>
+          </w:p>
+        </w:tc>
+      </w:tr>
+      <w:tr>
+        <w:trPr>
+          <w:cantSplit/>
+        </w:trPr>
+        <w:tc>
+          <w:tcPr>
+            <w:tcW w:type="dxa" w:w="3364"/>
+            <w:shd w:fill="F7F7F7" w:val="clear"/>
+            <w:tcBorders>
+              <w:top w:val="single" w:sz="4" w:color="4A4A4A"/>
+              <w:left w:val="single" w:sz="4" w:color="4A4A4A"/>
+              <w:bottom w:val="single" w:sz="4" w:color="4A4A4A"/>
+              <w:right w:val="single" w:sz="4" w:color="4A4A4A"/>
+            </w:tcBorders>
+            <w:vAlign w:val="center"/>
+          </w:tcPr>
+          <w:p>
+            <w:pPr>
+              <w:jc w:val="center"/>
+              <w:bidi w:val="1"/>
+            </w:pPr>
+            <w:r/>
+            <w:r>
+              <w:rPr>
+                <w:rFonts w:ascii="Times New Roman" w:hAnsi="Times New Roman" w:cs="B Nazanin" w:eastAsia="B Nazanin"/>
+                <w:b w:val="0"/>
+                <w:sz w:val="15"/>
+                <w:rtl w:val="1"/>
+                <w:lang w:val="en-US" w:bidi="fa-IR" w:eastAsia="fa-IR"/>
+              </w:rPr>
+              <w:t>پل ESP32</w:t>
+            </w:r>
+          </w:p>
+        </w:tc>
+        <w:tc>
+          <w:tcPr>
+            <w:tcW w:type="dxa" w:w="3364"/>
+            <w:shd w:fill="F7F7F7" w:val="clear"/>
+            <w:tcBorders>
+              <w:top w:val="single" w:sz="4" w:color="4A4A4A"/>
+              <w:left w:val="single" w:sz="4" w:color="4A4A4A"/>
+              <w:bottom w:val="single" w:sz="4" w:color="4A4A4A"/>
+              <w:right w:val="single" w:sz="4" w:color="4A4A4A"/>
+            </w:tcBorders>
+            <w:vAlign w:val="center"/>
+          </w:tcPr>
+          <w:p>
+            <w:pPr>
+              <w:jc w:val="center"/>
+              <w:bidi w:val="1"/>
+            </w:pPr>
+            <w:r/>
+            <w:r>
+              <w:rPr>
+                <w:rFonts w:ascii="Times New Roman" w:hAnsi="Times New Roman" w:cs="B Nazanin" w:eastAsia="B Nazanin"/>
+                <w:b w:val="0"/>
+                <w:sz w:val="15"/>
+                <w:rtl w:val="1"/>
+                <w:lang w:val="en-US" w:bidi="fa-IR" w:eastAsia="fa-IR"/>
+              </w:rPr>
+              <w:t>esp32_bridge</w:t>
+            </w:r>
+          </w:p>
+        </w:tc>
+        <w:tc>
+          <w:tcPr>
+            <w:tcW w:type="dxa" w:w="3364"/>
+            <w:shd w:fill="F7F7F7" w:val="clear"/>
+            <w:tcBorders>
+              <w:top w:val="single" w:sz="4" w:color="4A4A4A"/>
+              <w:left w:val="single" w:sz="4" w:color="4A4A4A"/>
+              <w:bottom w:val="single" w:sz="4" w:color="4A4A4A"/>
+              <w:right w:val="single" w:sz="4" w:color="4A4A4A"/>
+            </w:tcBorders>
+            <w:vAlign w:val="center"/>
+          </w:tcPr>
+          <w:p>
+            <w:pPr>
+              <w:jc w:val="center"/>
+              <w:bidi w:val="1"/>
+            </w:pPr>
+            <w:r/>
+            <w:r>
+              <w:rPr>
+                <w:rFonts w:ascii="Times New Roman" w:hAnsi="Times New Roman" w:cs="B Nazanin" w:eastAsia="B Nazanin"/>
+                <w:b w:val="0"/>
+                <w:sz w:val="15"/>
+                <w:rtl w:val="1"/>
+                <w:lang w:val="en-US" w:bidi="fa-IR" w:eastAsia="fa-IR"/>
+              </w:rPr>
+              <w:t>نمونهٔ اختیاری</w:t>
+            </w:r>
+          </w:p>
+        </w:tc>
+      </w:tr>
+    </w:tbl>
+    <w:p>
+      <w:pPr>
+        <w:jc w:val="both"/>
+        <w:bidi w:val="1"/>
+      </w:pPr>
+      <w:r>
+        <w:rPr>
+          <w:rFonts w:ascii="Times New Roman" w:hAnsi="Times New Roman" w:cs="B Nazanin" w:eastAsia="B Nazanin"/>
+          <w:sz w:val="20"/>
+          <w:rtl w:val="1"/>
+          <w:lang w:val="en-US" w:bidi="fa-IR" w:eastAsia="fa-IR"/>
+        </w:rPr>
+        <w:t>حسابرسی پنج مرحله دارد. آداپتور پرونده یا جدول را به یک بستهٔ واحد برمی‌گرداند. نقش بازوها به پنج نقش کلی نگاشت می‌شود: درمان، حذف سازوکار، خاموش کردن کانال، کنترل منفی، و دوز. اثرانگشت پیکربندی و، اگر موجود باشد، اثرانگشت پیش‌ثبت‌نامه بررسی می‌شود. سپس بازپخش، مقایسهٔ جفتی، بازهٔ اطمینان و تعداد بذر خوانده می‌شود. بالاترین سطحی برمی‌گردد که همهٔ شرط‌هایش برقرار باشد.</w:t>
+      </w:r>
+    </w:p>
+    <w:p>
+      <w:pPr>
+        <w:pStyle w:val="Heading2"/>
+        <w:jc w:val="right"/>
+        <w:bidi w:val="1"/>
+      </w:pPr>
+      <w:r>
+        <w:rPr>
+          <w:rFonts w:ascii="Times New Roman" w:hAnsi="Times New Roman" w:cs="B Nazanin" w:eastAsia="B Nazanin"/>
+          <w:b/>
+          <w:sz w:val="20"/>
+          <w:rtl w:val="1"/>
+          <w:lang w:val="en-US" w:bidi="fa-IR" w:eastAsia="fa-IR"/>
+        </w:rPr>
+        <w:t xml:space="preserve">حسابرس و نردبان شواهد</w:t>
+      </w:r>
+    </w:p>
+    <w:p>
+      <w:pPr>
+        <w:jc w:val="both"/>
+        <w:bidi w:val="1"/>
+      </w:pPr>
+      <w:r>
+        <w:rPr>
+          <w:rFonts w:ascii="Times New Roman" w:hAnsi="Times New Roman" w:cs="B Nazanin" w:eastAsia="B Nazanin"/>
+          <w:sz w:val="20"/>
+          <w:rtl w:val="1"/>
+          <w:lang w:val="en-US" w:bidi="fa-IR" w:eastAsia="fa-IR"/>
+        </w:rPr>
+        <w:t>حسابرس از موتور جداست و شش سطح دارد. سطح ۳ به مداخله یا حذف یال، کنترل منفی و بازپخش نیاز دارد. سطح ۴ بازهٔ اطمینان و حداقل شانزده بذر را هم می‌خواهد. سطح ۵ علاوه بر اینها آرشیو، محدودیت نوشته‌شده، و شواهد آماری و مداخله‌ای را با هم لازم دارد. این آستانه‌ها مربوط به همین پیاده‌سازی است. برابر بودن خروجی دو بازو، به‌خودی‌خود، نتیجه را باطل نمی‌کند. آزمون وقتی بی‌اعتبار شمرده می‌شود که خود مداخله هم اعمال نشده باشد.</w:t>
+      </w:r>
+    </w:p>
+    <w:p>
+      <w:pPr>
+        <w:pStyle w:val="Heading2"/>
+        <w:jc w:val="right"/>
+        <w:bidi w:val="1"/>
+      </w:pPr>
+      <w:r>
+        <w:rPr>
+          <w:rFonts w:ascii="Times New Roman" w:hAnsi="Times New Roman" w:cs="B Nazanin" w:eastAsia="B Nazanin"/>
+          <w:b/>
+          <w:sz w:val="20"/>
+          <w:rtl w:val="1"/>
+          <w:lang w:val="en-US" w:bidi="fa-IR" w:eastAsia="fa-IR"/>
+        </w:rPr>
+        <w:t xml:space="preserve">آداپتورها</w:t>
+      </w:r>
+    </w:p>
+    <w:p>
+      <w:pPr>
+        <w:jc w:val="both"/>
+        <w:bidi w:val="1"/>
+      </w:pPr>
+      <w:r>
+        <w:rPr>
+          <w:rFonts w:ascii="Times New Roman" w:hAnsi="Times New Roman" w:cs="B Nazanin" w:eastAsia="B Nazanin"/>
+          <w:sz w:val="20"/>
+          <w:rtl w:val="1"/>
+          <w:lang w:val="en-US" w:bidi="fa-IR" w:eastAsia="fa-IR"/>
+        </w:rPr>
+        <w:t xml:space="preserve">آداپتور HE01 فایل JSON را می‌خواند و نقش محلی را به نقش کلی برمی‌گرداند. بایت خود پرونده عوض نمی‌شود. پروندهٔ Avida و خروجی CSV مربوط به MABE2 هم از همین مسیر وارد می‌شوند. آداپتور زیست‌پزشکی جدول امتیاز را با زمینهٔ کاربرد و ریسک مدل پر می‌کند. اتصال سخت‌افزاری </w:t>
+      </w:r>
+      <w:r>
+        <w:rPr>
+          <w:rFonts w:ascii="Times New Roman" w:hAnsi="Times New Roman" w:cs="B Nazanin" w:eastAsia="B Nazanin"/>
+          <w:sz w:val="20"/>
+          <w:rtl w:val="1"/>
+          <w:lang w:val="en-US" w:bidi="fa-IR" w:eastAsia="fa-IR"/>
+          <w:b/>
+          <w:bCs/>
+        </w:rPr>
+        <w:t xml:space="preserve">اختیاری</w:t>
+      </w:r>
+      <w:r>
+        <w:rPr>
+          <w:rFonts w:ascii="Times New Roman" w:hAnsi="Times New Roman" w:cs="B Nazanin" w:eastAsia="B Nazanin"/>
+          <w:sz w:val="20"/>
+          <w:rtl w:val="1"/>
+          <w:lang w:val="en-US" w:bidi="fa-IR" w:eastAsia="fa-IR"/>
+        </w:rPr>
+        <w:t xml:space="preserve"> است. برای فایل متنی، اثرانگشت بعد از یکسان‌سازی انتهای سطر ساخته می‌شود و هش فایل دودویی با Path.read_bytes() حساب می‌شود. آزمون پیش‌فرض، جایگشت علامت جفتی با تصحیح Holm و بازهٔ BCa است. بوت‌استرپ studentized و شمارش دقیق علامت برای n≤۴۰ اختیاری‌اند تا اعداد کمپین منتشرشده جابه‌جا نشود.</w:t>
+      </w:r>
+    </w:p>
+    <w:p>
+      <w:pPr>
+        <w:pStyle w:val="Heading1"/>
+        <w:jc w:val="right"/>
+        <w:bidi w:val="1"/>
+      </w:pPr>
+      <w:r>
+        <w:rPr>
+          <w:rFonts w:ascii="Times New Roman" w:hAnsi="Times New Roman" w:cs="B Nazanin" w:eastAsia="B Nazanin"/>
+          <w:b/>
+          <w:sz w:val="22"/>
+          <w:rtl w:val="1"/>
+          <w:lang w:val="en-US" w:bidi="fa-IR" w:eastAsia="fa-IR"/>
+        </w:rPr>
+        <w:t xml:space="preserve">پروفایل زیست‌پزشکی</w:t>
+      </w:r>
+    </w:p>
+    <w:p>
+      <w:pPr>
+        <w:jc w:val="both"/>
+        <w:bidi w:val="1"/>
+      </w:pPr>
+      <w:r>
+        <w:rPr>
+          <w:rFonts w:ascii="Times New Roman" w:hAnsi="Times New Roman" w:cs="B Nazanin" w:eastAsia="B Nazanin"/>
+          <w:sz w:val="20"/>
+          <w:rtl w:val="1"/>
+          <w:lang w:val="en-US" w:bidi="fa-IR" w:eastAsia="fa-IR"/>
+        </w:rPr>
+        <w:t>حوزهٔ پزشکی از DomainProfile می‌آید. نام‌های موجود alife، biomedical و hardware هستند [15]. simd_declared و samd_declared عبارت IMDRF را روی بسته یادداشت می‌کنند و خود محصول را رده‌بندی نمی‌کنند. اگر مدل فیزیک‌محور اعلام نشده باشد، نسبت به راهنمای سال ۲۰۲۳ خارج از دامنه می‌ماند، حتی وقتی خانه‌های شواهد پر شده باشند. رشته‌هایی مانند asme_vv40_passed، fda_cleared، clinical_validated و iec_62304_certified در پیکربندی قبول نمی‌شوند. از یک جدول اعلامی مهر تأیید بیرون نمی‌آید.</w:t>
+      </w:r>
+    </w:p>
+    <w:p>
+      <w:pPr>
+        <w:pStyle w:val="TableTitle"/>
+        <w:jc w:val="center"/>
+        <w:bidi w:val="1"/>
+      </w:pPr>
+      <w:r>
+        <w:rPr>
+          <w:rFonts w:ascii="Times New Roman" w:hAnsi="Times New Roman" w:cs="B Nazanin" w:eastAsia="B Nazanin"/>
+          <w:b/>
+          <w:i/>
+          <w:sz w:val="16"/>
+          <w:rtl w:val="1"/>
+          <w:lang w:val="en-US" w:bidi="fa-IR" w:eastAsia="fa-IR"/>
+        </w:rPr>
+        <w:t xml:space="preserve">جدول ۲: نگاشت واژگان تنظیم‌گری به برچسب‌های اعلامی</w:t>
+      </w:r>
+    </w:p>
+    <w:tbl>
+      <w:tblPr>
+        <w:tblStyle w:val="TableGrid"/>
+        <w:tblW w:type="auto" w:w="0"/>
+        <w:jc w:val="center"/>
+        <w:tblLook w:firstColumn="1" w:firstRow="1" w:lastColumn="0" w:lastRow="0" w:noHBand="0" w:noVBand="1" w:val="04A0"/>
+        <w:bidiVisual w:val="1"/>
+        <w:tblW w:w="5000" w:type="pct"/>
+      </w:tblPr>
+      <w:tblGrid>
+        <w:gridCol w:w="2300"/>
+        <w:gridCol w:w="4700"/>
+        <w:gridCol w:w="3092"/>
+      </w:tblGrid>
+      <w:tr>
+        <w:trPr>
+          <w:cantSplit/>
+        </w:trPr>
+        <w:tc>
+          <w:tcPr>
+            <w:tcW w:type="dxa" w:w="2300"/>
             <w:shd w:fill="1A365D" w:val="clear"/>
             <w:tcBorders>
               <w:top w:val="single" w:sz="4" w:color="4A4A4A"/>
@@ -550,7 +1384,7 @@
         </w:tc>
         <w:tc>
           <w:tcPr>
-            <w:tcW w:type="dxa" w:w="3364"/>
+            <w:tcW w:type="dxa" w:w="4700"/>
             <w:shd w:fill="1A365D" w:val="clear"/>
             <w:tcBorders>
               <w:top w:val="single" w:sz="4" w:color="4A4A4A"/>
@@ -581,7 +1415,7 @@
         </w:tc>
         <w:tc>
           <w:tcPr>
-            <w:tcW w:type="dxa" w:w="3364"/>
+            <w:tcW w:type="dxa" w:w="3092"/>
             <w:shd w:fill="1A365D" w:val="clear"/>
             <w:tcBorders>
               <w:top w:val="single" w:sz="4" w:color="4A4A4A"/>
@@ -597,15 +1431,18 @@
               <w:bidi w:val="1"/>
             </w:pPr>
             <w:r>
-              <w:t xml:space="preserve">رفتار پورت</w:t>
+              <w:t>رفتار پورت</w:t>
             </w:r>
           </w:p>
         </w:tc>
       </w:tr>
       <w:tr>
+        <w:trPr>
+          <w:cantSplit/>
+        </w:trPr>
         <w:tc>
           <w:tcPr>
-            <w:tcW w:type="dxa" w:w="3364"/>
+            <w:tcW w:type="dxa" w:w="2300"/>
             <w:shd w:fill="F7F7F7" w:val="clear"/>
             <w:tcBorders>
               <w:top w:val="single" w:sz="4" w:color="4A4A4A"/>
@@ -629,13 +1466,13 @@
                 <w:rtl w:val="1"/>
                 <w:lang w:val="en-US" w:bidi="fa-IR" w:eastAsia="fa-IR"/>
               </w:rPr>
-              <w:t>پرسش مورد علاقه (QOI)</w:t>
+              <w:t>پرسش مورد علاقه، QOI</w:t>
             </w:r>
           </w:p>
         </w:tc>
         <w:tc>
           <w:tcPr>
-            <w:tcW w:type="dxa" w:w="3364"/>
+            <w:tcW w:type="dxa" w:w="4700"/>
             <w:shd w:fill="F7F7F7" w:val="clear"/>
             <w:tcBorders>
               <w:top w:val="single" w:sz="4" w:color="4A4A4A"/>
@@ -665,7 +1502,7 @@
         </w:tc>
         <w:tc>
           <w:tcPr>
-            <w:tcW w:type="dxa" w:w="3364"/>
+            <w:tcW w:type="dxa" w:w="3092"/>
             <w:shd w:fill="F7F7F7" w:val="clear"/>
             <w:tcBorders>
               <w:top w:val="single" w:sz="4" w:color="4A4A4A"/>
@@ -681,15 +1518,18 @@
               <w:bidi w:val="1"/>
             </w:pPr>
             <w:r>
-              <w:t xml:space="preserve">ثبت پرسش</w:t>
+              <w:t>ثبت پرسش</w:t>
             </w:r>
           </w:p>
         </w:tc>
       </w:tr>
       <w:tr>
+        <w:trPr>
+          <w:cantSplit/>
+        </w:trPr>
         <w:tc>
           <w:tcPr>
-            <w:tcW w:type="dxa" w:w="3364"/>
+            <w:tcW w:type="dxa" w:w="2300"/>
             <w:shd w:fill="F7F7F7" w:val="clear"/>
             <w:tcBorders>
               <w:top w:val="single" w:sz="4" w:color="4A4A4A"/>
@@ -713,13 +1553,13 @@
                 <w:rtl w:val="1"/>
                 <w:lang w:val="en-US" w:bidi="fa-IR" w:eastAsia="fa-IR"/>
               </w:rPr>
-              <w:t>زمینهٔ کاربرد (COU)</w:t>
+              <w:t>زمینهٔ کاربرد، COU</w:t>
             </w:r>
           </w:p>
         </w:tc>
         <w:tc>
           <w:tcPr>
-            <w:tcW w:type="dxa" w:w="3364"/>
+            <w:tcW w:type="dxa" w:w="4700"/>
             <w:shd w:fill="F7F7F7" w:val="clear"/>
             <w:tcBorders>
               <w:top w:val="single" w:sz="4" w:color="4A4A4A"/>
@@ -749,7 +1589,7 @@
         </w:tc>
         <w:tc>
           <w:tcPr>
-            <w:tcW w:type="dxa" w:w="3364"/>
+            <w:tcW w:type="dxa" w:w="3092"/>
             <w:shd w:fill="F7F7F7" w:val="clear"/>
             <w:tcBorders>
               <w:top w:val="single" w:sz="4" w:color="4A4A4A"/>
@@ -765,15 +1605,18 @@
               <w:bidi w:val="1"/>
             </w:pPr>
             <w:r>
-              <w:t xml:space="preserve">ثبت زمینهٔ کاربرد</w:t>
+              <w:t>ثبت زمینهٔ کاربرد</w:t>
             </w:r>
           </w:p>
         </w:tc>
       </w:tr>
       <w:tr>
+        <w:trPr>
+          <w:cantSplit/>
+        </w:trPr>
         <w:tc>
           <w:tcPr>
-            <w:tcW w:type="dxa" w:w="3364"/>
+            <w:tcW w:type="dxa" w:w="2300"/>
             <w:shd w:fill="F7F7F7" w:val="clear"/>
             <w:tcBorders>
               <w:top w:val="single" w:sz="4" w:color="4A4A4A"/>
@@ -803,7 +1646,7 @@
         </w:tc>
         <w:tc>
           <w:tcPr>
-            <w:tcW w:type="dxa" w:w="3364"/>
+            <w:tcW w:type="dxa" w:w="4700"/>
             <w:shd w:fill="F7F7F7" w:val="clear"/>
             <w:tcBorders>
               <w:top w:val="single" w:sz="4" w:color="4A4A4A"/>
@@ -833,7 +1676,7 @@
         </w:tc>
         <w:tc>
           <w:tcPr>
-            <w:tcW w:type="dxa" w:w="3364"/>
+            <w:tcW w:type="dxa" w:w="3092"/>
             <w:shd w:fill="F7F7F7" w:val="clear"/>
             <w:tcBorders>
               <w:top w:val="single" w:sz="4" w:color="4A4A4A"/>
@@ -849,15 +1692,18 @@
               <w:bidi w:val="1"/>
             </w:pPr>
             <w:r>
-              <w:t xml:space="preserve">برچسب ریسک تصمیم</w:t>
+              <w:t>برچسب ریسک تصمیم</w:t>
             </w:r>
           </w:p>
         </w:tc>
       </w:tr>
       <w:tr>
+        <w:trPr>
+          <w:cantSplit/>
+        </w:trPr>
         <w:tc>
           <w:tcPr>
-            <w:tcW w:type="dxa" w:w="3364"/>
+            <w:tcW w:type="dxa" w:w="2300"/>
             <w:shd w:fill="F7F7F7" w:val="clear"/>
             <w:tcBorders>
               <w:top w:val="single" w:sz="4" w:color="4A4A4A"/>
@@ -887,7 +1733,7 @@
         </w:tc>
         <w:tc>
           <w:tcPr>
-            <w:tcW w:type="dxa" w:w="3364"/>
+            <w:tcW w:type="dxa" w:w="4700"/>
             <w:shd w:fill="F7F7F7" w:val="clear"/>
             <w:tcBorders>
               <w:top w:val="single" w:sz="4" w:color="4A4A4A"/>
@@ -917,7 +1763,7 @@
         </w:tc>
         <w:tc>
           <w:tcPr>
-            <w:tcW w:type="dxa" w:w="3364"/>
+            <w:tcW w:type="dxa" w:w="3092"/>
             <w:shd w:fill="F7F7F7" w:val="clear"/>
             <w:tcBorders>
               <w:top w:val="single" w:sz="4" w:color="4A4A4A"/>
@@ -933,15 +1779,18 @@
               <w:bidi w:val="1"/>
             </w:pPr>
             <w:r>
-              <w:t xml:space="preserve">برچسب ریسک مدل</w:t>
+              <w:t>برچسب ریسک مدل</w:t>
             </w:r>
           </w:p>
         </w:tc>
       </w:tr>
       <w:tr>
+        <w:trPr>
+          <w:cantSplit/>
+        </w:trPr>
         <w:tc>
           <w:tcPr>
-            <w:tcW w:type="dxa" w:w="3364"/>
+            <w:tcW w:type="dxa" w:w="2300"/>
             <w:shd w:fill="F7F7F7" w:val="clear"/>
             <w:tcBorders>
               <w:top w:val="single" w:sz="4" w:color="4A4A4A"/>
@@ -971,7 +1820,7 @@
         </w:tc>
         <w:tc>
           <w:tcPr>
-            <w:tcW w:type="dxa" w:w="3364"/>
+            <w:tcW w:type="dxa" w:w="4700"/>
             <w:shd w:fill="F7F7F7" w:val="clear"/>
             <w:tcBorders>
               <w:top w:val="single" w:sz="4" w:color="4A4A4A"/>
@@ -1001,7 +1850,7 @@
         </w:tc>
         <w:tc>
           <w:tcPr>
-            <w:tcW w:type="dxa" w:w="3364"/>
+            <w:tcW w:type="dxa" w:w="3092"/>
             <w:shd w:fill="F7F7F7" w:val="clear"/>
             <w:tcBorders>
               <w:top w:val="single" w:sz="4" w:color="4A4A4A"/>
@@ -1017,15 +1866,18 @@
               <w:bidi w:val="1"/>
             </w:pPr>
             <w:r>
-              <w:t xml:space="preserve">برچسب دستهٔ شواهد</w:t>
+              <w:t>برچسب دستهٔ شواهد</w:t>
             </w:r>
           </w:p>
         </w:tc>
       </w:tr>
       <w:tr>
+        <w:trPr>
+          <w:cantSplit/>
+        </w:trPr>
         <w:tc>
           <w:tcPr>
-            <w:tcW w:type="dxa" w:w="3364"/>
+            <w:tcW w:type="dxa" w:w="2300"/>
             <w:shd w:fill="F7F7F7" w:val="clear"/>
             <w:tcBorders>
               <w:top w:val="single" w:sz="4" w:color="4A4A4A"/>
@@ -1055,7 +1907,7 @@
         </w:tc>
         <w:tc>
           <w:tcPr>
-            <w:tcW w:type="dxa" w:w="3364"/>
+            <w:tcW w:type="dxa" w:w="4700"/>
             <w:shd w:fill="F7F7F7" w:val="clear"/>
             <w:tcBorders>
               <w:top w:val="single" w:sz="4" w:color="4A4A4A"/>
@@ -1085,7 +1937,7 @@
         </w:tc>
         <w:tc>
           <w:tcPr>
-            <w:tcW w:type="dxa" w:w="3364"/>
+            <w:tcW w:type="dxa" w:w="3092"/>
             <w:shd w:fill="F7F7F7" w:val="clear"/>
             <w:tcBorders>
               <w:top w:val="single" w:sz="4" w:color="4A4A4A"/>
@@ -1101,15 +1953,18 @@
               <w:bidi w:val="1"/>
             </w:pPr>
             <w:r>
-              <w:t xml:space="preserve">برچسب ردهٔ نرم‌افزار</w:t>
+              <w:t>برچسب ردهٔ نرم‌افزار</w:t>
             </w:r>
           </w:p>
         </w:tc>
       </w:tr>
       <w:tr>
+        <w:trPr>
+          <w:cantSplit/>
+        </w:trPr>
         <w:tc>
           <w:tcPr>
-            <w:tcW w:type="dxa" w:w="3364"/>
+            <w:tcW w:type="dxa" w:w="2300"/>
             <w:shd w:fill="F7F7F7" w:val="clear"/>
             <w:tcBorders>
               <w:top w:val="single" w:sz="4" w:color="4A4A4A"/>
@@ -1139,7 +1994,7 @@
         </w:tc>
         <w:tc>
           <w:tcPr>
-            <w:tcW w:type="dxa" w:w="3364"/>
+            <w:tcW w:type="dxa" w:w="4700"/>
             <w:shd w:fill="F7F7F7" w:val="clear"/>
             <w:tcBorders>
               <w:top w:val="single" w:sz="4" w:color="4A4A4A"/>
@@ -1169,7 +2024,7 @@
         </w:tc>
         <w:tc>
           <w:tcPr>
-            <w:tcW w:type="dxa" w:w="3364"/>
+            <w:tcW w:type="dxa" w:w="3092"/>
             <w:shd w:fill="F7F7F7" w:val="clear"/>
             <w:tcBorders>
               <w:top w:val="single" w:sz="4" w:color="4A4A4A"/>
@@ -1185,15 +2040,18 @@
               <w:bidi w:val="1"/>
             </w:pPr>
             <w:r>
-              <w:t xml:space="preserve">برچسب دستهٔ N12</w:t>
+              <w:t>برچسب دستهٔ N12</w:t>
             </w:r>
           </w:p>
         </w:tc>
       </w:tr>
       <w:tr>
+        <w:trPr>
+          <w:cantSplit/>
+        </w:trPr>
         <w:tc>
           <w:tcPr>
-            <w:tcW w:type="dxa" w:w="3364"/>
+            <w:tcW w:type="dxa" w:w="2300"/>
             <w:shd w:fill="F7F7F7" w:val="clear"/>
             <w:tcBorders>
               <w:top w:val="single" w:sz="4" w:color="4A4A4A"/>
@@ -1223,7 +2081,43 @@
         </w:tc>
         <w:tc>
           <w:tcPr>
-            <w:tcW w:type="dxa" w:w="3364"/>
+            <w:tcW w:type="dxa" w:w="4700"/>
+            <w:shd w:fill="F7F7F7" w:val="clear"/>
+            <w:tcBorders>
+              <w:top w:val="single" w:sz="4" w:color="4A4A4A"/>
+              <w:left w:val="single" w:sz="4" w:color="4A4A4A"/>
+              <w:bottom w:val="single" w:sz="4" w:color="4A4A4A"/>
+              <w:right w:val="single" w:sz="4" w:color="4A4A4A"/>
+            </w:tcBorders>
+            <w:vAlign w:val="center"/>
+          </w:tcPr>
+          <w:p>
+            <w:pPr>
+              <w:jc w:val="center"/>
+              <w:bidi w:val="0"/>
+            </w:pPr>
+            <w:r>
+              <w:rPr>
+                <w:sz w:val="16"/>
+                <w:szCs w:val="16"/>
+                <w:rFonts w:ascii="Calibri" w:hAnsi="Calibri" w:cs="Calibri"/>
+              </w:rPr>
+              <w:t>device_software_kind</w:t>
+            </w:r>
+            <w:r>
+              <w:rPr>
+                <w:rFonts w:ascii="Times New Roman" w:hAnsi="Times New Roman" w:cs="B Nazanin" w:eastAsia="B Nazanin"/>
+                <w:b w:val="0"/>
+                <w:sz w:val="15"/>
+                <w:rtl w:val="1"/>
+                <w:lang w:val="en-US" w:bidi="fa-IR" w:eastAsia="fa-IR"/>
+              </w:rPr>
+            </w:r>
+          </w:p>
+        </w:tc>
+        <w:tc>
+          <w:tcPr>
+            <w:tcW w:type="dxa" w:w="3092"/>
             <w:shd w:fill="F7F7F7" w:val="clear"/>
             <w:tcBorders>
               <w:top w:val="single" w:sz="4" w:color="4A4A4A"/>
@@ -1239,46 +2133,18 @@
               <w:bidi w:val="1"/>
             </w:pPr>
             <w:r>
-              <w:t>software_kind</w:t>
-            </w:r>
-            <w:r>
-              <w:rPr>
-                <w:rFonts w:ascii="Times New Roman" w:hAnsi="Times New Roman" w:cs="B Nazanin" w:eastAsia="B Nazanin"/>
-                <w:b w:val="0"/>
-                <w:sz w:val="15"/>
-                <w:rtl w:val="1"/>
-                <w:lang w:val="en-US" w:bidi="fa-IR" w:eastAsia="fa-IR"/>
-              </w:rPr>
-            </w:r>
-          </w:p>
-        </w:tc>
-        <w:tc>
-          <w:tcPr>
-            <w:tcW w:type="dxa" w:w="3364"/>
-            <w:shd w:fill="F7F7F7" w:val="clear"/>
-            <w:tcBorders>
-              <w:top w:val="single" w:sz="4" w:color="4A4A4A"/>
-              <w:left w:val="single" w:sz="4" w:color="4A4A4A"/>
-              <w:bottom w:val="single" w:sz="4" w:color="4A4A4A"/>
-              <w:right w:val="single" w:sz="4" w:color="4A4A4A"/>
-            </w:tcBorders>
-            <w:vAlign w:val="center"/>
-          </w:tcPr>
-          <w:p>
-            <w:pPr>
-              <w:jc w:val="center"/>
-              <w:bidi w:val="1"/>
-            </w:pPr>
-            <w:r>
-              <w:t xml:space="preserve">برچسب SiMD/SaMD</w:t>
+              <w:t>برچسب SiMD/SaMD</w:t>
             </w:r>
           </w:p>
         </w:tc>
       </w:tr>
       <w:tr>
+        <w:trPr>
+          <w:cantSplit/>
+        </w:trPr>
         <w:tc>
           <w:tcPr>
-            <w:tcW w:type="dxa" w:w="3364"/>
+            <w:tcW w:type="dxa" w:w="2300"/>
             <w:shd w:fill="F7F7F7" w:val="clear"/>
             <w:tcBorders>
               <w:top w:val="single" w:sz="4" w:color="4A4A4A"/>
@@ -1308,7 +2174,7 @@
         </w:tc>
         <w:tc>
           <w:tcPr>
-            <w:tcW w:type="dxa" w:w="3364"/>
+            <w:tcW w:type="dxa" w:w="4700"/>
             <w:shd w:fill="F7F7F7" w:val="clear"/>
             <w:tcBorders>
               <w:top w:val="single" w:sz="4" w:color="4A4A4A"/>
@@ -1338,7 +2204,7 @@
         </w:tc>
         <w:tc>
           <w:tcPr>
-            <w:tcW w:type="dxa" w:w="3364"/>
+            <w:tcW w:type="dxa" w:w="3092"/>
             <w:shd w:fill="F7F7F7" w:val="clear"/>
             <w:tcBorders>
               <w:top w:val="single" w:sz="4" w:color="4A4A4A"/>
@@ -1354,7 +2220,7 @@
               <w:bidi w:val="1"/>
             </w:pPr>
             <w:r>
-              <w:t xml:space="preserve">درجهٔ ادعا روی نردبان</w:t>
+              <w:t>درجهٔ ادعا روی نردبان</w:t>
             </w:r>
           </w:p>
         </w:tc>
@@ -1372,7 +2238,7 @@
           <w:rtl w:val="1"/>
           <w:lang w:val="en-US" w:bidi="fa-IR" w:eastAsia="fa-IR"/>
         </w:rPr>
-        <w:t>این جدول کنترل منفی است و عمداً بدون شاهد اجرایی ساخته شده است. حسابرس سطح صفر برمی‌گرداند، چون مانیفست اجرا در بسته نیست.</w:t>
+        <w:t>جدول ۳ کنترل منفی همین طرح است. برچسب تنظیم‌گری در بسته هست و اجرای ثبت‌شده نیست. حسابرس سطح صفر می‌دهد.</w:t>
       </w:r>
     </w:p>
     <w:p>
@@ -1390,7 +2256,7 @@
           <w:rtl w:val="1"/>
           <w:lang w:val="en-US" w:bidi="fa-IR" w:eastAsia="fa-IR"/>
         </w:rPr>
-        <w:t>جدول ۲: کنترل منفی؛ بدون شاهد اجرایی، خروجی حسابرس سطح ۰</w:t>
+        <w:t>جدول ۳: کنترل منفی؛ خروجی حسابرس سطح ۰</w:t>
       </w:r>
     </w:p>
     <w:tbl>
@@ -1403,14 +2269,17 @@
         <w:tblW w:w="5000" w:type="pct"/>
       </w:tblPr>
       <w:tblGrid>
-        <w:gridCol w:w="3364"/>
-        <w:gridCol w:w="3364"/>
-        <w:gridCol w:w="3364"/>
+        <w:gridCol w:w="4700"/>
+        <w:gridCol w:w="2800"/>
+        <w:gridCol w:w="2592"/>
       </w:tblGrid>
       <w:tr>
+        <w:trPr>
+          <w:cantSplit/>
+        </w:trPr>
         <w:tc>
           <w:tcPr>
-            <w:tcW w:type="dxa" w:w="3364"/>
+            <w:tcW w:type="dxa" w:w="4700"/>
             <w:shd w:fill="1A365D" w:val="clear"/>
             <w:tcBorders>
               <w:top w:val="single" w:sz="4" w:color="4A4A4A"/>
@@ -1441,7 +2310,7 @@
         </w:tc>
         <w:tc>
           <w:tcPr>
-            <w:tcW w:type="dxa" w:w="3364"/>
+            <w:tcW w:type="dxa" w:w="2800"/>
             <w:shd w:fill="1A365D" w:val="clear"/>
             <w:tcBorders>
               <w:top w:val="single" w:sz="4" w:color="4A4A4A"/>
@@ -1472,7 +2341,7 @@
         </w:tc>
         <w:tc>
           <w:tcPr>
-            <w:tcW w:type="dxa" w:w="3364"/>
+            <w:tcW w:type="dxa" w:w="2592"/>
             <w:shd w:fill="1A365D" w:val="clear"/>
             <w:tcBorders>
               <w:top w:val="single" w:sz="4" w:color="4A4A4A"/>
@@ -1503,9 +2372,12 @@
         </w:tc>
       </w:tr>
       <w:tr>
+        <w:trPr>
+          <w:cantSplit/>
+        </w:trPr>
         <w:tc>
           <w:tcPr>
-            <w:tcW w:type="dxa" w:w="3364"/>
+            <w:tcW w:type="dxa" w:w="4700"/>
             <w:shd w:fill="F7F7F7" w:val="clear"/>
             <w:tcBorders>
               <w:top w:val="single" w:sz="4" w:color="4A4A4A"/>
@@ -1535,7 +2407,7 @@
         </w:tc>
         <w:tc>
           <w:tcPr>
-            <w:tcW w:type="dxa" w:w="3364"/>
+            <w:tcW w:type="dxa" w:w="2800"/>
             <w:shd w:fill="F7F7F7" w:val="clear"/>
             <w:tcBorders>
               <w:top w:val="single" w:sz="4" w:color="4A4A4A"/>
@@ -1551,7 +2423,7 @@
               <w:bidi w:val="1"/>
             </w:pPr>
             <w:r>
-              <w:t>جدول مصنوعی؛ بدون ISO و ایمپلنت</w:t>
+              <w:t>بدون آزمون ISO و بدون ایمپلنت</w:t>
             </w:r>
             <w:r>
               <w:rPr>
@@ -1566,7 +2438,7 @@
         </w:tc>
         <w:tc>
           <w:tcPr>
-            <w:tcW w:type="dxa" w:w="3364"/>
+            <w:tcW w:type="dxa" w:w="2592"/>
             <w:shd w:fill="F7F7F7" w:val="clear"/>
             <w:tcBorders>
               <w:top w:val="single" w:sz="4" w:color="4A4A4A"/>
@@ -1590,15 +2462,18 @@
                 <w:rtl w:val="1"/>
                 <w:lang w:val="en-US" w:bidi="fa-IR" w:eastAsia="fa-IR"/>
               </w:rPr>
-              <w:t>اعلامی</w:t>
+              <w:t>برچسب</w:t>
             </w:r>
           </w:p>
         </w:tc>
       </w:tr>
       <w:tr>
+        <w:trPr>
+          <w:cantSplit/>
+        </w:trPr>
         <w:tc>
           <w:tcPr>
-            <w:tcW w:type="dxa" w:w="3364"/>
+            <w:tcW w:type="dxa" w:w="4700"/>
             <w:shd w:fill="F7F7F7" w:val="clear"/>
             <w:tcBorders>
               <w:top w:val="single" w:sz="4" w:color="4A4A4A"/>
@@ -1628,7 +2503,7 @@
         </w:tc>
         <w:tc>
           <w:tcPr>
-            <w:tcW w:type="dxa" w:w="3364"/>
+            <w:tcW w:type="dxa" w:w="2800"/>
             <w:shd w:fill="F7F7F7" w:val="clear"/>
             <w:tcBorders>
               <w:top w:val="single" w:sz="4" w:color="4A4A4A"/>
@@ -1644,7 +2519,7 @@
               <w:bidi w:val="1"/>
             </w:pPr>
             <w:r>
-              <w:t>۲ / ۳؛ ریسک مدل ۳</w:t>
+              <w:t>تأثیر ۲، پیامد ۳</w:t>
             </w:r>
             <w:r>
               <w:rPr>
@@ -1659,7 +2534,7 @@
         </w:tc>
         <w:tc>
           <w:tcPr>
-            <w:tcW w:type="dxa" w:w="3364"/>
+            <w:tcW w:type="dxa" w:w="2592"/>
             <w:shd w:fill="F7F7F7" w:val="clear"/>
             <w:tcBorders>
               <w:top w:val="single" w:sz="4" w:color="4A4A4A"/>
@@ -1683,15 +2558,18 @@
                 <w:rtl w:val="1"/>
                 <w:lang w:val="en-US" w:bidi="fa-IR" w:eastAsia="fa-IR"/>
               </w:rPr>
-              <w:t>اعلامی</w:t>
+              <w:t>برچسب</w:t>
             </w:r>
           </w:p>
         </w:tc>
       </w:tr>
       <w:tr>
+        <w:trPr>
+          <w:cantSplit/>
+        </w:trPr>
         <w:tc>
           <w:tcPr>
-            <w:tcW w:type="dxa" w:w="3364"/>
+            <w:tcW w:type="dxa" w:w="4700"/>
             <w:shd w:fill="F7F7F7" w:val="clear"/>
             <w:tcBorders>
               <w:top w:val="single" w:sz="4" w:color="4A4A4A"/>
@@ -1704,10 +2582,15 @@
           <w:p>
             <w:pPr>
               <w:jc w:val="center"/>
-              <w:bidi w:val="1"/>
+              <w:bidi w:val="0"/>
             </w:pPr>
             <w:r>
-              <w:t>software_kind</w:t>
+              <w:rPr>
+                <w:sz w:val="16"/>
+                <w:szCs w:val="16"/>
+                <w:rFonts w:ascii="Calibri" w:hAnsi="Calibri" w:cs="Calibri"/>
+              </w:rPr>
+              <w:t>device_software_kind</w:t>
             </w:r>
             <w:r>
               <w:rPr>
@@ -1722,7 +2605,7 @@
         </w:tc>
         <w:tc>
           <w:tcPr>
-            <w:tcW w:type="dxa" w:w="3364"/>
+            <w:tcW w:type="dxa" w:w="2800"/>
             <w:shd w:fill="F7F7F7" w:val="clear"/>
             <w:tcBorders>
               <w:top w:val="single" w:sz="4" w:color="4A4A4A"/>
@@ -1752,7 +2635,7 @@
         </w:tc>
         <w:tc>
           <w:tcPr>
-            <w:tcW w:type="dxa" w:w="3364"/>
+            <w:tcW w:type="dxa" w:w="2592"/>
             <w:shd w:fill="F7F7F7" w:val="clear"/>
             <w:tcBorders>
               <w:top w:val="single" w:sz="4" w:color="4A4A4A"/>
@@ -1776,15 +2659,18 @@
                 <w:rtl w:val="1"/>
                 <w:lang w:val="en-US" w:bidi="fa-IR" w:eastAsia="fa-IR"/>
               </w:rPr>
-              <w:t>اعلامی</w:t>
+              <w:t>برچسب</w:t>
             </w:r>
           </w:p>
         </w:tc>
       </w:tr>
       <w:tr>
+        <w:trPr>
+          <w:cantSplit/>
+        </w:trPr>
         <w:tc>
           <w:tcPr>
-            <w:tcW w:type="dxa" w:w="3364"/>
+            <w:tcW w:type="dxa" w:w="4700"/>
             <w:shd w:fill="F7F7F7" w:val="clear"/>
             <w:tcBorders>
               <w:top w:val="single" w:sz="4" w:color="4A4A4A"/>
@@ -1814,7 +2700,7 @@
         </w:tc>
         <w:tc>
           <w:tcPr>
-            <w:tcW w:type="dxa" w:w="3364"/>
+            <w:tcW w:type="dxa" w:w="2800"/>
             <w:shd w:fill="F7F7F7" w:val="clear"/>
             <w:tcBorders>
               <w:top w:val="single" w:sz="4" w:color="4A4A4A"/>
@@ -1844,7 +2730,7 @@
         </w:tc>
         <w:tc>
           <w:tcPr>
-            <w:tcW w:type="dxa" w:w="3364"/>
+            <w:tcW w:type="dxa" w:w="2592"/>
             <w:shd w:fill="F7F7F7" w:val="clear"/>
             <w:tcBorders>
               <w:top w:val="single" w:sz="4" w:color="4A4A4A"/>
@@ -1868,15 +2754,18 @@
                 <w:rtl w:val="1"/>
                 <w:lang w:val="en-US" w:bidi="fa-IR" w:eastAsia="fa-IR"/>
               </w:rPr>
-              <w:t>اعلامی</w:t>
+              <w:t>برچسب</w:t>
             </w:r>
           </w:p>
         </w:tc>
       </w:tr>
       <w:tr>
+        <w:trPr>
+          <w:cantSplit/>
+        </w:trPr>
         <w:tc>
           <w:tcPr>
-            <w:tcW w:type="dxa" w:w="3364"/>
+            <w:tcW w:type="dxa" w:w="4700"/>
             <w:shd w:fill="F7F7F7" w:val="clear"/>
             <w:tcBorders>
               <w:top w:val="single" w:sz="4" w:color="4A4A4A"/>
@@ -1906,7 +2795,7 @@
         </w:tc>
         <w:tc>
           <w:tcPr>
-            <w:tcW w:type="dxa" w:w="3364"/>
+            <w:tcW w:type="dxa" w:w="2800"/>
             <w:shd w:fill="F7F7F7" w:val="clear"/>
             <w:tcBorders>
               <w:top w:val="single" w:sz="4" w:color="4A4A4A"/>
@@ -1936,7 +2825,7 @@
         </w:tc>
         <w:tc>
           <w:tcPr>
-            <w:tcW w:type="dxa" w:w="3364"/>
+            <w:tcW w:type="dxa" w:w="2592"/>
             <w:shd w:fill="F7F7F7" w:val="clear"/>
             <w:tcBorders>
               <w:top w:val="single" w:sz="4" w:color="4A4A4A"/>
@@ -1960,15 +2849,18 @@
                 <w:rtl w:val="1"/>
                 <w:lang w:val="en-US" w:bidi="fa-IR" w:eastAsia="fa-IR"/>
               </w:rPr>
-              <w:t>اعلامی</w:t>
+              <w:t>برچسب</w:t>
             </w:r>
           </w:p>
         </w:tc>
       </w:tr>
       <w:tr>
+        <w:trPr>
+          <w:cantSplit/>
+        </w:trPr>
         <w:tc>
           <w:tcPr>
-            <w:tcW w:type="dxa" w:w="3364"/>
+            <w:tcW w:type="dxa" w:w="4700"/>
             <w:shd w:fill="F7F7F7" w:val="clear"/>
             <w:tcBorders>
               <w:top w:val="single" w:sz="4" w:color="4A4A4A"/>
@@ -1998,7 +2890,43 @@
         </w:tc>
         <w:tc>
           <w:tcPr>
-            <w:tcW w:type="dxa" w:w="3364"/>
+            <w:tcW w:type="dxa" w:w="2800"/>
+            <w:shd w:fill="F7F7F7" w:val="clear"/>
+            <w:tcBorders>
+              <w:top w:val="single" w:sz="4" w:color="4A4A4A"/>
+              <w:left w:val="single" w:sz="4" w:color="4A4A4A"/>
+              <w:bottom w:val="single" w:sz="4" w:color="4A4A4A"/>
+              <w:right w:val="single" w:sz="4" w:color="4A4A4A"/>
+            </w:tcBorders>
+            <w:vAlign w:val="center"/>
+          </w:tcPr>
+          <w:p>
+            <w:pPr>
+              <w:jc w:val="center"/>
+              <w:bidi w:val="0"/>
+            </w:pPr>
+            <w:r>
+              <w:rPr>
+                <w:sz w:val="16"/>
+                <w:szCs w:val="16"/>
+                <w:rFonts w:ascii="Calibri" w:hAnsi="Calibri" w:cs="Calibri"/>
+              </w:rPr>
+              <w:t>1, 3, 8</w:t>
+            </w:r>
+            <w:r>
+              <w:rPr>
+                <w:rFonts w:ascii="Times New Roman" w:hAnsi="Times New Roman" w:cs="B Nazanin" w:eastAsia="B Nazanin"/>
+                <w:b w:val="0"/>
+                <w:sz w:val="15"/>
+                <w:rtl w:val="1"/>
+                <w:lang w:val="en-US" w:bidi="fa-IR" w:eastAsia="fa-IR"/>
+              </w:rPr>
+            </w:r>
+          </w:p>
+        </w:tc>
+        <w:tc>
+          <w:tcPr>
+            <w:tcW w:type="dxa" w:w="2592"/>
             <w:shd w:fill="F7F7F7" w:val="clear"/>
             <w:tcBorders>
               <w:top w:val="single" w:sz="4" w:color="4A4A4A"/>
@@ -2022,13 +2950,18 @@
                 <w:rtl w:val="1"/>
                 <w:lang w:val="en-US" w:bidi="fa-IR" w:eastAsia="fa-IR"/>
               </w:rPr>
-              <w:t>۱، ۳، ۸</w:t>
+              <w:t>برچسب</w:t>
             </w:r>
           </w:p>
         </w:tc>
+      </w:tr>
+      <w:tr>
+        <w:trPr>
+          <w:cantSplit/>
+        </w:trPr>
         <w:tc>
           <w:tcPr>
-            <w:tcW w:type="dxa" w:w="3364"/>
+            <w:tcW w:type="dxa" w:w="4700"/>
             <w:shd w:fill="F7F7F7" w:val="clear"/>
             <w:tcBorders>
               <w:top w:val="single" w:sz="4" w:color="4A4A4A"/>
@@ -2041,9 +2974,16 @@
           <w:p>
             <w:pPr>
               <w:jc w:val="center"/>
-              <w:bidi w:val="1"/>
+              <w:bidi w:val="0"/>
             </w:pPr>
-            <w:r/>
+            <w:r>
+              <w:rPr>
+                <w:sz w:val="16"/>
+                <w:szCs w:val="16"/>
+                <w:rFonts w:ascii="Calibri" w:hAnsi="Calibri" w:cs="Calibri"/>
+              </w:rPr>
+              <w:t>physics_based</w:t>
+            </w:r>
             <w:r>
               <w:rPr>
                 <w:rFonts w:ascii="Times New Roman" w:hAnsi="Times New Roman" w:cs="B Nazanin" w:eastAsia="B Nazanin"/>
@@ -2052,45 +2992,12 @@
                 <w:rtl w:val="1"/>
                 <w:lang w:val="en-US" w:bidi="fa-IR" w:eastAsia="fa-IR"/>
               </w:rPr>
-              <w:t>اعلامی</w:t>
-            </w:r>
-          </w:p>
-        </w:tc>
-      </w:tr>
-      <w:tr>
-        <w:tc>
-          <w:tcPr>
-            <w:tcW w:type="dxa" w:w="3364"/>
-            <w:shd w:fill="F7F7F7" w:val="clear"/>
-            <w:tcBorders>
-              <w:top w:val="single" w:sz="4" w:color="4A4A4A"/>
-              <w:left w:val="single" w:sz="4" w:color="4A4A4A"/>
-              <w:bottom w:val="single" w:sz="4" w:color="4A4A4A"/>
-              <w:right w:val="single" w:sz="4" w:color="4A4A4A"/>
-            </w:tcBorders>
-            <w:vAlign w:val="center"/>
-          </w:tcPr>
-          <w:p>
-            <w:pPr>
-              <w:jc w:val="center"/>
-              <w:bidi w:val="1"/>
-            </w:pPr>
-            <w:r/>
-            <w:r>
-              <w:rPr>
-                <w:rFonts w:ascii="Times New Roman" w:hAnsi="Times New Roman" w:cs="B Nazanin" w:eastAsia="B Nazanin"/>
-                <w:b w:val="0"/>
-                <w:sz w:val="15"/>
-                <w:rtl w:val="1"/>
-                <w:lang w:val="en-US" w:bidi="fa-IR" w:eastAsia="fa-IR"/>
-              </w:rPr>
-              <w:t>physics_based</w:t>
             </w:r>
           </w:p>
         </w:tc>
         <w:tc>
           <w:tcPr>
-            <w:tcW w:type="dxa" w:w="3364"/>
+            <w:tcW w:type="dxa" w:w="2800"/>
             <w:shd w:fill="F7F7F7" w:val="clear"/>
             <w:tcBorders>
               <w:top w:val="single" w:sz="4" w:color="4A4A4A"/>
@@ -2106,7 +3013,7 @@
               <w:bidi w:val="1"/>
             </w:pPr>
             <w:r>
-              <w:t>بله؛ سطح نردبان همچنان ۰</w:t>
+              <w:t>بله؛ درجهٔ حسابرس ۰</w:t>
             </w:r>
             <w:r>
               <w:rPr>
@@ -2121,7 +3028,7 @@
         </w:tc>
         <w:tc>
           <w:tcPr>
-            <w:tcW w:type="dxa" w:w="3364"/>
+            <w:tcW w:type="dxa" w:w="2592"/>
             <w:shd w:fill="F7F7F7" w:val="clear"/>
             <w:tcBorders>
               <w:top w:val="single" w:sz="4" w:color="4A4A4A"/>
@@ -2137,7 +3044,7 @@
               <w:bidi w:val="1"/>
             </w:pPr>
             <w:r>
-              <w:t>اجرایی</w:t>
+              <w:t>برچسب</w:t>
             </w:r>
             <w:r>
               <w:rPr>
@@ -2198,7 +3105,7 @@
           <w:rtl w:val="1"/>
           <w:lang w:val="en-US" w:bidi="fa-IR" w:eastAsia="fa-IR"/>
         </w:rPr>
-        <w:t>HE01 کنترل مثبت است: کمپینی اجراشده و بازپخش‌پذیر، با مداخله و سی بذر جفتی. درمان با کنترل‌های محتوای تهی، کانال بسته، کانال روشن بدون این سوگیری، و محتوای برخورده مقایسه می‌شود. سنجه میانگین انرژی پایانی گیرنده داخل شبیه‌سازی است. برچسب داخل فایل results_v7.json برابر intervention_supported است. حسابرس عمومی همان بسته را در سطح ۴ می‌گذارد؛ تا سطح ۵ فقط شناسهٔ آرشیو کم است. این نام روی نقشهٔ داخلی کنار سطح ۳ است و به‌تنهایی درجه را نمی‌سازد.</w:t>
+        <w:t>HE01 کنترل مثبت است: کمپین اجراشده و بازپخش‌پذیر، با مداخله و سی بذر جفتی. درمان با چهار کنترل مقایسه می‌شود: محتوای تهی، کانال بسته، کانال روشن بدون این سوگیری، و محتوای برخورده. سنجه میانگین انرژی پایانی گیرنده در شبیه‌سازی است. حسابرس همین بسته را در سطح ۴ می‌گذارد. برچسب فایل results_v7.json برابر intervention_supported است و درجهٔ حسابرس ۴ است.</w:t>
       </w:r>
     </w:p>
     <w:p>
@@ -2213,7 +3120,7 @@
           <w:rtl w:val="1"/>
           <w:lang w:val="en-US" w:bidi="fa-IR" w:eastAsia="fa-IR"/>
         </w:rPr>
-        <w:t>فایل results_v7.json با پیشوند 28f812c5 سه مقایسه دارد [16]. نسبت به کانال روشن بدون سوگیری، اختلاف ۱۶٫۴۹، p خام ۴٫۹۹۹۷۵×۱۰⁻⁵، p هولم ۱٫۵۰×۱۰⁻⁴ و بازهٔ BCa برابر [۱۴٫۲۵، ۱۹٫۱۴] است. نسبت به کانال بسته و محتوای تهی، اختلاف ۳۰٫۶۷ و بازهٔ [۲۶٫۰۳، ۳۵٫۳۲] است. بوت‌استرپ studentized اختیاری همان سی اختلاف را حدود ۱۴٫۰۵ تا ۱۹٫۳۰ می‌گذارد و فایل v7 دست نمی‌خورد. شکل ۲ همین دو بازه را نشان می‌دهد.</w:t>
+        <w:t>فایل results_v7.json با پیشوند اثرانگشت 28f812c5 سه مقایسهٔ جفتی دارد [16]. نسبت به کانال روشن و بدون سوگیری منشأ، اختلاف ۱۶٫۴۹ واحد است. کران پایین بازه ۱۴٫۲۵ و کران بالا ۱۹٫۱۴ است. p خام 4.99975e-5 و p پس از Holm برابر 1.50e-4 است. نسبت به کانال بسته و محتوای تهی، اختلاف ۳۰٫۶۷ واحد است، با کران پایین ۲۶٫۰۳ و کران بالا ۳۵٫۳۲. در مقایسهٔ اول فقط سوگیری برداشته می‌شود. در مقایسهٔ دوم هم محتوا عوض می‌شود و هم سوگیری. بازهٔ اختیاری studentized حدود ۱۴٫۰۵ تا ۱۹٫۳۰ است و فایل v7 دست نمی‌خورد.</w:t>
       </w:r>
     </w:p>
     <w:p>
@@ -2225,7 +3132,7 @@
       <w:r>
         <w:drawing>
           <wp:inline xmlns:a="http://schemas.openxmlformats.org/drawingml/2006/main" xmlns:pic="http://schemas.openxmlformats.org/drawingml/2006/picture">
-            <wp:extent cx="2916000" cy="682344"/>
+            <wp:extent cx="2916000" cy="874800"/>
             <wp:docPr id="2" name="Picture 2"/>
             <wp:cNvGraphicFramePr>
               <a:graphicFrameLocks noChangeAspect="1"/>
@@ -2246,7 +3153,7 @@
                   <pic:spPr>
                     <a:xfrm>
                       <a:off x="0" y="0"/>
-                      <a:ext cx="2916000" cy="682344"/>
+                      <a:ext cx="2916000" cy="874800"/>
                     </a:xfrm>
                     <a:prstGeom prst="rect"/>
                   </pic:spPr>
@@ -2276,6 +3183,569 @@
     </w:p>
     <w:p>
       <w:pPr>
+        <w:pStyle w:val="TableTitle"/>
+        <w:jc w:val="center"/>
+        <w:bidi w:val="1"/>
+      </w:pPr>
+      <w:r>
+        <w:rPr>
+          <w:rFonts w:ascii="Times New Roman" w:hAnsi="Times New Roman" w:cs="B Nazanin" w:eastAsia="B Nazanin"/>
+          <w:b/>
+          <w:i/>
+          <w:sz w:val="16"/>
+          <w:rtl w:val="1"/>
+          <w:lang w:val="en-US" w:bidi="fa-IR" w:eastAsia="fa-IR"/>
+        </w:rPr>
+        <w:t xml:space="preserve">جدول ۴: خلاصهٔ کمپین تأییدی HE01 از مصنوع v7 (بازتقطیع نشده)</w:t>
+      </w:r>
+    </w:p>
+    <w:tbl>
+      <w:tblPr>
+        <w:tblStyle w:val="TableGrid"/>
+        <w:tblW w:type="auto" w:w="0"/>
+        <w:jc w:val="center"/>
+        <w:tblLook w:firstColumn="1" w:firstRow="1" w:lastColumn="0" w:lastRow="0" w:noHBand="0" w:noVBand="1" w:val="04A0"/>
+        <w:bidiVisual w:val="1"/>
+        <w:tblW w:w="5000" w:type="pct"/>
+      </w:tblPr>
+      <w:tblGrid>
+        <w:gridCol w:w="5046"/>
+        <w:gridCol w:w="5046"/>
+      </w:tblGrid>
+      <w:tr>
+        <w:trPr>
+          <w:cantSplit/>
+        </w:trPr>
+        <w:tc>
+          <w:tcPr>
+            <w:tcW w:type="dxa" w:w="5046"/>
+            <w:shd w:fill="1A365D" w:val="clear"/>
+            <w:tcBorders>
+              <w:top w:val="single" w:sz="4" w:color="4A4A4A"/>
+              <w:left w:val="single" w:sz="4" w:color="4A4A4A"/>
+              <w:bottom w:val="single" w:sz="4" w:color="4A4A4A"/>
+              <w:right w:val="single" w:sz="4" w:color="4A4A4A"/>
+            </w:tcBorders>
+            <w:vAlign w:val="center"/>
+          </w:tcPr>
+          <w:p>
+            <w:pPr>
+              <w:jc w:val="center"/>
+              <w:bidi w:val="1"/>
+            </w:pPr>
+            <w:r/>
+            <w:r>
+              <w:rPr>
+                <w:rFonts w:ascii="Times New Roman" w:hAnsi="Times New Roman" w:cs="B Nazanin" w:eastAsia="B Nazanin"/>
+                <w:b/>
+                <w:color w:val="FFFFFF"/>
+                <w:sz w:val="16"/>
+                <w:rtl w:val="1"/>
+                <w:lang w:val="en-US" w:bidi="fa-IR" w:eastAsia="fa-IR"/>
+              </w:rPr>
+              <w:t>سنجه</w:t>
+            </w:r>
+          </w:p>
+        </w:tc>
+        <w:tc>
+          <w:tcPr>
+            <w:tcW w:type="dxa" w:w="5046"/>
+            <w:shd w:fill="1A365D" w:val="clear"/>
+            <w:tcBorders>
+              <w:top w:val="single" w:sz="4" w:color="4A4A4A"/>
+              <w:left w:val="single" w:sz="4" w:color="4A4A4A"/>
+              <w:bottom w:val="single" w:sz="4" w:color="4A4A4A"/>
+              <w:right w:val="single" w:sz="4" w:color="4A4A4A"/>
+            </w:tcBorders>
+            <w:vAlign w:val="center"/>
+          </w:tcPr>
+          <w:p>
+            <w:pPr>
+              <w:jc w:val="center"/>
+              <w:bidi w:val="1"/>
+            </w:pPr>
+            <w:r/>
+            <w:r>
+              <w:rPr>
+                <w:rFonts w:ascii="Times New Roman" w:hAnsi="Times New Roman" w:cs="B Nazanin" w:eastAsia="B Nazanin"/>
+                <w:b/>
+                <w:color w:val="FFFFFF"/>
+                <w:sz w:val="16"/>
+                <w:rtl w:val="1"/>
+                <w:lang w:val="en-US" w:bidi="fa-IR" w:eastAsia="fa-IR"/>
+              </w:rPr>
+              <w:t>مقدار منتشرشده</w:t>
+            </w:r>
+          </w:p>
+        </w:tc>
+      </w:tr>
+      <w:tr>
+        <w:trPr>
+          <w:cantSplit/>
+        </w:trPr>
+        <w:tc>
+          <w:tcPr>
+            <w:tcW w:type="dxa" w:w="5046"/>
+            <w:shd w:fill="F7F7F7" w:val="clear"/>
+            <w:tcBorders>
+              <w:top w:val="single" w:sz="4" w:color="4A4A4A"/>
+              <w:left w:val="single" w:sz="4" w:color="4A4A4A"/>
+              <w:bottom w:val="single" w:sz="4" w:color="4A4A4A"/>
+              <w:right w:val="single" w:sz="4" w:color="4A4A4A"/>
+            </w:tcBorders>
+            <w:vAlign w:val="center"/>
+          </w:tcPr>
+          <w:p>
+            <w:pPr>
+              <w:jc w:val="center"/>
+              <w:bidi w:val="1"/>
+            </w:pPr>
+            <w:r/>
+            <w:r>
+              <w:rPr>
+                <w:rFonts w:ascii="Times New Roman" w:hAnsi="Times New Roman" w:cs="B Nazanin" w:eastAsia="B Nazanin"/>
+                <w:b w:val="0"/>
+                <w:sz w:val="16"/>
+                <w:rtl w:val="1"/>
+                <w:lang w:val="en-US" w:bidi="fa-IR" w:eastAsia="fa-IR"/>
+              </w:rPr>
+              <w:t>تعداد بذر جفتی</w:t>
+            </w:r>
+          </w:p>
+        </w:tc>
+        <w:tc>
+          <w:tcPr>
+            <w:tcW w:type="dxa" w:w="5046"/>
+            <w:shd w:fill="F7F7F7" w:val="clear"/>
+            <w:tcBorders>
+              <w:top w:val="single" w:sz="4" w:color="4A4A4A"/>
+              <w:left w:val="single" w:sz="4" w:color="4A4A4A"/>
+              <w:bottom w:val="single" w:sz="4" w:color="4A4A4A"/>
+              <w:right w:val="single" w:sz="4" w:color="4A4A4A"/>
+            </w:tcBorders>
+            <w:vAlign w:val="center"/>
+          </w:tcPr>
+          <w:p>
+            <w:pPr>
+              <w:jc w:val="center"/>
+              <w:bidi w:val="1"/>
+            </w:pPr>
+            <w:r/>
+            <w:r>
+              <w:rPr>
+                <w:rFonts w:ascii="Times New Roman" w:hAnsi="Times New Roman" w:cs="B Nazanin" w:eastAsia="B Nazanin"/>
+                <w:b w:val="0"/>
+                <w:sz w:val="16"/>
+                <w:rtl w:val="1"/>
+                <w:lang w:val="en-US" w:bidi="fa-IR" w:eastAsia="fa-IR"/>
+              </w:rPr>
+              <w:t>۳۰</w:t>
+            </w:r>
+          </w:p>
+        </w:tc>
+      </w:tr>
+      <w:tr>
+        <w:trPr>
+          <w:cantSplit/>
+        </w:trPr>
+        <w:tc>
+          <w:tcPr>
+            <w:tcW w:type="dxa" w:w="5046"/>
+            <w:shd w:fill="F7F7F7" w:val="clear"/>
+            <w:tcBorders>
+              <w:top w:val="single" w:sz="4" w:color="4A4A4A"/>
+              <w:left w:val="single" w:sz="4" w:color="4A4A4A"/>
+              <w:bottom w:val="single" w:sz="4" w:color="4A4A4A"/>
+              <w:right w:val="single" w:sz="4" w:color="4A4A4A"/>
+            </w:tcBorders>
+            <w:vAlign w:val="center"/>
+          </w:tcPr>
+          <w:p>
+            <w:pPr>
+              <w:jc w:val="center"/>
+              <w:bidi w:val="1"/>
+            </w:pPr>
+            <w:r/>
+            <w:r>
+              <w:rPr>
+                <w:rFonts w:ascii="Times New Roman" w:hAnsi="Times New Roman" w:cs="B Nazanin" w:eastAsia="B Nazanin"/>
+                <w:b w:val="0"/>
+                <w:sz w:val="16"/>
+                <w:rtl w:val="1"/>
+                <w:lang w:val="en-US" w:bidi="fa-IR" w:eastAsia="fa-IR"/>
+              </w:rPr>
+              <w:t>سنجهٔ اولیه</w:t>
+            </w:r>
+          </w:p>
+        </w:tc>
+        <w:tc>
+          <w:tcPr>
+            <w:tcW w:type="dxa" w:w="5046"/>
+            <w:shd w:fill="F7F7F7" w:val="clear"/>
+            <w:tcBorders>
+              <w:top w:val="single" w:sz="4" w:color="4A4A4A"/>
+              <w:left w:val="single" w:sz="4" w:color="4A4A4A"/>
+              <w:bottom w:val="single" w:sz="4" w:color="4A4A4A"/>
+              <w:right w:val="single" w:sz="4" w:color="4A4A4A"/>
+            </w:tcBorders>
+            <w:vAlign w:val="center"/>
+          </w:tcPr>
+          <w:p>
+            <w:pPr>
+              <w:jc w:val="center"/>
+              <w:bidi w:val="1"/>
+            </w:pPr>
+            <w:r/>
+            <w:r>
+              <w:rPr>
+                <w:rFonts w:ascii="Times New Roman" w:hAnsi="Times New Roman" w:cs="B Nazanin" w:eastAsia="B Nazanin"/>
+                <w:b w:val="0"/>
+                <w:sz w:val="16"/>
+                <w:rtl w:val="1"/>
+                <w:lang w:val="en-US" w:bidi="fa-IR" w:eastAsia="fa-IR"/>
+              </w:rPr>
+              <w:t>میانگین انرژی پایانی گیرنده</w:t>
+            </w:r>
+          </w:p>
+        </w:tc>
+      </w:tr>
+      <w:tr>
+        <w:trPr>
+          <w:cantSplit/>
+        </w:trPr>
+        <w:tc>
+          <w:tcPr>
+            <w:tcW w:type="dxa" w:w="5046"/>
+            <w:shd w:fill="F7F7F7" w:val="clear"/>
+            <w:tcBorders>
+              <w:top w:val="single" w:sz="4" w:color="4A4A4A"/>
+              <w:left w:val="single" w:sz="4" w:color="4A4A4A"/>
+              <w:bottom w:val="single" w:sz="4" w:color="4A4A4A"/>
+              <w:right w:val="single" w:sz="4" w:color="4A4A4A"/>
+            </w:tcBorders>
+            <w:vAlign w:val="center"/>
+          </w:tcPr>
+          <w:p>
+            <w:pPr>
+              <w:jc w:val="center"/>
+              <w:bidi w:val="0"/>
+            </w:pPr>
+            <w:r>
+              <w:rPr>
+                <w:sz w:val="16"/>
+                <w:szCs w:val="16"/>
+                <w:rFonts w:ascii="Calibri" w:hAnsi="Calibri" w:cs="Calibri"/>
+              </w:rPr>
+              <w:t>source_bias_on vs source_bias_off</w:t>
+            </w:r>
+            <w:r>
+              <w:rPr>
+                <w:rFonts w:ascii="Times New Roman" w:hAnsi="Times New Roman" w:cs="B Nazanin" w:eastAsia="B Nazanin"/>
+                <w:b w:val="0"/>
+                <w:sz w:val="16"/>
+                <w:rtl w:val="1"/>
+                <w:lang w:val="en-US" w:bidi="fa-IR" w:eastAsia="fa-IR"/>
+              </w:rPr>
+            </w:r>
+          </w:p>
+        </w:tc>
+        <w:tc>
+          <w:tcPr>
+            <w:tcW w:type="dxa" w:w="5046"/>
+            <w:shd w:fill="F7F7F7" w:val="clear"/>
+            <w:tcBorders>
+              <w:top w:val="single" w:sz="4" w:color="4A4A4A"/>
+              <w:left w:val="single" w:sz="4" w:color="4A4A4A"/>
+              <w:bottom w:val="single" w:sz="4" w:color="4A4A4A"/>
+              <w:right w:val="single" w:sz="4" w:color="4A4A4A"/>
+            </w:tcBorders>
+            <w:vAlign w:val="center"/>
+          </w:tcPr>
+          <w:p>
+            <w:pPr>
+              <w:jc w:val="center"/>
+              <w:bidi w:val="0"/>
+            </w:pPr>
+            <w:r>
+              <w:rPr>
+                <w:sz w:val="16"/>
+                <w:szCs w:val="16"/>
+                <w:rFonts w:ascii="Calibri" w:hAnsi="Calibri" w:cs="Calibri"/>
+              </w:rPr>
+              <w:t>16.49; BCa [14.25, 19.14]</w:t>
+            </w:r>
+          </w:p>
+        </w:tc>
+      </w:tr>
+      <w:tr>
+        <w:trPr>
+          <w:cantSplit/>
+        </w:trPr>
+        <w:tc>
+          <w:tcPr>
+            <w:tcW w:type="dxa" w:w="5046"/>
+            <w:shd w:fill="F7F7F7" w:val="clear"/>
+            <w:tcBorders>
+              <w:top w:val="single" w:sz="4" w:color="4A4A4A"/>
+              <w:left w:val="single" w:sz="4" w:color="4A4A4A"/>
+              <w:bottom w:val="single" w:sz="4" w:color="4A4A4A"/>
+              <w:right w:val="single" w:sz="4" w:color="4A4A4A"/>
+            </w:tcBorders>
+            <w:vAlign w:val="center"/>
+          </w:tcPr>
+          <w:p>
+            <w:pPr>
+              <w:jc w:val="center"/>
+              <w:bidi w:val="0"/>
+            </w:pPr>
+            <w:r>
+              <w:rPr>
+                <w:sz w:val="16"/>
+                <w:szCs w:val="16"/>
+                <w:rFonts w:ascii="Calibri" w:hAnsi="Calibri" w:cs="Calibri"/>
+              </w:rPr>
+              <w:t>source_bias_on vs capsules_off</w:t>
+            </w:r>
+          </w:p>
+        </w:tc>
+        <w:tc>
+          <w:tcPr>
+            <w:tcW w:type="dxa" w:w="5046"/>
+            <w:shd w:fill="F7F7F7" w:val="clear"/>
+            <w:tcBorders>
+              <w:top w:val="single" w:sz="4" w:color="4A4A4A"/>
+              <w:left w:val="single" w:sz="4" w:color="4A4A4A"/>
+              <w:bottom w:val="single" w:sz="4" w:color="4A4A4A"/>
+              <w:right w:val="single" w:sz="4" w:color="4A4A4A"/>
+            </w:tcBorders>
+            <w:vAlign w:val="center"/>
+          </w:tcPr>
+          <w:p>
+            <w:pPr>
+              <w:jc w:val="center"/>
+              <w:bidi w:val="0"/>
+            </w:pPr>
+            <w:r>
+              <w:rPr>
+                <w:sz w:val="16"/>
+                <w:szCs w:val="16"/>
+                <w:rFonts w:ascii="Calibri" w:hAnsi="Calibri" w:cs="Calibri"/>
+              </w:rPr>
+              <w:t>30.67; BCa [26.03, 35.32]</w:t>
+            </w:r>
+          </w:p>
+        </w:tc>
+      </w:tr>
+      <w:tr>
+        <w:trPr>
+          <w:cantSplit/>
+        </w:trPr>
+        <w:tc>
+          <w:tcPr>
+            <w:tcW w:type="dxa" w:w="5046"/>
+            <w:shd w:fill="F7F7F7" w:val="clear"/>
+            <w:tcBorders>
+              <w:top w:val="single" w:sz="4" w:color="4A4A4A"/>
+              <w:left w:val="single" w:sz="4" w:color="4A4A4A"/>
+              <w:bottom w:val="single" w:sz="4" w:color="4A4A4A"/>
+              <w:right w:val="single" w:sz="4" w:color="4A4A4A"/>
+            </w:tcBorders>
+            <w:vAlign w:val="center"/>
+          </w:tcPr>
+          <w:p>
+            <w:pPr>
+              <w:jc w:val="center"/>
+              <w:bidi w:val="1"/>
+            </w:pPr>
+            <w:r/>
+            <w:r>
+              <w:rPr>
+                <w:rFonts w:ascii="Times New Roman" w:hAnsi="Times New Roman" w:cs="B Nazanin" w:eastAsia="B Nazanin"/>
+                <w:b w:val="0"/>
+                <w:sz w:val="16"/>
+                <w:rtl w:val="1"/>
+                <w:lang w:val="en-US" w:bidi="fa-IR" w:eastAsia="fa-IR"/>
+              </w:rPr>
+              <w:t>p جایگشت علامت (خام / Holm)</w:t>
+            </w:r>
+          </w:p>
+        </w:tc>
+        <w:tc>
+          <w:tcPr>
+            <w:tcW w:type="dxa" w:w="5046"/>
+            <w:shd w:fill="F7F7F7" w:val="clear"/>
+            <w:tcBorders>
+              <w:top w:val="single" w:sz="4" w:color="4A4A4A"/>
+              <w:left w:val="single" w:sz="4" w:color="4A4A4A"/>
+              <w:bottom w:val="single" w:sz="4" w:color="4A4A4A"/>
+              <w:right w:val="single" w:sz="4" w:color="4A4A4A"/>
+            </w:tcBorders>
+            <w:vAlign w:val="center"/>
+          </w:tcPr>
+          <w:p>
+            <w:pPr>
+              <w:jc w:val="center"/>
+              <w:bidi w:val="0"/>
+            </w:pPr>
+            <w:r>
+              <w:rPr>
+                <w:sz w:val="16"/>
+                <w:szCs w:val="16"/>
+                <w:rFonts w:ascii="Calibri" w:hAnsi="Calibri" w:cs="Calibri"/>
+              </w:rPr>
+              <w:t>4.99975e-5 / 1.50e-4</w:t>
+            </w:r>
+            <w:r>
+              <w:rPr>
+                <w:rFonts w:ascii="Times New Roman" w:hAnsi="Times New Roman" w:cs="B Nazanin" w:eastAsia="B Nazanin"/>
+                <w:b w:val="0"/>
+                <w:sz w:val="16"/>
+                <w:rtl w:val="1"/>
+                <w:lang w:val="en-US" w:bidi="fa-IR" w:eastAsia="fa-IR"/>
+              </w:rPr>
+            </w:r>
+          </w:p>
+        </w:tc>
+      </w:tr>
+      <w:tr>
+        <w:trPr>
+          <w:cantSplit/>
+        </w:trPr>
+        <w:tc>
+          <w:tcPr>
+            <w:tcW w:type="dxa" w:w="5046"/>
+            <w:shd w:fill="F7F7F7" w:val="clear"/>
+            <w:tcBorders>
+              <w:top w:val="single" w:sz="4" w:color="4A4A4A"/>
+              <w:left w:val="single" w:sz="4" w:color="4A4A4A"/>
+              <w:bottom w:val="single" w:sz="4" w:color="4A4A4A"/>
+              <w:right w:val="single" w:sz="4" w:color="4A4A4A"/>
+            </w:tcBorders>
+            <w:vAlign w:val="center"/>
+          </w:tcPr>
+          <w:p>
+            <w:pPr>
+              <w:jc w:val="center"/>
+              <w:bidi w:val="1"/>
+            </w:pPr>
+            <w:r/>
+            <w:r>
+              <w:rPr>
+                <w:rFonts w:ascii="Times New Roman" w:hAnsi="Times New Roman" w:cs="B Nazanin" w:eastAsia="B Nazanin"/>
+                <w:b w:val="0"/>
+                <w:sz w:val="16"/>
+                <w:rtl w:val="1"/>
+                <w:lang w:val="en-US" w:bidi="fa-IR" w:eastAsia="fa-IR"/>
+              </w:rPr>
+              <w:t>درجهٔ حسابرس</w:t>
+            </w:r>
+          </w:p>
+        </w:tc>
+        <w:tc>
+          <w:tcPr>
+            <w:tcW w:type="dxa" w:w="5046"/>
+            <w:shd w:fill="F7F7F7" w:val="clear"/>
+            <w:tcBorders>
+              <w:top w:val="single" w:sz="4" w:color="4A4A4A"/>
+              <w:left w:val="single" w:sz="4" w:color="4A4A4A"/>
+              <w:bottom w:val="single" w:sz="4" w:color="4A4A4A"/>
+              <w:right w:val="single" w:sz="4" w:color="4A4A4A"/>
+            </w:tcBorders>
+            <w:vAlign w:val="center"/>
+          </w:tcPr>
+          <w:p>
+            <w:pPr>
+              <w:jc w:val="center"/>
+              <w:bidi w:val="0"/>
+            </w:pPr>
+            <w:r>
+              <w:rPr>
+                <w:sz w:val="16"/>
+                <w:szCs w:val="16"/>
+                <w:rFonts w:ascii="Calibri" w:hAnsi="Calibri" w:cs="Calibri"/>
+              </w:rPr>
+              <w:t>4</w:t>
+            </w:r>
+            <w:r>
+              <w:rPr>
+                <w:rFonts w:ascii="Times New Roman" w:hAnsi="Times New Roman" w:cs="B Nazanin" w:eastAsia="B Nazanin"/>
+                <w:b w:val="0"/>
+                <w:sz w:val="16"/>
+                <w:rtl w:val="1"/>
+                <w:lang w:val="en-US" w:bidi="fa-IR" w:eastAsia="fa-IR"/>
+              </w:rPr>
+            </w:r>
+          </w:p>
+        </w:tc>
+      </w:tr>
+      <w:tr>
+        <w:trPr>
+          <w:cantSplit/>
+        </w:trPr>
+        <w:tc>
+          <w:tcPr>
+            <w:tcW w:type="dxa" w:w="5046"/>
+            <w:shd w:fill="F7F7F7" w:val="clear"/>
+            <w:tcBorders>
+              <w:top w:val="single" w:sz="4" w:color="4A4A4A"/>
+              <w:left w:val="single" w:sz="4" w:color="4A4A4A"/>
+              <w:bottom w:val="single" w:sz="4" w:color="4A4A4A"/>
+              <w:right w:val="single" w:sz="4" w:color="4A4A4A"/>
+            </w:tcBorders>
+            <w:vAlign w:val="center"/>
+          </w:tcPr>
+          <w:p>
+            <w:pPr>
+              <w:jc w:val="center"/>
+              <w:bidi w:val="1"/>
+            </w:pPr>
+            <w:r/>
+            <w:r>
+              <w:rPr>
+                <w:rFonts w:ascii="Times New Roman" w:hAnsi="Times New Roman" w:cs="B Nazanin" w:eastAsia="B Nazanin"/>
+                <w:b w:val="0"/>
+                <w:sz w:val="16"/>
+                <w:rtl w:val="1"/>
+                <w:lang w:val="en-US" w:bidi="fa-IR" w:eastAsia="fa-IR"/>
+              </w:rPr>
+              <w:t>بازپخش</w:t>
+            </w:r>
+          </w:p>
+        </w:tc>
+        <w:tc>
+          <w:tcPr>
+            <w:tcW w:type="dxa" w:w="5046"/>
+            <w:shd w:fill="F7F7F7" w:val="clear"/>
+            <w:tcBorders>
+              <w:top w:val="single" w:sz="4" w:color="4A4A4A"/>
+              <w:left w:val="single" w:sz="4" w:color="4A4A4A"/>
+              <w:bottom w:val="single" w:sz="4" w:color="4A4A4A"/>
+              <w:right w:val="single" w:sz="4" w:color="4A4A4A"/>
+            </w:tcBorders>
+            <w:vAlign w:val="center"/>
+          </w:tcPr>
+          <w:p>
+            <w:pPr>
+              <w:jc w:val="center"/>
+              <w:bidi w:val="1"/>
+            </w:pPr>
+            <w:r/>
+            <w:r>
+              <w:rPr>
+                <w:rFonts w:ascii="Times New Roman" w:hAnsi="Times New Roman" w:cs="B Nazanin" w:eastAsia="B Nazanin"/>
+                <w:b w:val="0"/>
+                <w:sz w:val="16"/>
+                <w:rtl w:val="1"/>
+                <w:lang w:val="en-US" w:bidi="fa-IR" w:eastAsia="fa-IR"/>
+              </w:rPr>
+              <w:t>در بستهٔ شواهد ثبت می‌شود</w:t>
+            </w:r>
+          </w:p>
+        </w:tc>
+      </w:tr>
+    </w:tbl>
+    <w:p>
+      <w:pPr>
         <w:pStyle w:val="Heading2"/>
         <w:jc w:val="right"/>
         <w:bidi w:val="1"/>
@@ -2335,7 +3805,39 @@
           <w:rtl w:val="1"/>
           <w:lang w:val="en-US" w:bidi="fa-IR" w:eastAsia="fa-IR"/>
         </w:rPr>
-        <w:t>ASME V&amp;V 40 اعتبار مدل در یک زمینهٔ مشخص است. اینجا پرسش، زمینه، تأثیر و پیامد ثبت می‌شود و ادعای بسته درجه می‌گیرد. آزمون نیمکت بیرون از نرم‌افزار می‌ماند. کودون‌تریس جای آن آزمون را نمی‌گیرد. نسخه از پیکربندی پروژه خوانده می‌شود.</w:t>
+        <w:t>ASME V&amp;V 40 روش اعتبار یک مدل در زمینهٔ کاربرد مشخص است. در این بستر، پرسش، زمینه، تأثیر و پیامد ثبت می‌شود و سپس ادعای همراه بسته درجه می‌گیرد. اگر آزمون نیمکت یا in vivo در دست باشد، بیرون از نرم‌افزار جمع می‌شود و فقط به شکل دستهٔ راهنمای FDA ۲۰۲۳ اعلام می‌گردد. کودون‌تریس جای آن آزمون‌ها را نمی‌گیرد و حساب ادعا را نگه می‌دارد. نسخه از پیکربندی پروژه خوانده می‌شود و اعداد کمپین در این متن دوباره تولید نشده‌اند.</w:t>
+      </w:r>
+    </w:p>
+    <w:p>
+      <w:pPr>
+        <w:pStyle w:val="Heading1"/>
+        <w:jc w:val="right"/>
+        <w:bidi w:val="1"/>
+      </w:pPr>
+      <w:r>
+        <w:rPr>
+          <w:rFonts w:ascii="Times New Roman" w:hAnsi="Times New Roman" w:cs="B Nazanin" w:eastAsia="B Nazanin"/>
+          <w:b/>
+          <w:sz w:val="22"/>
+          <w:rtl w:val="1"/>
+          <w:lang w:val="en-US" w:bidi="fa-IR" w:eastAsia="fa-IR"/>
+        </w:rPr>
+        <w:t xml:space="preserve">محدودیت‌ها</w:t>
+      </w:r>
+    </w:p>
+    <w:p>
+      <w:pPr>
+        <w:jc w:val="both"/>
+        <w:bidi w:val="1"/>
+      </w:pPr>
+      <w:r>
+        <w:rPr>
+          <w:rFonts w:ascii="Times New Roman" w:hAnsi="Times New Roman" w:cs="B Nazanin" w:eastAsia="B Nazanin"/>
+          <w:sz w:val="20"/>
+          <w:rtl w:val="1"/>
+          <w:lang w:val="en-US" w:bidi="fa-IR" w:eastAsia="fa-IR"/>
+        </w:rPr>
+        <w:t>راهنمای FDA سال ۲۰۲۳ مدل یادگیری ماشین مستقل را در بر نمی‌گیرد. در HE01 مقایسه با کنترل محتوایی، مداخله‌ای مرکب است. گام بعدی، ارزیابی همین حسابرس روی پروفایل سخت‌افزار و نشاندن یک مدل فیزیک‌محور با مانیفست روی همین پورت است.</w:t>
       </w:r>
     </w:p>
     <w:p>
@@ -6343,7 +7845,7 @@
       <w:numPr>
         <w:numId w:val="14"/>
       </w:numPr>
-      <w:spacing w:before="120" w:after="20"/>
+      <w:spacing w:before="140" w:after="60"/>
       <w:ind w:left="357" w:hanging="357"/>
       <w:jc w:val="left"/>
       <w:outlineLvl w:val="0"/>
@@ -6370,7 +7872,7 @@
       <w:numPr>
         <w:ilvl w:val="1"/>
       </w:numPr>
-      <w:spacing w:before="120" w:after="20"/>
+      <w:spacing w:before="140" w:after="60"/>
       <w:jc w:val="left"/>
       <w:outlineLvl w:val="1"/>
     </w:pPr>
@@ -6631,7 +8133,7 @@
     <w:qFormat/>
     <w:rsid w:val="00D57EF7"/>
     <w:pPr>
-      <w:spacing w:before="80" w:after="80"/>
+      <w:spacing w:before="760" w:after="200"/>
       <w:jc w:val="center"/>
     </w:pPr>
     <w:rPr>
@@ -6794,7 +8296,7 @@
       <w:autoSpaceDE/>
       <w:autoSpaceDN/>
       <w:adjustRightInd/>
-      <w:spacing w:after="40"/>
+      <w:spacing w:after="90"/>
       <w:jc w:val="left"/>
       <w:textAlignment w:val="auto"/>
     </w:pPr>
@@ -7041,7 +8543,7 @@
     <w:rsid w:val="008730CE"/>
     <w:pPr>
       <w:bidi/>
-      <w:spacing w:after="40"/>
+      <w:spacing w:after="240"/>
       <w:jc w:val="center"/>
     </w:pPr>
     <w:rPr>

</xml_diff>

<commit_message>
docs(baic): attribute the HE01 contrast to both knobs
The primary 16.49 contrast changes min_source_fitness and the
adoption policy together. Related work now separates this ladder
from MIRROR and NovaFabric, which record evidence without grading it.
</commit_message>
<xml_diff>
--- a/paper/baic/BAIC2026_Jamei.docx
+++ b/paper/baic/BAIC2026_Jamei.docx
@@ -153,7 +153,7 @@
           <w:rtl w:val="1"/>
           <w:lang w:val="en-US" w:bidi="fa-IR" w:eastAsia="fa-IR"/>
         </w:rPr>
-        <w:t>کلید واژه- اعتبارسنجی in silico، حسابرسی شواهد، مدل‌سازی محاسباتی، نردبان اعتبار</w:t>
+        <w:t>کلیدواژه: اعتبارسنجی in silico، حسابرسی شواهد، مدل‌سازی محاسباتی، نردبان اعتبار</w:t>
       </w:r>
     </w:p>
     <w:p>
@@ -262,7 +262,7 @@
           <w:rtl w:val="1"/>
           <w:lang w:val="en-US" w:bidi="fa-IR" w:eastAsia="fa-IR"/>
         </w:rPr>
-        <w:t>آویدا بستر شناخته‌شده‌ای برای برنامه‌های خودتکثیرشونده است [11] و پروندهٔ .dat آن از همین در خوانده می‌شود. در ادبیات quality-diversity، پایداری عملکرد در محیط نامطمئن [12] با بازپخش بیت‌به‌بیت یک اجرای نرم‌افزار یکی نیست. توصیف مدل بر اساس پروتکل ODD نوشته شده است [13]. رشتهٔ asme_vv40_passed در پیکربندی پذیرفته نمی‌شود.</w:t>
+        <w:t>آویدا بستر شناخته‌شده‌ای برای برنامه‌های خودتکثیرشونده است [11] و پروندهٔ .dat آن از همین در خوانده می‌شود. در ادبیات quality-diversity، پایداری عملکرد در محیط نامطمئن [12] با بازپخش بیت‌به‌بیت یک اجرای نرم‌افزار یکی نیست. توصیف مدل بر اساس پروتکل ODD نوشته شده است [13]. رشتهٔ asme_vv40_passed در پیکربندی پذیرفته نمی‌شود. MIRROR بستهٔ شواهد محلی و نتیجهٔ بازپخش را پیش از انتشار قابل‌بازبینی می‌کند و حقیقت یا تضمین تنظیم‌گری نمی‌دهد [19]. NovaFabric اجرای عامل را در کپسول امضاشده ثبت می‌کند و سقف ادعا نمی‌گذارد [20]. تفاوت این کار درجه است: حسابرس بالاترین سطحی را برمی‌گرداند که شرط‌های همان بسته برقرار باشد.</w:t>
       </w:r>
     </w:p>
     <w:p>
@@ -3120,7 +3120,7 @@
           <w:rtl w:val="1"/>
           <w:lang w:val="en-US" w:bidi="fa-IR" w:eastAsia="fa-IR"/>
         </w:rPr>
-        <w:t>فایل results_v7.json با پیشوند اثرانگشت 28f812c5 سه مقایسهٔ جفتی دارد [16]. نسبت به کانال روشن و بدون سوگیری منشأ، اختلاف ۱۶٫۴۹ واحد است. کران پایین بازه ۱۴٫۲۵ و کران بالا ۱۹٫۱۴ است. p خام 4.99975e-5 و p پس از Holm برابر 1.50e-4 است. نسبت به کانال بسته و محتوای تهی، اختلاف ۳۰٫۶۷ واحد است، با کران پایین ۲۶٫۰۳ و کران بالا ۳۵٫۳۲. در مقایسهٔ اول فقط سوگیری برداشته می‌شود. در مقایسهٔ دوم هم محتوا عوض می‌شود و هم سوگیری. بازهٔ اختیاری studentized حدود ۱۴٫۰۵ تا ۱۹٫۳۰ است و فایل v7 دست نمی‌خورد.</w:t>
+        <w:t>فایل results_v7.json با پیشوند اثرانگشت 28f812c5 سه مقایسهٔ جفتی دارد [16]. نسبت به کانال روشن و بدون سوگیری منشأ، اختلاف ۱۶٫۴۹ واحد است. کران پایین بازه ۱۴٫۲۵ و کران بالا ۱۹٫۱۴ است. p خام 4.99975e-5 کف آزمون مونتکارلو با ۲۰۰۰۰ نمونه‌گیری است و p پس از Holm برابر 1.50e-4 است. نسبت به کانال بسته و محتوای تهی، اختلاف ۳۰٫۶۷ واحد است، با کران پایین ۲۶٫۰۳ و کران بالا ۳۵٫۳۲. مقایسهٔ اول دو تنظیم را با هم عوض می‌کند: آستانهٔ تناسب منبع از ۱٫۵ به صفر و سیاست پذیرش از FITNESS_WEIGHTED به THRESHOLD. تفاضل ۱۶٫۴۹ به همین بسته نسبت داده می‌شود، نه به یک پیچ تنها. مقایسهٔ دوم هم محتوا را عوض می‌کند و هم سوگیری را. بازهٔ اختیاری studentized حدود ۱۴٫۰۵ تا ۱۹٫۳۰ است و فایل v7 دست نمی‌خورد.</w:t>
       </w:r>
     </w:p>
     <w:p>
@@ -3837,7 +3837,7 @@
           <w:rtl w:val="1"/>
           <w:lang w:val="en-US" w:bidi="fa-IR" w:eastAsia="fa-IR"/>
         </w:rPr>
-        <w:t>راهنمای FDA سال ۲۰۲۳ مدل یادگیری ماشین مستقل را در بر نمی‌گیرد. در HE01 مقایسه با کنترل محتوایی، مداخله‌ای مرکب است. گام بعدی، ارزیابی همین حسابرس روی پروفایل سخت‌افزار و نشاندن یک مدل فیزیک‌محور با مانیفست روی همین پورت است.</w:t>
+        <w:t>راهنمای FDA سال ۲۰۲۳ مدل یادگیری ماشین مستقل را در بر نمی‌گیرد. تفاضل ۱۶٫۴۹ به بستهٔ دو تنظیم نسبت داده می‌شود، نه به سوگیری تنها. گام بعدی، ارزیابی همین حسابرس روی پروفایل سخت‌افزار و نشاندن یک مدل فیزیک‌محور با مانیفست روی همین پورت است.</w:t>
       </w:r>
     </w:p>
     <w:p>
@@ -4190,6 +4190,22 @@
           <w:lang w:val="en-US" w:bidi="fa-IR" w:eastAsia="fa-IR"/>
         </w:rPr>
         <w:t xml:space="preserve">[18] B. A. Craven, C. A. Basciano, P. Afshari, et al., “Computational modeling and simulation for medical devices: a summary of the 2024 FDA/MDIC Symposium,” Prog. Biomed. Eng., vol. 8, no. 1, 013001, 2026, doi: 10.1088/2516-1091/ae1c05.</w:t>
+      </w:r>
+    </w:p>
+    <w:p>
+      <w:pPr>
+        <w:pStyle w:val="References"/>
+      </w:pPr>
+      <w:r>
+        <w:t>[19] A. Sokolov, “MIRROR: Local Evidence Bundles for Reproducible Research Software Review,” Zenodo, May 2026, doi: 10.5281/zenodo.20463358.</w:t>
+      </w:r>
+    </w:p>
+    <w:p>
+      <w:pPr>
+        <w:pStyle w:val="References"/>
+      </w:pPr>
+      <w:r>
+        <w:t>[20] M. Seyedkazemi Ardebili, “NovaFabric: Tamper-Evident, Replayable Evidence for Autonomous AI Agent Runs,” arXiv:2609.12582, 2026.</w:t>
       </w:r>
     </w:p>
     <w:sectPr>

</xml_diff>

<commit_message>
feat(baic): score declared risk, and add the English manuscript
A declared model risk now has its own bar and does not move the claim
level. HE01 stays at grade 4: the bar is met when only the executed
phenomenon is listed, and it is not met when contact stress has no arm.
The device table stays at 0. The English IEEE manuscript reports the
same measurements. No clinical coauthor is added.
</commit_message>
<xml_diff>
--- a/paper/baic/BAIC2026_Jamei.docx
+++ b/paper/baic/BAIC2026_Jamei.docx
@@ -262,7 +262,7 @@
           <w:sz w:val="22"/>
           <w:szCs w:val="22"/>
         </w:rPr>
-        <w:t>سه نتیجه گزارش می‌شود. اول، برچسب فایل سطح حسابرسی نیست. دوم، یک پدیده فقط با بازوی درمانِ اجراشده بسته می‌شود. سوم، شش حذف شرط از مرجع سطح ۴ پایین می‌افتند. این سومین نتیجه درصد ادعاهای یک حوزه نیست: استخراج دوگانهٔ مقالات انجام نشده است و عددِ ادبیات ساخته نمی‌شود. حسابرس ارزیاب بیرونی هم نیست.</w:t>
+        <w:t>سه نتیجه گزارش می‌شود. اول، برچسب فایل سطح حسابرسی نیست و آستانهٔ ریسک اعلامی هم آن سطح را جابه‌جا نمی‌کند. دوم، یک پدیده فقط با بازوی درمانِ اجراشده بسته می‌شود. سوم، شش حذف شرط از مرجع سطح ۴ پایین می‌افتند. این سومین نتیجه درصد ادعاهای یک حوزه نیست: استخراج دوگانهٔ مقالات انجام نشده است و عددِ ادبیات ساخته نمی‌شود. حسابرس ارزیاب بیرونی هم نیست.</w:t>
       </w:r>
     </w:p>
     <w:p>
@@ -1118,6 +1118,97 @@
           <w:sz w:val="24"/>
           <w:szCs w:val="24"/>
         </w:rPr>
+        <w:t>آستانهٔ ریسک سطح را جابه‌جا نمی‌کند</w:t>
+      </w:r>
+    </w:p>
+    <w:p>
+      <w:pPr>
+        <w:bidi/>
+        <w:spacing w:line="259" w:lineRule="auto" w:before="0" w:after="80"/>
+        <w:jc w:val="both"/>
+      </w:pPr>
+      <w:r>
+        <w:rPr>
+          <w:rFonts w:ascii="Times New Roman" w:hAnsi="Times New Roman" w:cs="B Nazanin" w:eastAsia="B Nazanin"/>
+          <w:b w:val="0"/>
+          <w:i w:val="0"/>
+          <w:sz w:val="22"/>
+          <w:szCs w:val="22"/>
+        </w:rPr>
+        <w:t xml:space="preserve">ریسک در این پورت بیشینهٔ تأثیر و پیامدِ اعلامی است. ایده از هم‌ترازی شاهد با ریسک در ASME V&amp;V 40 است [2]، ولی عدد آستانه جدول FDA نیست: ریسک ۱ سطح ۲، ریسک ۲ سطح ۳، و ریسک ۳ سطح ۴ می‌خواهد. از ریسک ۲ به بالا شکاف PIRT با اهمیت زیاد هم مانع است. این محاسبه حسابرس را صدا نمی‌زند. جدول ۷ و فایل </w:t>
+      </w:r>
+      <w:r>
+        <w:rPr>
+          <w:rFonts w:ascii="Times New Roman" w:hAnsi="Times New Roman" w:cs="B Nazanin" w:eastAsia="B Nazanin"/>
+          <w:b w:val="0"/>
+          <w:i/>
+          <w:sz w:val="22"/>
+          <w:szCs w:val="22"/>
+        </w:rPr>
+        <w:t>docs/​claimgate/​risk_​bar.json</w:t>
+      </w:r>
+      <w:r>
+        <w:rPr>
+          <w:rFonts w:ascii="Times New Roman" w:hAnsi="Times New Roman" w:cs="B Nazanin" w:eastAsia="B Nazanin"/>
+          <w:b w:val="0"/>
+          <w:i w:val="0"/>
+          <w:sz w:val="22"/>
+          <w:szCs w:val="22"/>
+        </w:rPr>
+        <w:t xml:space="preserve"> با پیشوند </w:t>
+      </w:r>
+      <w:r>
+        <w:rPr>
+          <w:rFonts w:ascii="Times New Roman" w:hAnsi="Times New Roman" w:cs="B Nazanin" w:eastAsia="B Nazanin"/>
+          <w:b w:val="0"/>
+          <w:i/>
+          <w:sz w:val="22"/>
+          <w:szCs w:val="22"/>
+        </w:rPr>
+        <w:t>b053e7f1</w:t>
+      </w:r>
+      <w:r>
+        <w:rPr>
+          <w:rFonts w:ascii="Times New Roman" w:hAnsi="Times New Roman" w:cs="B Nazanin" w:eastAsia="B Nazanin"/>
+          <w:b w:val="0"/>
+          <w:i w:val="0"/>
+          <w:sz w:val="22"/>
+          <w:szCs w:val="22"/>
+        </w:rPr>
+        <w:t xml:space="preserve"> سه ردیف همان اجرا هستند. سطح ردیف سوم پایین نیامده است.</w:t>
+      </w:r>
+    </w:p>
+    <w:p>
+      <w:pPr>
+        <w:bidi/>
+        <w:spacing w:line="259" w:lineRule="auto" w:before="0" w:after="60"/>
+        <w:jc w:val="both"/>
+      </w:pPr>
+      <w:r>
+        <w:rPr>
+          <w:rFonts w:ascii="Times New Roman" w:hAnsi="Times New Roman" w:cs="B Nazanin" w:eastAsia="B Nazanin"/>
+          <w:b w:val="0"/>
+          <w:i w:val="0"/>
+          <w:sz w:val="18"/>
+          <w:szCs w:val="18"/>
+        </w:rPr>
+        <w:t>بسته: جدول تجهیز، ریسک: ۳، سطح: ۰، آستانه: برقرار نشد — بسته: HE01، فقط سوگیری منشأ، ریسک: ۳، سطح: ۴، آستانه: برقرار شد — بسته: HE01، به‌اضافهٔ تنش تماسِ بدون بازو، ریسک: ۳، سطح: ۴، آستانه: برقرار نشد</w:t>
+      </w:r>
+    </w:p>
+    <w:p>
+      <w:pPr>
+        <w:bidi/>
+        <w:spacing w:line="259" w:lineRule="auto" w:before="160" w:after="40"/>
+        <w:jc w:val="right"/>
+      </w:pPr>
+      <w:r>
+        <w:rPr>
+          <w:rFonts w:ascii="Times New Roman" w:hAnsi="Times New Roman" w:cs="B Nazanin" w:eastAsia="B Nazanin"/>
+          <w:b/>
+          <w:i w:val="0"/>
+          <w:sz w:val="24"/>
+          <w:szCs w:val="24"/>
+        </w:rPr>
         <w:t>شش حذف شرط، نه نرخ ادبیات</w:t>
       </w:r>
     </w:p>
@@ -1482,7 +1573,7 @@
           <w:sz w:val="22"/>
           <w:szCs w:val="22"/>
         </w:rPr>
-        <w:t>آنچه سنجیده شد درجهٔ شواهدِ داخل بسته است: برچسب فایل سطح ۴ نمی‌دهد، پدیده بدون بازوی اجراشده بسته نمی‌شود، و حذف شرط‌های نردبان زیر ۴ می‌ماند. آنچه سنجیده نشد درصد ادعاهای ارتوپدی یا قلب است. چنین درصدی بدون پروتکل ورود، دو استخراج‌کننده و توافق بین ارزیاب ساخته نمی‌شود؛ این مقاله آن مطالعه را وانمود نمی‌کند.</w:t>
+        <w:t>آنچه سنجیده شد درجهٔ شواهدِ داخل بسته است: برچسب فایل سطح ۴ نمی‌دهد، پدیده بدون بازوی اجراشده بسته نمی‌شود، حذف شرط‌های نردبان زیر ۴ می‌ماند، و آستانهٔ ریسک سطح را عوض نمی‌کند. آنچه سنجیده نشد درصد ادعاهای ارتوپدی یا قلب است. چنین درصدی بدون پروتکل ورود، دو استخراج‌کننده و توافق بین ارزیاب ساخته نمی‌شود؛ این مقاله آن مطالعه را وانمود نمی‌کند.</w:t>
       </w:r>
     </w:p>
     <w:p>
@@ -1633,7 +1724,7 @@
           <w:sz w:val="22"/>
           <w:szCs w:val="22"/>
         </w:rPr>
-        <w:t xml:space="preserve"> رد می‌شوند. رد شدنِ آن‌ها یک درجهٔ حسابرسی نیست؛ یعنی ابزار اصلاً آن ادعا را به‌عنوان پیکربندی نمی‌پذیرد. تکرار کار این مقاله سه مشاهده است، نه یک درصد. اول، حسابرسی </w:t>
+        <w:t xml:space="preserve"> رد می‌شوند. رد شدنِ آن‌ها یک درجهٔ حسابرسی نیست؛ یعنی ابزار اصلاً آن ادعا را به‌عنوان پیکربندی نمی‌پذیرد. تکرار کار این مقاله چهار مشاهده است، نه یک درصد. اول، حسابرسی </w:t>
       </w:r>
       <w:r>
         <w:rPr>
@@ -1653,7 +1744,7 @@
           <w:sz w:val="22"/>
           <w:szCs w:val="22"/>
         </w:rPr>
-        <w:t xml:space="preserve"> سطح ۴ می‌دهد و برای پلهٔ بعد فقط شناسهٔ بایگانی جدا کم دارد. دوم، جدول امتیاز تجهیز سطح صفر می‌دهد و مانیفست مصنوع را کم دارد. سوم، دو فایل متعهدِ مطالعه و حذف شرط با حسابرس زنده یکی‌اند؛ اگر کسی بسته را عوض کند و اثرانگشت را به‌روز نکند، مقایسهٔ همان فایل‌ها این را نشان می‌دهد. هیچ‌کدام از این سه، نمونهٔ مقالات منتشرشده نیست.</w:t>
+        <w:t xml:space="preserve"> سطح ۴ می‌دهد و برای پلهٔ بعد فقط شناسهٔ بایگانی جدا کم دارد. دوم، جدول امتیاز تجهیز سطح صفر می‌دهد و مانیفست مصنوع را کم دارد. سوم، دو فایل متعهدِ مطالعه و حذف شرط با حسابرس زنده یکی‌اند؛ اگر کسی بسته را عوض کند و اثرانگشت را به‌روز نکند، مقایسهٔ همان فایل‌ها این را نشان می‌دهد. چهارم، آستانهٔ ریسک روی HE01 سطح را از ۴ تکان نمی‌دهد: با پدیدهٔ بسته‌شده برقرار است و با پدیدهٔ بدون بازو برقرار نیست. هیچ‌کدام از این چهار، نمونهٔ مقالات منتشرشده نیست.</w:t>
       </w:r>
     </w:p>
     <w:p>
@@ -1687,7 +1778,7 @@
           <w:sz w:val="22"/>
           <w:szCs w:val="22"/>
         </w:rPr>
-        <w:t xml:space="preserve">برچسب فایل، ردهٔ IEC 62304، عبارت IMDRF و دانشِ تایپ‌شده سطح حسابرسی را بالا نمی‌برند. </w:t>
+        <w:t xml:space="preserve">برچسب فایل، ردهٔ IEC 62304، عبارت IMDRF، دانشِ تایپ‌شده و ریسک اعلامی سطح حسابرسی را بالا نمی‌برند. </w:t>
       </w:r>
       <w:r>
         <w:rPr>
@@ -1707,7 +1798,7 @@
           <w:sz w:val="22"/>
           <w:szCs w:val="22"/>
         </w:rPr>
-        <w:t xml:space="preserve"> به سطح ۴ می‌رسد چون بازپخش و بازهٔ سی بذر برقرار است، و جدول بدون اجرا در صفر می‌ماند. شش حذف شرط زیر ۴ می‌مانند، بی‌آنکه این شمار نرخ ادبیات باشد. گام بعدی، اگر برداشته شود، استخراج ازپیش‌ثبت‌شدهٔ مقالات با دو نفر است؛ تا آن روز عدد حوزه منتشر نمی‌شود.</w:t>
+        <w:t xml:space="preserve"> به سطح ۴ می‌رسد چون بازپخش و بازهٔ سی بذر برقرار است، و جدول بدون اجرا در صفر می‌ماند. همان سطح ۴ به آستانهٔ ریسک ۳ می‌رسد وقتی پدیدهٔ فهرست‌شده اجرا شده باشد، و نمی‌رسد وقتی پدیدهٔ بااهمیت فقط اعلام شده باشد. شش حذف شرط زیر ۴ می‌مانند، بی‌آنکه این شمار نرخ ادبیات باشد. گام بعدی، اگر برداشته شود، استخراج ازپیش‌ثبت‌شدهٔ مقالات با دو نفر است؛ تا آن روز عدد حوزه منتشر نمی‌شود.</w:t>
       </w:r>
     </w:p>
     <w:p>
@@ -1755,6 +1846,26 @@
           <w:szCs w:val="22"/>
         </w:rPr>
         <w:t>docs/​claimgate/​defect_​grid.json</w:t>
+      </w:r>
+      <w:r>
+        <w:rPr>
+          <w:rFonts w:ascii="Times New Roman" w:hAnsi="Times New Roman" w:cs="B Nazanin" w:eastAsia="B Nazanin"/>
+          <w:b w:val="0"/>
+          <w:i w:val="0"/>
+          <w:sz w:val="22"/>
+          <w:szCs w:val="22"/>
+        </w:rPr>
+        <w:t xml:space="preserve"> — آستانهٔ ریسک: </w:t>
+      </w:r>
+      <w:r>
+        <w:rPr>
+          <w:rFonts w:ascii="Times New Roman" w:hAnsi="Times New Roman" w:cs="B Nazanin" w:eastAsia="B Nazanin"/>
+          <w:b w:val="0"/>
+          <w:i/>
+          <w:sz w:val="22"/>
+          <w:szCs w:val="22"/>
+        </w:rPr>
+        <w:t>docs/​claimgate/​risk_​bar.json</w:t>
       </w:r>
     </w:p>
     <w:p>

</xml_diff>